<commit_message>
Added landing page, fixed position header and soon to add balance
</commit_message>
<xml_diff>
--- a/Slides/Proposal Documentation.docx
+++ b/Slides/Proposal Documentation.docx
@@ -525,13 +525,8 @@
           <w:color w:val="000000"/>
         </w:rPr>
       </w:pPr>
-      <w:proofErr w:type="spellStart"/>
-      <w:r>
-        <w:t>Aaishwarya</w:t>
-      </w:r>
-      <w:proofErr w:type="spellEnd"/>
-      <w:r>
-        <w:t xml:space="preserve"> Prashant</w:t>
+      <w:r>
+        <w:t>Aishwarya Prashant</w:t>
       </w:r>
     </w:p>
     <w:p>
@@ -1043,21 +1038,12 @@
           <w:szCs w:val="28"/>
         </w:rPr>
       </w:pPr>
-      <w:proofErr w:type="spellStart"/>
       <w:r>
         <w:rPr>
           <w:sz w:val="28"/>
           <w:szCs w:val="28"/>
         </w:rPr>
-        <w:t>Aaishwarya</w:t>
-      </w:r>
-      <w:proofErr w:type="spellEnd"/>
-      <w:r>
-        <w:rPr>
-          <w:sz w:val="28"/>
-          <w:szCs w:val="28"/>
-        </w:rPr>
-        <w:t xml:space="preserve"> Prashant</w:t>
+        <w:t>Aishwarya Prashant</w:t>
       </w:r>
     </w:p>
     <w:p>
@@ -5689,15 +5675,7 @@
     </w:p>
     <w:p>
       <w:r>
-        <w:t xml:space="preserve">This section States the responsibilities of each </w:t>
-      </w:r>
-      <w:proofErr w:type="gramStart"/>
-      <w:r>
-        <w:t>members</w:t>
-      </w:r>
-      <w:proofErr w:type="gramEnd"/>
-      <w:r>
-        <w:t xml:space="preserve"> of the project</w:t>
+        <w:t>This section States the responsibilities of each members of the project</w:t>
       </w:r>
     </w:p>
     <w:p>
@@ -5865,34 +5843,10 @@
     </w:p>
     <w:p>
       <w:r>
-        <w:t xml:space="preserve">PHP is used for backend language as it is one of the most widely used </w:t>
-      </w:r>
-      <w:proofErr w:type="gramStart"/>
-      <w:r>
-        <w:t>language</w:t>
-      </w:r>
-      <w:proofErr w:type="gramEnd"/>
-      <w:r>
-        <w:t xml:space="preserve"> for </w:t>
-      </w:r>
-      <w:proofErr w:type="gramStart"/>
-      <w:r>
-        <w:t>server side</w:t>
-      </w:r>
-      <w:proofErr w:type="gramEnd"/>
-      <w:r>
-        <w:t xml:space="preserve"> development and it integrates</w:t>
-      </w:r>
-      <w:r>
-        <w:t xml:space="preserve"> seamlessly with MySQL making data handling </w:t>
-      </w:r>
-      <w:proofErr w:type="gramStart"/>
-      <w:r>
-        <w:t>efficient</w:t>
-      </w:r>
-      <w:proofErr w:type="gramEnd"/>
-      <w:r>
-        <w:t xml:space="preserve">. PHP runs smoothly on </w:t>
+        <w:t>PHP is used for backend language as it is one of the most widely used language for server side development and it integrates</w:t>
+      </w:r>
+      <w:r>
+        <w:t xml:space="preserve"> seamlessly with MySQL making data handling efficient. PHP runs smoothly on </w:t>
       </w:r>
       <w:proofErr w:type="spellStart"/>
       <w:r>
@@ -6186,35 +6140,7 @@
         <w:rPr>
           <w:rFonts w:hint="eastAsia"/>
         </w:rPr>
-        <w:t xml:space="preserve">Manual testing is chosen because the project is medium scale, making manual checks practical and efficient. Allows the developer to interact directly with </w:t>
-      </w:r>
-      <w:proofErr w:type="gramStart"/>
-      <w:r>
-        <w:rPr>
-          <w:rFonts w:hint="eastAsia"/>
-        </w:rPr>
-        <w:t>the  system</w:t>
-      </w:r>
-      <w:proofErr w:type="gramEnd"/>
-      <w:r>
-        <w:rPr>
-          <w:rFonts w:hint="eastAsia"/>
-        </w:rPr>
-        <w:t xml:space="preserve"> </w:t>
-      </w:r>
-      <w:proofErr w:type="gramStart"/>
-      <w:r>
-        <w:rPr>
-          <w:rFonts w:hint="eastAsia"/>
-        </w:rPr>
-        <w:t>identify</w:t>
-      </w:r>
-      <w:proofErr w:type="gramEnd"/>
-      <w:r>
-        <w:rPr>
-          <w:rFonts w:hint="eastAsia"/>
-        </w:rPr>
-        <w:t xml:space="preserve"> UI/UX.</w:t>
+        <w:t>Manual testing is chosen because the project is medium scale, making manual checks practical and efficient. Allows the developer to interact directly with the  system identify UI/UX.</w:t>
       </w:r>
     </w:p>
     <w:p>
@@ -6290,21 +6216,7 @@
         <w:rPr>
           <w:rFonts w:hint="eastAsia"/>
         </w:rPr>
-        <w:t xml:space="preserve">Functional </w:t>
-      </w:r>
-      <w:proofErr w:type="gramStart"/>
-      <w:r>
-        <w:rPr>
-          <w:rFonts w:hint="eastAsia"/>
-        </w:rPr>
-        <w:t>Requirements(</w:t>
-      </w:r>
-      <w:proofErr w:type="gramEnd"/>
-      <w:r>
-        <w:rPr>
-          <w:rFonts w:hint="eastAsia"/>
-        </w:rPr>
-        <w:t>FR):</w:t>
+        <w:t>Functional Requirements(FR):</w:t>
       </w:r>
     </w:p>
     <w:p>
@@ -6626,15 +6538,7 @@
         <w:t xml:space="preserve">3.2.1.2 </w:t>
       </w:r>
       <w:r>
-        <w:t xml:space="preserve">Non-Functional </w:t>
-      </w:r>
-      <w:proofErr w:type="gramStart"/>
-      <w:r>
-        <w:t>Requirements(</w:t>
-      </w:r>
-      <w:proofErr w:type="gramEnd"/>
-      <w:r>
-        <w:t>NFR):</w:t>
+        <w:t>Non-Functional Requirements(NFR):</w:t>
       </w:r>
     </w:p>
     <w:p>
@@ -6950,7 +6854,6 @@
       <w:bookmarkStart w:id="51" w:name="_Toc228950785"/>
       <w:bookmarkEnd w:id="50"/>
       <w:r>
-        <w:lastRenderedPageBreak/>
         <w:t>3.3 System Design</w:t>
       </w:r>
       <w:bookmarkEnd w:id="51"/>
@@ -6973,10 +6876,18 @@
       <w:bookmarkEnd w:id="54"/>
     </w:p>
     <w:p>
-      <w:r>
+      <w:pPr>
         <w:rPr>
           <w:noProof/>
         </w:rPr>
+      </w:pPr>
+    </w:p>
+    <w:p>
+      <w:r>
+        <w:rPr>
+          <w:noProof/>
+        </w:rPr>
+        <w:lastRenderedPageBreak/>
         <w:drawing>
           <wp:inline distT="0" distB="0" distL="0" distR="0" wp14:anchorId="322B7451" wp14:editId="0F4311B4">
             <wp:extent cx="6087980" cy="7744460"/>
@@ -7060,8 +6971,11 @@
     </w:p>
     <w:p>
       <w:r>
+        <w:t xml:space="preserve">This activity diagram illustrates a Canteen Pre-Order System where a student browses the menu, checks for availability, and places a "One-Click Order" that an admin then reviews. </w:t>
+      </w:r>
+      <w:r>
         <w:lastRenderedPageBreak/>
-        <w:t>This activity diagram illustrates a Canteen Pre-Order System where a student browses the menu, checks for availability, and places a "One-Click Order" that an admin then reviews. Once the admin confirms the item is in stock and begins preparation, the student can track the status until it is ready for collection and physical payment at the canteen. The process concludes with the admin marking the order as paid and collected, though it also accounts for edge cases like cancellations due to sold-out items or student decisions, and allows the admin to update the menu at any time.</w:t>
+        <w:t>Once the admin confirms the item is in stock and begins preparation, the student can track the status until it is ready for collection and physical payment at the canteen. The process concludes with the admin marking the order as paid and collected, though it also accounts for edge cases like cancellations due to sold-out items or student decisions, and allows the admin to update the menu at any time.</w:t>
       </w:r>
     </w:p>
     <w:p>
@@ -7176,12 +7090,21 @@
       <w:bookmarkEnd w:id="62"/>
       <w:r>
         <w:lastRenderedPageBreak/>
-        <w:t>3.3.5 Use Case Diagram</w:t>
+        <w:t>3.3.</w:t>
+      </w:r>
+      <w:r>
+        <w:t>3</w:t>
+      </w:r>
+      <w:r>
+        <w:t xml:space="preserve"> Use Case Diagram</w:t>
       </w:r>
       <w:bookmarkEnd w:id="63"/>
     </w:p>
     <w:p>
       <w:r>
+        <w:rPr>
+          <w:noProof/>
+        </w:rPr>
         <w:drawing>
           <wp:inline distT="0" distB="0" distL="0" distR="0" wp14:anchorId="6B76B6EA" wp14:editId="445420F9">
             <wp:extent cx="3304309" cy="6858000"/>
@@ -7263,13 +7186,8 @@
       <w:bookmarkEnd w:id="65"/>
     </w:p>
     <w:p>
-      <w:proofErr w:type="gramStart"/>
-      <w:r>
-        <w:t>This use</w:t>
-      </w:r>
-      <w:proofErr w:type="gramEnd"/>
-      <w:r>
-        <w:t xml:space="preserve"> case diagram illustrates how Students and Admin interact with the Canteen Pre-order System. Students can register/login, view the daily menu, check Today’s Special and sold-out items, place one-click orders, track order status, and cancel orders. Admin manages users, food items, daily menu updates, Today’s Special, sold-out status, and </w:t>
+      <w:r>
+        <w:t xml:space="preserve">This use case diagram illustrates how Students and Admin interact with the Canteen Pre-order System. Students can register/login, view the daily menu, check Today’s Special and sold-out items, place one-click orders, track order status, and cancel orders. Admin manages users, food items, daily menu updates, Today’s Special, sold-out status, and </w:t>
       </w:r>
       <w:r>
         <w:lastRenderedPageBreak/>
@@ -7285,19 +7203,14 @@
       <w:bookmarkStart w:id="68" w:name="_Toc228950789"/>
       <w:bookmarkEnd w:id="66"/>
       <w:bookmarkEnd w:id="67"/>
-      <w:proofErr w:type="gramStart"/>
       <w:r>
         <w:t>3.3.</w:t>
       </w:r>
       <w:r>
-        <w:t>6</w:t>
-      </w:r>
-      <w:r>
-        <w:t xml:space="preserve">  Sequence</w:t>
-      </w:r>
-      <w:proofErr w:type="gramEnd"/>
-      <w:r>
-        <w:t xml:space="preserve"> diagrams</w:t>
+        <w:t>4</w:t>
+      </w:r>
+      <w:r>
+        <w:t xml:space="preserve">  Sequence diagrams</w:t>
       </w:r>
       <w:bookmarkStart w:id="69" w:name="_heading=h.1cm8n45yh4wo" w:colFirst="0" w:colLast="0"/>
       <w:bookmarkStart w:id="70" w:name="_heading=h.ad4in7mq08rn" w:colFirst="0" w:colLast="0"/>
@@ -7389,23 +7302,7 @@
     <w:p>
       <w:r>
         <w:lastRenderedPageBreak/>
-        <w:t xml:space="preserve">This sequence diagram shows the step-by-step interaction between Student, Admin, Canteen System, and Database in the Digital Canteen Pre-order System. First, the student browses the menu, and the system fetches menu data from the database. The student then places a one-click order, which is stored as pending and notified to the admin. The admin processes the order by updating its status to </w:t>
-      </w:r>
-      <w:proofErr w:type="gramStart"/>
-      <w:r>
-        <w:t>preparing</w:t>
-      </w:r>
-      <w:proofErr w:type="gramEnd"/>
-      <w:r>
-        <w:t xml:space="preserve"> or ready, and the student receives live status updates. Finally, during pickup, the student pays physically, the admin marks the order as paid and collected, and the system stores the </w:t>
-      </w:r>
-      <w:proofErr w:type="gramStart"/>
-      <w:r>
-        <w:t>completed</w:t>
-      </w:r>
-      <w:proofErr w:type="gramEnd"/>
-      <w:r>
-        <w:t xml:space="preserve"> order in order history.</w:t>
+        <w:t>This sequence diagram shows the step-by-step interaction between Student, Admin, Canteen System, and Database in the Digital Canteen Pre-order System. First, the student browses the menu, and the system fetches menu data from the database. The student then places a one-click order, which is stored as pending and notified to the admin. The admin processes the order by updating its status to preparing or ready, and the student receives live status updates. Finally, during pickup, the student pays physically, the admin marks the order as paid and collected, and the system stores the completed order in order history.</w:t>
       </w:r>
     </w:p>
     <w:p>
@@ -7422,7 +7319,19 @@
         <w:rPr>
           <w:lang w:val="en-US"/>
         </w:rPr>
-        <w:t xml:space="preserve">3.3.7 </w:t>
+        <w:t>3.3.</w:t>
+      </w:r>
+      <w:r>
+        <w:rPr>
+          <w:lang w:val="en-US"/>
+        </w:rPr>
+        <w:t>5</w:t>
+      </w:r>
+      <w:r>
+        <w:rPr>
+          <w:lang w:val="en-US"/>
+        </w:rPr>
+        <w:t xml:space="preserve"> </w:t>
       </w:r>
       <w:r>
         <w:rPr>
@@ -7544,23 +7453,7 @@
       </w:pPr>
       <w:r>
         <w:lastRenderedPageBreak/>
-        <w:t xml:space="preserve">The class diagram of the Digital Canteen Pre-order System represents the main system entities and their relationships. The </w:t>
-      </w:r>
-      <w:proofErr w:type="gramStart"/>
-      <w:r>
-        <w:t>Student</w:t>
-      </w:r>
-      <w:proofErr w:type="gramEnd"/>
-      <w:r>
-        <w:t xml:space="preserve"> class handles student information and ordering functions, while the </w:t>
-      </w:r>
-      <w:proofErr w:type="gramStart"/>
-      <w:r>
-        <w:t>Admin</w:t>
-      </w:r>
-      <w:proofErr w:type="gramEnd"/>
-      <w:r>
-        <w:t xml:space="preserve"> class manages menu items and order processing. The </w:t>
+        <w:t xml:space="preserve">The class diagram of the Digital Canteen Pre-order System represents the main system entities and their relationships. The Student class handles student information and ordering functions, while the Admin class manages menu items and order processing. The </w:t>
       </w:r>
       <w:proofErr w:type="spellStart"/>
       <w:r>
@@ -13478,6 +13371,7 @@
   <w:style w:type="character" w:default="1" w:styleId="DefaultParagraphFont">
     <w:name w:val="Default Paragraph Font"/>
     <w:uiPriority w:val="1"/>
+    <w:semiHidden/>
     <w:unhideWhenUsed/>
   </w:style>
   <w:style w:type="table" w:default="1" w:styleId="TableNormal">

</xml_diff>

<commit_message>
Added mid defense slides and deocumentation
</commit_message>
<xml_diff>
--- a/Slides/Proposal Documentation.docx
+++ b/Slides/Proposal Documentation.docx
@@ -1,6 +1,6 @@
 
 <file path=word/document.xml><?xml version="1.0" encoding="utf-8"?>
-<w:document xmlns:wpc="http://schemas.microsoft.com/office/word/2010/wordprocessingCanvas" xmlns:mc="http://schemas.openxmlformats.org/markup-compatibility/2006" xmlns:o="urn:schemas-microsoft-com:office:office" xmlns:r="http://schemas.openxmlformats.org/officeDocument/2006/relationships" xmlns:m="http://schemas.openxmlformats.org/officeDocument/2006/math" xmlns:v="urn:schemas-microsoft-com:vml" xmlns:wp14="http://schemas.microsoft.com/office/word/2010/wordprocessingDrawing" xmlns:wp="http://schemas.openxmlformats.org/drawingml/2006/wordprocessingDrawing" xmlns:w10="urn:schemas-microsoft-com:office:word" xmlns:w="http://schemas.openxmlformats.org/wordprocessingml/2006/main" xmlns:w14="http://schemas.microsoft.com/office/word/2010/wordml" xmlns:w15="http://schemas.microsoft.com/office/word/2012/wordml" xmlns:wpg="http://schemas.microsoft.com/office/word/2010/wordprocessingGroup" xmlns:wpi="http://schemas.microsoft.com/office/word/2010/wordprocessingInk" xmlns:wne="http://schemas.microsoft.com/office/word/2006/wordml" xmlns:wps="http://schemas.microsoft.com/office/word/2010/wordprocessingShape" mc:Ignorable="w14 w15 wp14">
+<w:document xmlns:wpc="http://schemas.microsoft.com/office/word/2010/wordprocessingCanvas" xmlns:cx="http://schemas.microsoft.com/office/drawing/2014/chartex" xmlns:cx1="http://schemas.microsoft.com/office/drawing/2015/9/8/chartex" xmlns:cx2="http://schemas.microsoft.com/office/drawing/2015/10/21/chartex" xmlns:cx3="http://schemas.microsoft.com/office/drawing/2016/5/9/chartex" xmlns:cx4="http://schemas.microsoft.com/office/drawing/2016/5/10/chartex" xmlns:cx5="http://schemas.microsoft.com/office/drawing/2016/5/11/chartex" xmlns:cx6="http://schemas.microsoft.com/office/drawing/2016/5/12/chartex" xmlns:cx7="http://schemas.microsoft.com/office/drawing/2016/5/13/chartex" xmlns:cx8="http://schemas.microsoft.com/office/drawing/2016/5/14/chartex" xmlns:mc="http://schemas.openxmlformats.org/markup-compatibility/2006" xmlns:aink="http://schemas.microsoft.com/office/drawing/2016/ink" xmlns:am3d="http://schemas.microsoft.com/office/drawing/2017/model3d" xmlns:o="urn:schemas-microsoft-com:office:office" xmlns:oel="http://schemas.microsoft.com/office/2019/extlst" xmlns:r="http://schemas.openxmlformats.org/officeDocument/2006/relationships" xmlns:m="http://schemas.openxmlformats.org/officeDocument/2006/math" xmlns:v="urn:schemas-microsoft-com:vml" xmlns:wp14="http://schemas.microsoft.com/office/word/2010/wordprocessingDrawing" xmlns:wp="http://schemas.openxmlformats.org/drawingml/2006/wordprocessingDrawing" xmlns:w10="urn:schemas-microsoft-com:office:word" xmlns:w="http://schemas.openxmlformats.org/wordprocessingml/2006/main" xmlns:w14="http://schemas.microsoft.com/office/word/2010/wordml" xmlns:w15="http://schemas.microsoft.com/office/word/2012/wordml" xmlns:w16cex="http://schemas.microsoft.com/office/word/2018/wordml/cex" xmlns:w16cid="http://schemas.microsoft.com/office/word/2016/wordml/cid" xmlns:w16="http://schemas.microsoft.com/office/word/2018/wordml" xmlns:w16du="http://schemas.microsoft.com/office/word/2023/wordml/word16du" xmlns:w16sdtdh="http://schemas.microsoft.com/office/word/2020/wordml/sdtdatahash" xmlns:w16sdtfl="http://schemas.microsoft.com/office/word/2024/wordml/sdtformatlock" xmlns:w16se="http://schemas.microsoft.com/office/word/2015/wordml/symex" xmlns:wpg="http://schemas.microsoft.com/office/word/2010/wordprocessingGroup" xmlns:wpi="http://schemas.microsoft.com/office/word/2010/wordprocessingInk" xmlns:wne="http://schemas.microsoft.com/office/word/2006/wordml" xmlns:wps="http://schemas.microsoft.com/office/word/2010/wordprocessingShape" mc:Ignorable="w14 w15 w16se w16cid w16 w16cex w16sdtdh w16sdtfl w16du wp14">
   <w:body>
     <w:p>
       <w:pPr>
@@ -544,15 +544,7 @@
         <w:rPr>
           <w:color w:val="000000"/>
         </w:rPr>
-        <w:t xml:space="preserve">Saistha </w:t>
-      </w:r>
-      <w:bookmarkStart w:id="0" w:name="_GoBack"/>
-      <w:bookmarkEnd w:id="0"/>
-      <w:r>
-        <w:rPr>
-          <w:color w:val="000000"/>
-        </w:rPr>
-        <w:t>Pradhan</w:t>
+        <w:t>Saistha Pradhan</w:t>
       </w:r>
     </w:p>
     <w:p>
@@ -985,12 +977,12 @@
         <w:pStyle w:val="Heading2"/>
         <w:jc w:val="center"/>
       </w:pPr>
-      <w:bookmarkStart w:id="1" w:name="_Toc231489951"/>
+      <w:bookmarkStart w:id="0" w:name="_Toc231489951"/>
       <w:r>
         <w:lastRenderedPageBreak/>
         <w:t>Abstract</w:t>
       </w:r>
-      <w:bookmarkEnd w:id="1"/>
+      <w:bookmarkEnd w:id="0"/>
     </w:p>
     <w:p/>
     <w:p>
@@ -1127,15 +1119,15 @@
       <w:pPr>
         <w:pStyle w:val="Heading1"/>
       </w:pPr>
-      <w:bookmarkStart w:id="2" w:name="_Toc222586726"/>
-      <w:bookmarkStart w:id="3" w:name="_Toc222587363"/>
-      <w:bookmarkStart w:id="4" w:name="_Toc231489952"/>
+      <w:bookmarkStart w:id="1" w:name="_Toc222586726"/>
+      <w:bookmarkStart w:id="2" w:name="_Toc222587363"/>
+      <w:bookmarkStart w:id="3" w:name="_Toc231489952"/>
       <w:r>
         <w:t>TABLE OF CONTENTS</w:t>
       </w:r>
+      <w:bookmarkEnd w:id="1"/>
       <w:bookmarkEnd w:id="2"/>
       <w:bookmarkEnd w:id="3"/>
-      <w:bookmarkEnd w:id="4"/>
     </w:p>
     <w:sdt>
       <w:sdtPr>
@@ -3627,16 +3619,16 @@
       <w:r>
         <w:br w:type="page"/>
       </w:r>
-      <w:bookmarkStart w:id="5" w:name="_heading=h.w2k2kbtzw255" w:colFirst="0" w:colLast="0"/>
-      <w:bookmarkStart w:id="6" w:name="_heading=h.a8zjsq6shil0" w:colFirst="0" w:colLast="0"/>
-      <w:bookmarkStart w:id="7" w:name="_Toc231489953"/>
+      <w:bookmarkStart w:id="4" w:name="_heading=h.w2k2kbtzw255" w:colFirst="0" w:colLast="0"/>
+      <w:bookmarkStart w:id="5" w:name="_heading=h.a8zjsq6shil0" w:colFirst="0" w:colLast="0"/>
+      <w:bookmarkStart w:id="6" w:name="_Toc231489953"/>
+      <w:bookmarkEnd w:id="4"/>
       <w:bookmarkEnd w:id="5"/>
-      <w:bookmarkEnd w:id="6"/>
       <w:r>
         <w:lastRenderedPageBreak/>
         <w:t>LIST OF FIGURES</w:t>
       </w:r>
-      <w:bookmarkEnd w:id="7"/>
+      <w:bookmarkEnd w:id="6"/>
     </w:p>
     <w:p>
       <w:pPr>
@@ -4019,14 +4011,14 @@
       <w:pPr>
         <w:pStyle w:val="Heading1"/>
       </w:pPr>
-      <w:bookmarkStart w:id="8" w:name="_heading=h.d5espw5mq4vf" w:colFirst="0" w:colLast="0"/>
-      <w:bookmarkStart w:id="9" w:name="_Toc231489954"/>
-      <w:bookmarkEnd w:id="8"/>
+      <w:bookmarkStart w:id="7" w:name="_heading=h.d5espw5mq4vf" w:colFirst="0" w:colLast="0"/>
+      <w:bookmarkStart w:id="8" w:name="_Toc231489954"/>
+      <w:bookmarkEnd w:id="7"/>
       <w:r>
         <w:lastRenderedPageBreak/>
         <w:t>ABBREVIATIONS</w:t>
       </w:r>
-      <w:bookmarkEnd w:id="9"/>
+      <w:bookmarkEnd w:id="8"/>
     </w:p>
     <w:tbl>
       <w:tblPr>
@@ -4229,12 +4221,12 @@
       <w:pPr>
         <w:pStyle w:val="Heading1"/>
       </w:pPr>
-      <w:bookmarkStart w:id="10" w:name="_Toc231489955"/>
+      <w:bookmarkStart w:id="9" w:name="_Toc231489955"/>
       <w:r>
         <w:lastRenderedPageBreak/>
         <w:t>CHAPTER 1: INTRODUCTION</w:t>
       </w:r>
-      <w:bookmarkEnd w:id="10"/>
+      <w:bookmarkEnd w:id="9"/>
     </w:p>
     <w:p>
       <w:pPr>
@@ -4244,17 +4236,17 @@
           <w:numId w:val="31"/>
         </w:numPr>
       </w:pPr>
-      <w:bookmarkStart w:id="11" w:name="_heading=h.i1l49pjyck36" w:colFirst="0" w:colLast="0"/>
-      <w:bookmarkStart w:id="12" w:name="_Toc231489956"/>
+      <w:bookmarkStart w:id="10" w:name="_heading=h.i1l49pjyck36" w:colFirst="0" w:colLast="0"/>
+      <w:bookmarkStart w:id="11" w:name="_Toc231489956"/>
+      <w:bookmarkEnd w:id="10"/>
+      <w:r>
+        <w:t>Background</w:t>
+      </w:r>
+      <w:bookmarkStart w:id="12" w:name="_heading=h.rej2f7z0naf2" w:colFirst="0" w:colLast="0"/>
+      <w:bookmarkStart w:id="13" w:name="_Toc218617699"/>
+      <w:bookmarkStart w:id="14" w:name="_Toc218671457"/>
       <w:bookmarkEnd w:id="11"/>
-      <w:r>
-        <w:t>Background</w:t>
-      </w:r>
-      <w:bookmarkStart w:id="13" w:name="_heading=h.rej2f7z0naf2" w:colFirst="0" w:colLast="0"/>
-      <w:bookmarkStart w:id="14" w:name="_Toc218617699"/>
-      <w:bookmarkStart w:id="15" w:name="_Toc218671457"/>
       <w:bookmarkEnd w:id="12"/>
-      <w:bookmarkEnd w:id="13"/>
     </w:p>
     <w:p>
       <w:pPr>
@@ -4340,30 +4332,30 @@
           <w:numId w:val="31"/>
         </w:numPr>
       </w:pPr>
-      <w:bookmarkStart w:id="16" w:name="_Toc231489957"/>
+      <w:bookmarkStart w:id="15" w:name="_Toc231489957"/>
+      <w:bookmarkEnd w:id="13"/>
       <w:bookmarkEnd w:id="14"/>
+      <w:r>
+        <w:t>Problem Statement</w:t>
+      </w:r>
       <w:bookmarkEnd w:id="15"/>
-      <w:r>
-        <w:t>Problem Statement</w:t>
-      </w:r>
+    </w:p>
+    <w:p>
+      <w:r>
+        <w:t>Many students and faculty members face long waiting lines, overcrowding, and delays while purchasing food from the college canteen, especially during break hours. Traditional manual ordering methods also make it difficult for canteen staff to manage orders, track stock availability, and handle large numbers of customers efficiently. In addition, customers often do not know whether food items are available or when their orders are ready for collection. The Click2Eat – Canteen Pre-order System aims to solve these problems by providing a digital platform where users can pre-order meals, view available menu items in real time, and track their order status, while allowing administrators to manage menu items, stock, and orders more effectively.</w:t>
+      </w:r>
+    </w:p>
+    <w:p>
+      <w:pPr>
+        <w:pStyle w:val="Heading2"/>
+      </w:pPr>
+      <w:bookmarkStart w:id="16" w:name="_heading=h.5uepuvxxim53" w:colFirst="0" w:colLast="0"/>
+      <w:bookmarkStart w:id="17" w:name="_Toc231489958"/>
       <w:bookmarkEnd w:id="16"/>
-    </w:p>
-    <w:p>
-      <w:r>
-        <w:t>Many students and faculty members face long waiting lines, overcrowding, and delays while purchasing food from the college canteen, especially during break hours. Traditional manual ordering methods also make it difficult for canteen staff to manage orders, track stock availability, and handle large numbers of customers efficiently. In addition, customers often do not know whether food items are available or when their orders are ready for collection. The Click2Eat – Canteen Pre-order System aims to solve these problems by providing a digital platform where users can pre-order meals, view available menu items in real time, and track their order status, while allowing administrators to manage menu items, stock, and orders more effectively.</w:t>
-      </w:r>
-    </w:p>
-    <w:p>
-      <w:pPr>
-        <w:pStyle w:val="Heading2"/>
-      </w:pPr>
-      <w:bookmarkStart w:id="17" w:name="_heading=h.5uepuvxxim53" w:colFirst="0" w:colLast="0"/>
-      <w:bookmarkStart w:id="18" w:name="_Toc231489958"/>
+      <w:r>
+        <w:t>1.3 Objectives of the Project</w:t>
+      </w:r>
       <w:bookmarkEnd w:id="17"/>
-      <w:r>
-        <w:t>1.3 Objectives of the Project</w:t>
-      </w:r>
-      <w:bookmarkEnd w:id="18"/>
     </w:p>
     <w:p>
       <w:r>
@@ -4399,8 +4391,8 @@
           <w:lang w:val="en-US"/>
         </w:rPr>
       </w:pPr>
-      <w:bookmarkStart w:id="19" w:name="_heading=h.30oi6chmtbxn" w:colFirst="0" w:colLast="0"/>
-      <w:bookmarkEnd w:id="19"/>
+      <w:bookmarkStart w:id="18" w:name="_heading=h.30oi6chmtbxn" w:colFirst="0" w:colLast="0"/>
+      <w:bookmarkEnd w:id="18"/>
       <w:r>
         <w:rPr>
           <w:lang w:val="en-US"/>
@@ -4437,12 +4429,12 @@
       <w:pPr>
         <w:pStyle w:val="Heading2"/>
       </w:pPr>
-      <w:bookmarkStart w:id="20" w:name="_Toc231489959"/>
+      <w:bookmarkStart w:id="19" w:name="_Toc231489959"/>
       <w:r>
         <w:lastRenderedPageBreak/>
         <w:t>1.4 Scope of the Project</w:t>
       </w:r>
-      <w:bookmarkEnd w:id="20"/>
+      <w:bookmarkEnd w:id="19"/>
     </w:p>
     <w:p>
       <w:r>
@@ -4489,13 +4481,13 @@
       <w:pPr>
         <w:pStyle w:val="Heading2"/>
       </w:pPr>
-      <w:bookmarkStart w:id="21" w:name="_heading=h.j8j6xudgt4a5" w:colFirst="0" w:colLast="0"/>
-      <w:bookmarkStart w:id="22" w:name="_Toc231489960"/>
+      <w:bookmarkStart w:id="20" w:name="_heading=h.j8j6xudgt4a5" w:colFirst="0" w:colLast="0"/>
+      <w:bookmarkStart w:id="21" w:name="_Toc231489960"/>
+      <w:bookmarkEnd w:id="20"/>
+      <w:r>
+        <w:t>1.5 Limitations of the Project</w:t>
+      </w:r>
       <w:bookmarkEnd w:id="21"/>
-      <w:r>
-        <w:t>1.5 Limitations of the Project</w:t>
-      </w:r>
-      <w:bookmarkEnd w:id="22"/>
     </w:p>
     <w:p>
       <w:r>
@@ -4545,124 +4537,124 @@
       <w:pPr>
         <w:pStyle w:val="Heading2"/>
       </w:pPr>
-      <w:bookmarkStart w:id="23" w:name="_heading=h.n1bc1coijutl" w:colFirst="0" w:colLast="0"/>
-      <w:bookmarkStart w:id="24" w:name="_Toc231489961"/>
+      <w:bookmarkStart w:id="22" w:name="_heading=h.n1bc1coijutl" w:colFirst="0" w:colLast="0"/>
+      <w:bookmarkStart w:id="23" w:name="_Toc231489961"/>
+      <w:bookmarkEnd w:id="22"/>
+      <w:r>
+        <w:t>1.6 Significance of the Study</w:t>
+      </w:r>
       <w:bookmarkEnd w:id="23"/>
-      <w:r>
-        <w:t>1.6 Significance of the Study</w:t>
-      </w:r>
+    </w:p>
+    <w:p>
+      <w:r>
+        <w:t>This study is significant because it helps improve traditional canteen systems by reducing long queues, saving time, and enhancing food service efficiency through digital automation. Similar studies have shown that smart canteen systems improve operational management, user convenience, and institutional service quality [1</w:t>
+      </w:r>
+      <w:r>
+        <w:t>,</w:t>
+      </w:r>
+      <w:r>
+        <w:t xml:space="preserve"> 2</w:t>
+      </w:r>
+      <w:r>
+        <w:t>,</w:t>
+      </w:r>
+      <w:r>
+        <w:t xml:space="preserve"> 3]. This project specifically provides a simplified one-click pre-order solution for educational institutions, making food ordering faster for students while supporting better menu and order management for canteen administrators.</w:t>
+      </w:r>
+      <w:r>
+        <w:br w:type="page"/>
+      </w:r>
+    </w:p>
+    <w:p>
+      <w:pPr>
+        <w:pStyle w:val="Heading1"/>
+      </w:pPr>
+      <w:bookmarkStart w:id="24" w:name="_heading=h.f4prjalpaczi" w:colFirst="0" w:colLast="0"/>
+      <w:bookmarkStart w:id="25" w:name="_Toc231489962"/>
       <w:bookmarkEnd w:id="24"/>
-    </w:p>
-    <w:p>
-      <w:r>
-        <w:t>This study is significant because it helps improve traditional canteen systems by reducing long queues, saving time, and enhancing food service efficiency through digital automation. Similar studies have shown that smart canteen systems improve operational management, user convenience, and institutional service quality [1</w:t>
-      </w:r>
-      <w:r>
-        <w:t>,</w:t>
-      </w:r>
-      <w:r>
-        <w:t xml:space="preserve"> 2</w:t>
-      </w:r>
-      <w:r>
-        <w:t>,</w:t>
-      </w:r>
-      <w:r>
-        <w:t xml:space="preserve"> 3]. This project specifically provides a simplified one-click pre-order solution for educational institutions, making food ordering faster for students while supporting better menu and order management for canteen administrators.</w:t>
-      </w:r>
-      <w:r>
-        <w:br w:type="page"/>
-      </w:r>
-    </w:p>
-    <w:p>
-      <w:pPr>
-        <w:pStyle w:val="Heading1"/>
-      </w:pPr>
-      <w:bookmarkStart w:id="25" w:name="_heading=h.f4prjalpaczi" w:colFirst="0" w:colLast="0"/>
-      <w:bookmarkStart w:id="26" w:name="_Toc231489962"/>
-      <w:bookmarkEnd w:id="25"/>
       <w:r>
         <w:lastRenderedPageBreak/>
         <w:t>CHAPTER 2: LITERATURE REVIEW</w:t>
       </w:r>
+      <w:bookmarkEnd w:id="25"/>
+    </w:p>
+    <w:p>
+      <w:pPr>
+        <w:pStyle w:val="Heading2"/>
+      </w:pPr>
+      <w:bookmarkStart w:id="26" w:name="_Toc231489963"/>
+      <w:r>
+        <w:t>2.1 Overview</w:t>
+      </w:r>
       <w:bookmarkEnd w:id="26"/>
     </w:p>
     <w:p>
+      <w:r>
+        <w:t>With the rapid advancement of digital technologies, traditional manual systems in various domains are being replaced by automated and efficient solutions. In educational institutions, canteen services still largely depend on manual ordering processes, which often result in long queues, delays, and inefficient management. To address these issues, several digital canteen and food ordering systems have been proposed in previous studies. This section reviews some of the existing systems and identifies their limitations.</w:t>
+      </w:r>
+    </w:p>
+    <w:p>
       <w:pPr>
         <w:pStyle w:val="Heading2"/>
       </w:pPr>
-      <w:bookmarkStart w:id="27" w:name="_Toc231489963"/>
-      <w:r>
-        <w:t>2.1 Overview</w:t>
+      <w:bookmarkStart w:id="27" w:name="_Toc231489964"/>
+      <w:r>
+        <w:t>2.2 Review of Existing Systems</w:t>
       </w:r>
       <w:bookmarkEnd w:id="27"/>
     </w:p>
     <w:p>
-      <w:r>
-        <w:t>With the rapid advancement of digital technologies, traditional manual systems in various domains are being replaced by automated and efficient solutions. In educational institutions, canteen services still largely depend on manual ordering processes, which often result in long queues, delays, and inefficient management. To address these issues, several digital canteen and food ordering systems have been proposed in previous studies. This section reviews some of the existing systems and identifies their limitations.</w:t>
-      </w:r>
-    </w:p>
-    <w:p>
-      <w:pPr>
-        <w:pStyle w:val="Heading2"/>
-      </w:pPr>
-      <w:bookmarkStart w:id="28" w:name="_Toc231489964"/>
-      <w:r>
-        <w:t>2.2 Review of Existing Systems</w:t>
+      <w:pPr>
+        <w:pStyle w:val="Heading3"/>
+      </w:pPr>
+      <w:bookmarkStart w:id="28" w:name="_Toc231489965"/>
+      <w:r>
+        <w:t>2.2.1 QR-Based Canteen System</w:t>
       </w:r>
       <w:bookmarkEnd w:id="28"/>
     </w:p>
     <w:p>
+      <w:r>
+        <w:t xml:space="preserve">One of the widely proposed approaches is the QR-Based Canteen System developed by </w:t>
+      </w:r>
+      <w:r>
+        <w:rPr>
+          <w:lang w:val="en-GB"/>
+        </w:rPr>
+        <w:t xml:space="preserve">Joshi, S., </w:t>
+      </w:r>
+      <w:proofErr w:type="spellStart"/>
+      <w:r>
+        <w:rPr>
+          <w:lang w:val="en-GB"/>
+        </w:rPr>
+        <w:t>Kasaju</w:t>
+      </w:r>
+      <w:proofErr w:type="spellEnd"/>
+      <w:r>
+        <w:rPr>
+          <w:lang w:val="en-GB"/>
+        </w:rPr>
+        <w:t>, B., Karki, P., Aryal, S. K., &amp; Chhetri, S. B</w:t>
+      </w:r>
+      <w:r>
+        <w:t>. [1]. This system uses Quick Response (QR) codes to provide users with access to the digital menu. Students can scan the QR code using their mobile devices, view available food items, and place orders electronically. The main advantage of this system is that it reduces physical interaction and eliminates the need for printed menus or manual order-taking.</w:t>
+      </w:r>
+    </w:p>
+    <w:p>
+      <w:r>
+        <w:t>Additionally, the QR-based approach helps in minimizing crowding at the ordering counter and supports a more hygienic environment. It is especially useful in situations where contactless services are preferred. However, despite these advantages, the system introduces certain usability challenges. Users are required to scan the QR code every time they want to access the menu, which adds an extra step and may not be convenient for frequent use.</w:t>
+      </w:r>
+    </w:p>
+    <w:p>
       <w:pPr>
         <w:pStyle w:val="Heading3"/>
       </w:pPr>
-      <w:bookmarkStart w:id="29" w:name="_Toc231489965"/>
-      <w:r>
-        <w:t>2.2.1 QR-Based Canteen System</w:t>
+      <w:bookmarkStart w:id="29" w:name="_Toc231489966"/>
+      <w:r>
+        <w:t>2.2.2 Android-Based Canteen Ordering System</w:t>
       </w:r>
       <w:bookmarkEnd w:id="29"/>
-    </w:p>
-    <w:p>
-      <w:r>
-        <w:t xml:space="preserve">One of the widely proposed approaches is the QR-Based Canteen System developed by </w:t>
-      </w:r>
-      <w:r>
-        <w:rPr>
-          <w:lang w:val="en-GB"/>
-        </w:rPr>
-        <w:t xml:space="preserve">Joshi, S., </w:t>
-      </w:r>
-      <w:proofErr w:type="spellStart"/>
-      <w:r>
-        <w:rPr>
-          <w:lang w:val="en-GB"/>
-        </w:rPr>
-        <w:t>Kasaju</w:t>
-      </w:r>
-      <w:proofErr w:type="spellEnd"/>
-      <w:r>
-        <w:rPr>
-          <w:lang w:val="en-GB"/>
-        </w:rPr>
-        <w:t>, B., Karki, P., Aryal, S. K., &amp; Chhetri, S. B</w:t>
-      </w:r>
-      <w:r>
-        <w:t>. [1]. This system uses Quick Response (QR) codes to provide users with access to the digital menu. Students can scan the QR code using their mobile devices, view available food items, and place orders electronically. The main advantage of this system is that it reduces physical interaction and eliminates the need for printed menus or manual order-taking.</w:t>
-      </w:r>
-    </w:p>
-    <w:p>
-      <w:r>
-        <w:t>Additionally, the QR-based approach helps in minimizing crowding at the ordering counter and supports a more hygienic environment. It is especially useful in situations where contactless services are preferred. However, despite these advantages, the system introduces certain usability challenges. Users are required to scan the QR code every time they want to access the menu, which adds an extra step and may not be convenient for frequent use.</w:t>
-      </w:r>
-    </w:p>
-    <w:p>
-      <w:pPr>
-        <w:pStyle w:val="Heading3"/>
-      </w:pPr>
-      <w:bookmarkStart w:id="30" w:name="_Toc231489966"/>
-      <w:r>
-        <w:t>2.2.2 Android-Based Canteen Ordering System</w:t>
-      </w:r>
-      <w:bookmarkEnd w:id="30"/>
     </w:p>
     <w:p>
       <w:r>
@@ -4710,11 +4702,11 @@
       <w:pPr>
         <w:pStyle w:val="Heading3"/>
       </w:pPr>
-      <w:bookmarkStart w:id="31" w:name="_Toc231489967"/>
+      <w:bookmarkStart w:id="30" w:name="_Toc231489967"/>
       <w:r>
         <w:t>2.2.3 Smart Canteen Management System</w:t>
       </w:r>
-      <w:bookmarkEnd w:id="31"/>
+      <w:bookmarkEnd w:id="30"/>
     </w:p>
     <w:p>
       <w:r>
@@ -4764,12 +4756,12 @@
       <w:pPr>
         <w:pStyle w:val="Heading2"/>
       </w:pPr>
-      <w:bookmarkStart w:id="32" w:name="_Toc231489968"/>
+      <w:bookmarkStart w:id="31" w:name="_Toc231489968"/>
       <w:r>
         <w:lastRenderedPageBreak/>
         <w:t>2.3 Research Gap</w:t>
       </w:r>
-      <w:bookmarkEnd w:id="32"/>
+      <w:bookmarkEnd w:id="31"/>
     </w:p>
     <w:p>
       <w:r>
@@ -4857,40 +4849,40 @@
       <w:pPr>
         <w:pStyle w:val="Heading1"/>
       </w:pPr>
-      <w:bookmarkStart w:id="33" w:name="_Toc231489969"/>
+      <w:bookmarkStart w:id="32" w:name="_Toc231489969"/>
       <w:r>
         <w:t>CHAPTER 3: SYSTEM ANALYSIS AND DESIGN</w:t>
       </w:r>
+      <w:bookmarkEnd w:id="32"/>
+    </w:p>
+    <w:p>
+      <w:pPr>
+        <w:pStyle w:val="Heading2"/>
+      </w:pPr>
+      <w:bookmarkStart w:id="33" w:name="_heading=h.u1vy5u9sb9xg" w:colFirst="0" w:colLast="0"/>
+      <w:bookmarkStart w:id="34" w:name="_Toc231489970"/>
       <w:bookmarkEnd w:id="33"/>
-    </w:p>
-    <w:p>
-      <w:pPr>
-        <w:pStyle w:val="Heading2"/>
-      </w:pPr>
-      <w:bookmarkStart w:id="34" w:name="_heading=h.u1vy5u9sb9xg" w:colFirst="0" w:colLast="0"/>
-      <w:bookmarkStart w:id="35" w:name="_Toc231489970"/>
+      <w:r>
+        <w:t>3.1 Project Management Strategy and Development Tools</w:t>
+      </w:r>
       <w:bookmarkEnd w:id="34"/>
-      <w:r>
-        <w:t>3.1 Project Management Strategy and Development Tools</w:t>
-      </w:r>
+    </w:p>
+    <w:p>
+      <w:r>
+        <w:t>The project follows a structured development model using PHP, MySQL, HTML/CSS, and XAMPP.</w:t>
+      </w:r>
+    </w:p>
+    <w:p>
+      <w:pPr>
+        <w:pStyle w:val="Heading3"/>
+      </w:pPr>
+      <w:bookmarkStart w:id="35" w:name="_heading=h.7zuyyf93m0tj" w:colFirst="0" w:colLast="0"/>
+      <w:bookmarkStart w:id="36" w:name="_Toc231489971"/>
       <w:bookmarkEnd w:id="35"/>
-    </w:p>
-    <w:p>
-      <w:r>
-        <w:t>The project follows a structured development model using PHP, MySQL, HTML/CSS, and XAMPP.</w:t>
-      </w:r>
-    </w:p>
-    <w:p>
-      <w:pPr>
-        <w:pStyle w:val="Heading3"/>
-      </w:pPr>
-      <w:bookmarkStart w:id="36" w:name="_heading=h.7zuyyf93m0tj" w:colFirst="0" w:colLast="0"/>
-      <w:bookmarkStart w:id="37" w:name="_Toc231489971"/>
+      <w:r>
+        <w:t>3.1.1 Project Team</w:t>
+      </w:r>
       <w:bookmarkEnd w:id="36"/>
-      <w:r>
-        <w:t>3.1.1 Project Team</w:t>
-      </w:r>
-      <w:bookmarkEnd w:id="37"/>
     </w:p>
     <w:tbl>
       <w:tblPr>
@@ -5248,13 +5240,13 @@
       <w:pPr>
         <w:pStyle w:val="Heading3"/>
       </w:pPr>
-      <w:bookmarkStart w:id="38" w:name="_heading=h.ron2k72j96vm" w:colFirst="0" w:colLast="0"/>
-      <w:bookmarkStart w:id="39" w:name="_Toc231489972"/>
+      <w:bookmarkStart w:id="37" w:name="_heading=h.ron2k72j96vm" w:colFirst="0" w:colLast="0"/>
+      <w:bookmarkStart w:id="38" w:name="_Toc231489972"/>
+      <w:bookmarkEnd w:id="37"/>
+      <w:r>
+        <w:t>3.1.2 Project Flow and Schedule</w:t>
+      </w:r>
       <w:bookmarkEnd w:id="38"/>
-      <w:r>
-        <w:t>3.1.2 Project Flow and Schedule</w:t>
-      </w:r>
-      <w:bookmarkEnd w:id="39"/>
     </w:p>
     <w:p>
       <w:pPr>
@@ -5310,20 +5302,20 @@
       <w:r>
         <w:t xml:space="preserve"> hours per week</w:t>
       </w:r>
-      <w:bookmarkStart w:id="40" w:name="_heading=h.maal2unv44ff" w:colFirst="0" w:colLast="0"/>
+      <w:bookmarkStart w:id="39" w:name="_heading=h.maal2unv44ff" w:colFirst="0" w:colLast="0"/>
+      <w:bookmarkEnd w:id="39"/>
+    </w:p>
+    <w:p>
+      <w:pPr>
+        <w:pStyle w:val="Heading3"/>
+      </w:pPr>
+      <w:bookmarkStart w:id="40" w:name="_Toc231489973"/>
+      <w:r>
+        <w:t>3.1.3 Responsibilities</w:t>
+      </w:r>
       <w:bookmarkEnd w:id="40"/>
     </w:p>
     <w:p>
-      <w:pPr>
-        <w:pStyle w:val="Heading3"/>
-      </w:pPr>
-      <w:bookmarkStart w:id="41" w:name="_Toc231489973"/>
-      <w:r>
-        <w:t>3.1.3 Responsibilities</w:t>
-      </w:r>
-      <w:bookmarkEnd w:id="41"/>
-    </w:p>
-    <w:p>
       <w:r>
         <w:t>This section States the responsibilities of each members of the project</w:t>
       </w:r>
@@ -5333,10 +5325,7 @@
         <w:pStyle w:val="Heading4"/>
       </w:pPr>
       <w:r>
-        <w:t xml:space="preserve">3.1.3.1 Responsibilities of </w:t>
-      </w:r>
-      <w:r>
-        <w:t>Supervisor</w:t>
+        <w:t>3.1.3.1 Responsibilities of Supervisor</w:t>
       </w:r>
     </w:p>
     <w:p>
@@ -5454,11 +5443,11 @@
       <w:pPr>
         <w:pStyle w:val="Heading3"/>
       </w:pPr>
-      <w:bookmarkStart w:id="42" w:name="_Toc231489974"/>
+      <w:bookmarkStart w:id="41" w:name="_Toc231489974"/>
       <w:r>
         <w:t>3.1.4 Development Tools</w:t>
       </w:r>
-      <w:bookmarkEnd w:id="42"/>
+      <w:bookmarkEnd w:id="41"/>
     </w:p>
     <w:p>
       <w:r>
@@ -5719,8 +5708,8 @@
           <w:numId w:val="12"/>
         </w:numPr>
       </w:pPr>
-      <w:bookmarkStart w:id="43" w:name="_heading=h.6n827nx6943l" w:colFirst="0" w:colLast="0"/>
-      <w:bookmarkEnd w:id="43"/>
+      <w:bookmarkStart w:id="42" w:name="_heading=h.6n827nx6943l" w:colFirst="0" w:colLast="0"/>
+      <w:bookmarkEnd w:id="42"/>
       <w:r>
         <w:t>Web Server</w:t>
       </w:r>
@@ -5773,8 +5762,8 @@
           <w:numId w:val="12"/>
         </w:numPr>
       </w:pPr>
-      <w:bookmarkStart w:id="44" w:name="_heading=h.ybc72l1r1rpg" w:colFirst="0" w:colLast="0"/>
-      <w:bookmarkEnd w:id="44"/>
+      <w:bookmarkStart w:id="43" w:name="_heading=h.ybc72l1r1rpg" w:colFirst="0" w:colLast="0"/>
+      <w:bookmarkEnd w:id="43"/>
       <w:r>
         <w:t>Testing Tools</w:t>
       </w:r>
@@ -5798,7 +5787,21 @@
         <w:rPr>
           <w:rFonts w:hint="eastAsia"/>
         </w:rPr>
-        <w:t xml:space="preserve"> identify UI/UX.</w:t>
+        <w:t xml:space="preserve"> </w:t>
+      </w:r>
+      <w:proofErr w:type="gramStart"/>
+      <w:r>
+        <w:rPr>
+          <w:rFonts w:hint="eastAsia"/>
+        </w:rPr>
+        <w:t>identify</w:t>
+      </w:r>
+      <w:proofErr w:type="gramEnd"/>
+      <w:r>
+        <w:rPr>
+          <w:rFonts w:hint="eastAsia"/>
+        </w:rPr>
+        <w:t xml:space="preserve"> UI/UX.</w:t>
       </w:r>
     </w:p>
     <w:p>
@@ -5809,36 +5812,36 @@
           <w:numId w:val="12"/>
         </w:numPr>
       </w:pPr>
-      <w:bookmarkStart w:id="45" w:name="_heading=h.8zmd9tgdmdqp" w:colFirst="0" w:colLast="0"/>
-      <w:bookmarkStart w:id="46" w:name="_Toc231489975"/>
+      <w:bookmarkStart w:id="44" w:name="_heading=h.8zmd9tgdmdqp" w:colFirst="0" w:colLast="0"/>
+      <w:bookmarkStart w:id="45" w:name="_Toc231489975"/>
+      <w:bookmarkEnd w:id="44"/>
+      <w:r>
+        <w:t>System Analysis</w:t>
+      </w:r>
       <w:bookmarkEnd w:id="45"/>
-      <w:r>
-        <w:t>System Analysis</w:t>
-      </w:r>
+    </w:p>
+    <w:p>
+      <w:r>
+        <w:t xml:space="preserve">The system is designed based on collected requirements for secure login, </w:t>
+      </w:r>
+      <w:r>
+        <w:t>order tracking</w:t>
+      </w:r>
+      <w:r>
+        <w:t>, admin controls, and user experience</w:t>
+      </w:r>
+    </w:p>
+    <w:p>
+      <w:pPr>
+        <w:pStyle w:val="Heading3"/>
+      </w:pPr>
+      <w:bookmarkStart w:id="46" w:name="_heading=h.4j04lyz3b7oc" w:colFirst="0" w:colLast="0"/>
+      <w:bookmarkStart w:id="47" w:name="_Toc231489976"/>
       <w:bookmarkEnd w:id="46"/>
-    </w:p>
-    <w:p>
-      <w:r>
-        <w:t xml:space="preserve">The system is designed based on collected requirements for secure login, </w:t>
-      </w:r>
-      <w:r>
-        <w:t>order tracking</w:t>
-      </w:r>
-      <w:r>
-        <w:t>, admin controls, and user experience</w:t>
-      </w:r>
-    </w:p>
-    <w:p>
-      <w:pPr>
-        <w:pStyle w:val="Heading3"/>
-      </w:pPr>
-      <w:bookmarkStart w:id="47" w:name="_heading=h.4j04lyz3b7oc" w:colFirst="0" w:colLast="0"/>
-      <w:bookmarkStart w:id="48" w:name="_Toc231489976"/>
+      <w:r>
+        <w:t>3.2.1 Requirement Analysis</w:t>
+      </w:r>
       <w:bookmarkEnd w:id="47"/>
-      <w:r>
-        <w:t>3.2.1 Requirement Analysis</w:t>
-      </w:r>
-      <w:bookmarkEnd w:id="48"/>
     </w:p>
     <w:p>
       <w:r>
@@ -6542,157 +6545,154 @@
       <w:pPr>
         <w:pStyle w:val="Heading3"/>
       </w:pPr>
-      <w:bookmarkStart w:id="49" w:name="_heading=h.mgp18nndx2i9" w:colFirst="0" w:colLast="0"/>
-      <w:bookmarkStart w:id="50" w:name="_Toc231489977"/>
+      <w:bookmarkStart w:id="48" w:name="_heading=h.mgp18nndx2i9" w:colFirst="0" w:colLast="0"/>
+      <w:bookmarkStart w:id="49" w:name="_Toc231489977"/>
+      <w:bookmarkEnd w:id="48"/>
+      <w:r>
+        <w:lastRenderedPageBreak/>
+        <w:t>3.2.2 Feasibility Analysis</w:t>
+      </w:r>
       <w:bookmarkEnd w:id="49"/>
-      <w:r>
-        <w:lastRenderedPageBreak/>
-        <w:t>3.2.2 Feasibility Ana</w:t>
-      </w:r>
-      <w:r>
-        <w:t>lysis</w:t>
-      </w:r>
+    </w:p>
+    <w:p>
+      <w:pPr>
+        <w:pStyle w:val="Heading4"/>
+      </w:pPr>
+      <w:r>
+        <w:rPr>
+          <w:rFonts w:hint="eastAsia"/>
+        </w:rPr>
+        <w:t>3.2.2.1 Technical Feasibility</w:t>
+      </w:r>
+    </w:p>
+    <w:p>
+      <w:pPr>
+        <w:rPr>
+          <w:lang w:val="en-US"/>
+        </w:rPr>
+      </w:pPr>
+      <w:r>
+        <w:rPr>
+          <w:lang w:val="en-US"/>
+        </w:rPr>
+        <w:t>Easily developed using basic web technologies with no complex requirements</w:t>
+      </w:r>
+      <w:r>
+        <w:rPr>
+          <w:lang w:val="en-US"/>
+        </w:rPr>
+        <w:t>.</w:t>
+      </w:r>
+    </w:p>
+    <w:p>
+      <w:pPr>
+        <w:pStyle w:val="Heading4"/>
+      </w:pPr>
+      <w:r>
+        <w:rPr>
+          <w:rFonts w:hint="eastAsia"/>
+        </w:rPr>
+        <w:t>3.2.2.2 Operational Feasibility</w:t>
+      </w:r>
+    </w:p>
+    <w:p>
+      <w:pPr>
+        <w:rPr>
+          <w:lang w:val="en-US"/>
+        </w:rPr>
+      </w:pPr>
+      <w:r>
+        <w:rPr>
+          <w:lang w:val="en-US"/>
+        </w:rPr>
+        <w:t>Simple for students and staff to use, improving canteen workflow.</w:t>
+      </w:r>
+    </w:p>
+    <w:p>
+      <w:pPr>
+        <w:pStyle w:val="Heading4"/>
+      </w:pPr>
+      <w:r>
+        <w:rPr>
+          <w:rFonts w:hint="eastAsia"/>
+        </w:rPr>
+        <w:t>3.2.2.3 Economic Feasibility</w:t>
+      </w:r>
+    </w:p>
+    <w:p>
+      <w:r>
+        <w:rPr>
+          <w:rFonts w:hint="eastAsia"/>
+        </w:rPr>
+        <w:t>Development tools like XAMPP, VS Code and MySQL are free to use and maintenance cost are low due to system</w:t>
+      </w:r>
+      <w:r>
+        <w:t>’</w:t>
+      </w:r>
+      <w:r>
+        <w:rPr>
+          <w:rFonts w:hint="eastAsia"/>
+        </w:rPr>
+        <w:t>s simplicity.</w:t>
+      </w:r>
+    </w:p>
+    <w:p>
+      <w:pPr>
+        <w:pStyle w:val="Heading4"/>
+      </w:pPr>
+      <w:r>
+        <w:rPr>
+          <w:rFonts w:hint="eastAsia"/>
+        </w:rPr>
+        <w:t>3.2.2.4 Time feasibility</w:t>
+      </w:r>
+    </w:p>
+    <w:p>
+      <w:r>
+        <w:rPr>
+          <w:rFonts w:hint="eastAsia"/>
+        </w:rPr>
+        <w:t>This project is simple enough to be completed within 1-2 month</w:t>
+      </w:r>
+      <w:r>
+        <w:t>s</w:t>
+      </w:r>
+      <w:r>
+        <w:rPr>
+          <w:rFonts w:hint="eastAsia"/>
+        </w:rPr>
+        <w:t>. Tasks such as UI design, backend design, database setup, and testing are manageable during this time frame.</w:t>
+      </w:r>
+    </w:p>
+    <w:p>
+      <w:pPr>
+        <w:pStyle w:val="Heading2"/>
+      </w:pPr>
+      <w:bookmarkStart w:id="50" w:name="_heading=h.d6cp72a9hhu2" w:colFirst="0" w:colLast="0"/>
+      <w:bookmarkStart w:id="51" w:name="_Toc231489978"/>
       <w:bookmarkEnd w:id="50"/>
-    </w:p>
-    <w:p>
-      <w:pPr>
-        <w:pStyle w:val="Heading4"/>
-      </w:pPr>
-      <w:r>
-        <w:rPr>
-          <w:rFonts w:hint="eastAsia"/>
-        </w:rPr>
-        <w:t>3.2.2.1 Technical Feasibility</w:t>
-      </w:r>
-    </w:p>
-    <w:p>
-      <w:pPr>
-        <w:rPr>
-          <w:lang w:val="en-US"/>
-        </w:rPr>
-      </w:pPr>
-      <w:r>
-        <w:rPr>
-          <w:lang w:val="en-US"/>
-        </w:rPr>
-        <w:t>Easily developed using basic web technologies with no complex requirements</w:t>
-      </w:r>
-      <w:r>
-        <w:rPr>
-          <w:lang w:val="en-US"/>
-        </w:rPr>
-        <w:t>.</w:t>
-      </w:r>
-    </w:p>
-    <w:p>
-      <w:pPr>
-        <w:pStyle w:val="Heading4"/>
-      </w:pPr>
-      <w:r>
-        <w:rPr>
-          <w:rFonts w:hint="eastAsia"/>
-        </w:rPr>
-        <w:t>3.2.2.2 Operational Feasibility</w:t>
-      </w:r>
-    </w:p>
-    <w:p>
-      <w:pPr>
-        <w:rPr>
-          <w:lang w:val="en-US"/>
-        </w:rPr>
-      </w:pPr>
-      <w:r>
-        <w:rPr>
-          <w:lang w:val="en-US"/>
-        </w:rPr>
-        <w:t>Simple for students and staff to use, improving canteen workflow.</w:t>
-      </w:r>
-    </w:p>
-    <w:p>
-      <w:pPr>
-        <w:pStyle w:val="Heading4"/>
-      </w:pPr>
-      <w:r>
-        <w:rPr>
-          <w:rFonts w:hint="eastAsia"/>
-        </w:rPr>
-        <w:t>3.2.2.3 Economic Feasibility</w:t>
-      </w:r>
-    </w:p>
-    <w:p>
-      <w:r>
-        <w:rPr>
-          <w:rFonts w:hint="eastAsia"/>
-        </w:rPr>
-        <w:t>Development tools like XAMPP, VS Code and MySQL are free to use and maintenance cost are low due to system</w:t>
-      </w:r>
-      <w:r>
-        <w:t>’</w:t>
-      </w:r>
-      <w:r>
-        <w:rPr>
-          <w:rFonts w:hint="eastAsia"/>
-        </w:rPr>
-        <w:t>s simplicity.</w:t>
-      </w:r>
-    </w:p>
-    <w:p>
-      <w:pPr>
-        <w:pStyle w:val="Heading4"/>
-      </w:pPr>
-      <w:r>
-        <w:rPr>
-          <w:rFonts w:hint="eastAsia"/>
-        </w:rPr>
-        <w:t>3.2.2.4 Time feasibility</w:t>
-      </w:r>
-    </w:p>
-    <w:p>
-      <w:r>
-        <w:rPr>
-          <w:rFonts w:hint="eastAsia"/>
-        </w:rPr>
-        <w:t>This project is simple enough to be completed within 1-2 month</w:t>
-      </w:r>
-      <w:r>
-        <w:t>s</w:t>
-      </w:r>
-      <w:r>
-        <w:rPr>
-          <w:rFonts w:hint="eastAsia"/>
-        </w:rPr>
-        <w:t>. Tasks such as UI design, backend design, database setup, and testing are manageable during this time frame.</w:t>
-      </w:r>
-    </w:p>
-    <w:p>
-      <w:pPr>
-        <w:pStyle w:val="Heading2"/>
-      </w:pPr>
-      <w:bookmarkStart w:id="51" w:name="_heading=h.d6cp72a9hhu2" w:colFirst="0" w:colLast="0"/>
-      <w:bookmarkStart w:id="52" w:name="_Toc231489978"/>
-      <w:bookmarkEnd w:id="51"/>
       <w:r>
         <w:lastRenderedPageBreak/>
         <w:t>3.3 System Design</w:t>
       </w:r>
+      <w:bookmarkEnd w:id="51"/>
+    </w:p>
+    <w:p>
+      <w:pPr>
+        <w:pStyle w:val="Heading3"/>
+      </w:pPr>
+      <w:bookmarkStart w:id="52" w:name="_heading=h.k67w28n36xvg" w:colFirst="0" w:colLast="0"/>
+      <w:bookmarkStart w:id="53" w:name="_Toc231489979"/>
       <w:bookmarkEnd w:id="52"/>
-    </w:p>
-    <w:p>
-      <w:pPr>
-        <w:pStyle w:val="Heading3"/>
-      </w:pPr>
-      <w:bookmarkStart w:id="53" w:name="_heading=h.k67w28n36xvg" w:colFirst="0" w:colLast="0"/>
-      <w:bookmarkStart w:id="54" w:name="_Toc231489979"/>
+      <w:r>
+        <w:t xml:space="preserve">3.3.1. </w:t>
+      </w:r>
+      <w:r>
+        <w:t>Activity Diagram</w:t>
+      </w:r>
+      <w:bookmarkStart w:id="54" w:name="_heading=h.hk8xz1pthqk" w:colFirst="0" w:colLast="0"/>
       <w:bookmarkEnd w:id="53"/>
-      <w:r>
-        <w:t xml:space="preserve">3.3.1. </w:t>
-      </w:r>
-      <w:r>
-        <w:t>Activity Diagram</w:t>
-      </w:r>
-      <w:bookmarkStart w:id="55" w:name="_heading=h.hk8xz1pthqk" w:colFirst="0" w:colLast="0"/>
       <w:bookmarkEnd w:id="54"/>
-      <w:bookmarkEnd w:id="55"/>
     </w:p>
     <w:p>
       <w:pPr>
@@ -6771,8 +6771,8 @@
           <w:iCs w:val="0"/>
         </w:rPr>
       </w:pPr>
-      <w:bookmarkStart w:id="56" w:name="_Toc222587627"/>
-      <w:bookmarkStart w:id="57" w:name="_Toc229035108"/>
+      <w:bookmarkStart w:id="55" w:name="_Toc222587627"/>
+      <w:bookmarkStart w:id="56" w:name="_Toc229035108"/>
       <w:r>
         <w:rPr>
           <w:i w:val="0"/>
@@ -6824,7 +6824,7 @@
         </w:rPr>
         <w:t xml:space="preserve">: </w:t>
       </w:r>
-      <w:bookmarkEnd w:id="56"/>
+      <w:bookmarkEnd w:id="55"/>
       <w:r>
         <w:rPr>
           <w:i w:val="0"/>
@@ -6832,7 +6832,7 @@
         </w:rPr>
         <w:t>Activity Diagram</w:t>
       </w:r>
-      <w:bookmarkEnd w:id="57"/>
+      <w:bookmarkEnd w:id="56"/>
     </w:p>
     <w:p>
       <w:r>
@@ -6844,21 +6844,21 @@
       <w:pPr>
         <w:pStyle w:val="Heading3"/>
       </w:pPr>
-      <w:bookmarkStart w:id="58" w:name="_heading=h.vmwmntx85w3w" w:colFirst="0" w:colLast="0"/>
-      <w:bookmarkStart w:id="59" w:name="_heading=h.7lcjph8hb9cx" w:colFirst="0" w:colLast="0"/>
-      <w:bookmarkStart w:id="60" w:name="_Toc231489980"/>
+      <w:bookmarkStart w:id="57" w:name="_heading=h.vmwmntx85w3w" w:colFirst="0" w:colLast="0"/>
+      <w:bookmarkStart w:id="58" w:name="_heading=h.7lcjph8hb9cx" w:colFirst="0" w:colLast="0"/>
+      <w:bookmarkStart w:id="59" w:name="_Toc231489980"/>
+      <w:bookmarkEnd w:id="57"/>
       <w:bookmarkEnd w:id="58"/>
+      <w:r>
+        <w:t>3.3.</w:t>
+      </w:r>
+      <w:r>
+        <w:t>2</w:t>
+      </w:r>
+      <w:r>
+        <w:t xml:space="preserve"> ER Diagram</w:t>
+      </w:r>
       <w:bookmarkEnd w:id="59"/>
-      <w:r>
-        <w:t>3.3.</w:t>
-      </w:r>
-      <w:r>
-        <w:t>2</w:t>
-      </w:r>
-      <w:r>
-        <w:t xml:space="preserve"> ER Diagram</w:t>
-      </w:r>
-      <w:bookmarkEnd w:id="60"/>
     </w:p>
     <w:p>
       <w:r>
@@ -6913,8 +6913,8 @@
           <w:iCs w:val="0"/>
         </w:rPr>
       </w:pPr>
-      <w:bookmarkStart w:id="61" w:name="_Toc222587628"/>
-      <w:bookmarkStart w:id="62" w:name="_Toc229035109"/>
+      <w:bookmarkStart w:id="60" w:name="_Toc222587628"/>
+      <w:bookmarkStart w:id="61" w:name="_Toc229035109"/>
       <w:r>
         <w:rPr>
           <w:i w:val="0"/>
@@ -6966,43 +6966,42 @@
         </w:rPr>
         <w:t>: ER Diagram</w:t>
       </w:r>
+      <w:bookmarkEnd w:id="60"/>
       <w:bookmarkEnd w:id="61"/>
+    </w:p>
+    <w:p>
+      <w:r>
+        <w:t>This ER diagram shows the main entities of the Digital Canteen Pre-order System: Students, Orders, Menu Items, Admin, and Order History. Students place orders, select menu items, and view their order history. Each order stores student details, selected food, payment amount, and status. Admin manages menu items and receives student orders for processing. Completed orders are stored in Order History for future reference</w:t>
+      </w:r>
+    </w:p>
+    <w:p>
+      <w:pPr>
+        <w:pStyle w:val="Heading3"/>
+      </w:pPr>
+      <w:bookmarkStart w:id="62" w:name="_heading=h.48eqp0mcihuv" w:colFirst="0" w:colLast="0"/>
+      <w:bookmarkStart w:id="63" w:name="_Toc231489981"/>
       <w:bookmarkEnd w:id="62"/>
-    </w:p>
-    <w:p>
-      <w:r>
-        <w:t>This ER diagram shows the main entities of the Digital Canteen Pre-order System: Students, Orders, Menu Items, Admin, and Order History. Students place orders, select menu items, and view their order history. Each order stores student details, selected food, payment amount, and status. Admin manages menu items and receives student orders for processing. Completed orders are stored in Order History for future reference</w:t>
-      </w:r>
-    </w:p>
-    <w:p>
-      <w:pPr>
-        <w:pStyle w:val="Heading3"/>
-      </w:pPr>
-      <w:bookmarkStart w:id="63" w:name="_heading=h.48eqp0mcihuv" w:colFirst="0" w:colLast="0"/>
-      <w:bookmarkStart w:id="64" w:name="_Toc231489981"/>
-      <w:bookmarkEnd w:id="63"/>
       <w:r>
         <w:lastRenderedPageBreak/>
         <w:t>3.3.5 Use Case Diagram</w:t>
       </w:r>
-      <w:bookmarkEnd w:id="64"/>
-    </w:p>
-    <w:p>
-      <w:pPr>
-        <w:rPr>
-          <w:lang w:val="en-US"/>
-        </w:rPr>
-      </w:pPr>
-      <w:r>
-        <w:rPr>
-          <w:noProof/>
-          <w:lang w:val="en-US" w:eastAsia="en-US"/>
+      <w:bookmarkEnd w:id="63"/>
+    </w:p>
+    <w:p>
+      <w:pPr>
+        <w:rPr>
+          <w:lang w:val="en-US"/>
+        </w:rPr>
+      </w:pPr>
+      <w:r>
+        <w:rPr>
+          <w:lang w:val="en-US"/>
         </w:rPr>
         <w:drawing>
-          <wp:inline distT="0" distB="0" distL="0" distR="0" wp14:anchorId="5065AFBE" wp14:editId="76A870EB">
-            <wp:extent cx="5503333" cy="5037181"/>
-            <wp:effectExtent l="0" t="0" r="2540" b="0"/>
-            <wp:docPr id="467877348" name="Picture 9"/>
+          <wp:inline distT="0" distB="0" distL="0" distR="0" wp14:anchorId="248E0C02" wp14:editId="4CC40CCA">
+            <wp:extent cx="5631180" cy="5271743"/>
+            <wp:effectExtent l="0" t="0" r="0" b="0"/>
+            <wp:docPr id="1128059239" name="Picture 2"/>
             <wp:cNvGraphicFramePr>
               <a:graphicFrameLocks xmlns:a="http://schemas.openxmlformats.org/drawingml/2006/main" noChangeAspect="1"/>
             </wp:cNvGraphicFramePr>
@@ -7010,12 +7009,12 @@
               <a:graphicData uri="http://schemas.openxmlformats.org/drawingml/2006/picture">
                 <pic:pic xmlns:pic="http://schemas.openxmlformats.org/drawingml/2006/picture">
                   <pic:nvPicPr>
-                    <pic:cNvPr id="0" name="Picture 20"/>
+                    <pic:cNvPr id="0" name="Picture 6"/>
                     <pic:cNvPicPr>
                       <a:picLocks noChangeAspect="1" noChangeArrowheads="1"/>
                     </pic:cNvPicPr>
                   </pic:nvPicPr>
-                  <pic:blipFill rotWithShape="1">
+                  <pic:blipFill>
                     <a:blip r:embed="rId14" cstate="print">
                       <a:extLst>
                         <a:ext uri="{28A0092B-C50C-407E-A947-70E740481C1C}">
@@ -7023,7 +7022,7 @@
                         </a:ext>
                       </a:extLst>
                     </a:blip>
-                    <a:srcRect l="1713" t="6495" r="981" b="625"/>
+                    <a:srcRect/>
                     <a:stretch>
                       <a:fillRect/>
                     </a:stretch>
@@ -7031,7 +7030,7 @@
                   <pic:spPr bwMode="auto">
                     <a:xfrm>
                       <a:off x="0" y="0"/>
-                      <a:ext cx="5526060" cy="5057983"/>
+                      <a:ext cx="5654004" cy="5293110"/>
                     </a:xfrm>
                     <a:prstGeom prst="rect">
                       <a:avLst/>
@@ -7040,11 +7039,6 @@
                     <a:ln>
                       <a:noFill/>
                     </a:ln>
-                    <a:extLst>
-                      <a:ext uri="{53640926-AAD7-44D8-BBD7-CCE9431645EC}">
-                        <a14:shadowObscured xmlns:a14="http://schemas.microsoft.com/office/drawing/2010/main"/>
-                      </a:ext>
-                    </a:extLst>
                   </pic:spPr>
                 </pic:pic>
               </a:graphicData>
@@ -7065,8 +7059,8 @@
           <w:szCs w:val="24"/>
         </w:rPr>
       </w:pPr>
-      <w:bookmarkStart w:id="65" w:name="_Toc222587629"/>
-      <w:bookmarkStart w:id="66" w:name="_Toc229035110"/>
+      <w:bookmarkStart w:id="64" w:name="_Toc222587629"/>
+      <w:bookmarkStart w:id="65" w:name="_Toc229035110"/>
       <w:r>
         <w:rPr>
           <w:i w:val="0"/>
@@ -7132,26 +7126,26 @@
         </w:rPr>
         <w:t>: Use case diagram</w:t>
       </w:r>
+      <w:bookmarkEnd w:id="64"/>
       <w:bookmarkEnd w:id="65"/>
+    </w:p>
+    <w:p>
+      <w:r>
+        <w:t>The include relationships show mandatory sub-processes such as user validation during login, checking item availability when viewing the menu or placing orders, and payment processing as part of order placement. These are essential steps that must always occur within the main use cases. The extend relationships represent optional or conditional functionalities, where tracking order status and viewing order history extend from the main “Place Order” use case, depending on user actions after placing an order. Overall, this enhanced diagram provides a more realistic and structured representation of system behavior, improving clarity of shared and optional processes within the system</w:t>
+      </w:r>
+      <w:r>
+        <w:t>.</w:t>
+      </w:r>
+    </w:p>
+    <w:p>
+      <w:pPr>
+        <w:pStyle w:val="Heading3"/>
+      </w:pPr>
+      <w:bookmarkStart w:id="66" w:name="_heading=h.1w3nix1yeett" w:colFirst="0" w:colLast="0"/>
+      <w:bookmarkStart w:id="67" w:name="_heading=h.pkgmwy1kfuz6" w:colFirst="0" w:colLast="0"/>
+      <w:bookmarkStart w:id="68" w:name="_Toc231489982"/>
       <w:bookmarkEnd w:id="66"/>
-    </w:p>
-    <w:p>
-      <w:r>
-        <w:t>The include relationships show mandatory sub-processes such as user validation during login, checking item availability when viewing the menu or placing orders, and payment processing as part of order placement. These are essential steps that must always occur within the main use cases. The extend relationships represent optional or conditional functionalities, where tracking order status and viewing order history extend from the main “Place Order” use case, depending on user actions after placing an order. Overall, this enhanced diagram provides a more realistic and structured representation of system behavior, improving clarity of shared and optional processes within the system</w:t>
-      </w:r>
-      <w:r>
-        <w:t>.</w:t>
-      </w:r>
-    </w:p>
-    <w:p>
-      <w:pPr>
-        <w:pStyle w:val="Heading3"/>
-      </w:pPr>
-      <w:bookmarkStart w:id="67" w:name="_heading=h.1w3nix1yeett" w:colFirst="0" w:colLast="0"/>
-      <w:bookmarkStart w:id="68" w:name="_heading=h.pkgmwy1kfuz6" w:colFirst="0" w:colLast="0"/>
-      <w:bookmarkStart w:id="69" w:name="_Toc231489982"/>
       <w:bookmarkEnd w:id="67"/>
-      <w:bookmarkEnd w:id="68"/>
       <w:proofErr w:type="gramStart"/>
       <w:r>
         <w:lastRenderedPageBreak/>
@@ -7167,14 +7161,14 @@
       <w:r>
         <w:t xml:space="preserve"> diagrams</w:t>
       </w:r>
-      <w:bookmarkStart w:id="70" w:name="_heading=h.1cm8n45yh4wo" w:colFirst="0" w:colLast="0"/>
-      <w:bookmarkStart w:id="71" w:name="_heading=h.ad4in7mq08rn" w:colFirst="0" w:colLast="0"/>
-      <w:bookmarkStart w:id="72" w:name="_heading=h.yinvzixge54v" w:colFirst="0" w:colLast="0"/>
-      <w:bookmarkStart w:id="73" w:name="_Toc218671479"/>
+      <w:bookmarkStart w:id="69" w:name="_heading=h.1cm8n45yh4wo" w:colFirst="0" w:colLast="0"/>
+      <w:bookmarkStart w:id="70" w:name="_heading=h.ad4in7mq08rn" w:colFirst="0" w:colLast="0"/>
+      <w:bookmarkStart w:id="71" w:name="_heading=h.yinvzixge54v" w:colFirst="0" w:colLast="0"/>
+      <w:bookmarkStart w:id="72" w:name="_Toc218671479"/>
+      <w:bookmarkEnd w:id="68"/>
       <w:bookmarkEnd w:id="69"/>
       <w:bookmarkEnd w:id="70"/>
       <w:bookmarkEnd w:id="71"/>
-      <w:bookmarkEnd w:id="72"/>
     </w:p>
     <w:p>
       <w:pPr>
@@ -7254,8 +7248,8 @@
           <w:szCs w:val="24"/>
         </w:rPr>
       </w:pPr>
-      <w:bookmarkStart w:id="74" w:name="_Toc222587630"/>
-      <w:bookmarkStart w:id="75" w:name="_Toc229035111"/>
+      <w:bookmarkStart w:id="73" w:name="_Toc222587630"/>
+      <w:bookmarkStart w:id="74" w:name="_Toc229035111"/>
       <w:r>
         <w:rPr>
           <w:i w:val="0"/>
@@ -7321,8 +7315,8 @@
         </w:rPr>
         <w:t>: Sequence diagram</w:t>
       </w:r>
+      <w:bookmarkEnd w:id="73"/>
       <w:bookmarkEnd w:id="74"/>
-      <w:bookmarkEnd w:id="75"/>
     </w:p>
     <w:p>
       <w:r>
@@ -7340,9 +7334,9 @@
           <w:lang w:val="en-US"/>
         </w:rPr>
       </w:pPr>
-      <w:bookmarkStart w:id="76" w:name="_Toc218671490"/>
-      <w:bookmarkStart w:id="77" w:name="_Toc231489983"/>
-      <w:bookmarkEnd w:id="73"/>
+      <w:bookmarkStart w:id="75" w:name="_Toc218671490"/>
+      <w:bookmarkStart w:id="76" w:name="_Toc231489983"/>
+      <w:bookmarkEnd w:id="72"/>
       <w:r>
         <w:rPr>
           <w:lang w:val="en-US"/>
@@ -7361,8 +7355,8 @@
         </w:rPr>
         <w:t xml:space="preserve"> Diagram</w:t>
       </w:r>
+      <w:bookmarkEnd w:id="75"/>
       <w:bookmarkEnd w:id="76"/>
-      <w:bookmarkEnd w:id="77"/>
     </w:p>
     <w:p>
       <w:pPr>
@@ -7442,8 +7436,8 @@
           <w:szCs w:val="24"/>
         </w:rPr>
       </w:pPr>
-      <w:bookmarkStart w:id="78" w:name="_Toc222587631"/>
-      <w:bookmarkStart w:id="79" w:name="_Toc229035112"/>
+      <w:bookmarkStart w:id="77" w:name="_Toc222587631"/>
+      <w:bookmarkStart w:id="78" w:name="_Toc229035112"/>
       <w:r>
         <w:rPr>
           <w:i w:val="0"/>
@@ -7509,7 +7503,7 @@
         </w:rPr>
         <w:t xml:space="preserve">: </w:t>
       </w:r>
-      <w:bookmarkEnd w:id="78"/>
+      <w:bookmarkEnd w:id="77"/>
       <w:r>
         <w:rPr>
           <w:i w:val="0"/>
@@ -7519,7 +7513,7 @@
         </w:rPr>
         <w:t>Class Diagram</w:t>
       </w:r>
-      <w:bookmarkEnd w:id="79"/>
+      <w:bookmarkEnd w:id="78"/>
     </w:p>
     <w:p>
       <w:pPr>
@@ -7567,7 +7561,7 @@
           <w:szCs w:val="28"/>
         </w:rPr>
       </w:pPr>
-      <w:bookmarkStart w:id="80" w:name="_Toc231489984"/>
+      <w:bookmarkStart w:id="79" w:name="_Toc231489984"/>
       <w:r>
         <w:rPr>
           <w:rFonts w:hint="eastAsia"/>
@@ -7575,7 +7569,7 @@
         <w:lastRenderedPageBreak/>
         <w:t>References</w:t>
       </w:r>
-      <w:bookmarkEnd w:id="80"/>
+      <w:bookmarkEnd w:id="79"/>
     </w:p>
     <w:p>
       <w:pPr>
@@ -7680,7 +7674,7 @@
 </file>
 
 <file path=word/endnotes.xml><?xml version="1.0" encoding="utf-8"?>
-<w:endnotes xmlns:wpc="http://schemas.microsoft.com/office/word/2010/wordprocessingCanvas" xmlns:mc="http://schemas.openxmlformats.org/markup-compatibility/2006" xmlns:o="urn:schemas-microsoft-com:office:office" xmlns:r="http://schemas.openxmlformats.org/officeDocument/2006/relationships" xmlns:m="http://schemas.openxmlformats.org/officeDocument/2006/math" xmlns:v="urn:schemas-microsoft-com:vml" xmlns:wp14="http://schemas.microsoft.com/office/word/2010/wordprocessingDrawing" xmlns:wp="http://schemas.openxmlformats.org/drawingml/2006/wordprocessingDrawing" xmlns:w10="urn:schemas-microsoft-com:office:word" xmlns:w="http://schemas.openxmlformats.org/wordprocessingml/2006/main" xmlns:w14="http://schemas.microsoft.com/office/word/2010/wordml" xmlns:w15="http://schemas.microsoft.com/office/word/2012/wordml" xmlns:wpg="http://schemas.microsoft.com/office/word/2010/wordprocessingGroup" xmlns:wpi="http://schemas.microsoft.com/office/word/2010/wordprocessingInk" xmlns:wne="http://schemas.microsoft.com/office/word/2006/wordml" xmlns:wps="http://schemas.microsoft.com/office/word/2010/wordprocessingShape" mc:Ignorable="w14 w15 wp14">
+<w:endnotes xmlns:wpc="http://schemas.microsoft.com/office/word/2010/wordprocessingCanvas" xmlns:cx="http://schemas.microsoft.com/office/drawing/2014/chartex" xmlns:cx1="http://schemas.microsoft.com/office/drawing/2015/9/8/chartex" xmlns:cx2="http://schemas.microsoft.com/office/drawing/2015/10/21/chartex" xmlns:cx3="http://schemas.microsoft.com/office/drawing/2016/5/9/chartex" xmlns:cx4="http://schemas.microsoft.com/office/drawing/2016/5/10/chartex" xmlns:cx5="http://schemas.microsoft.com/office/drawing/2016/5/11/chartex" xmlns:cx6="http://schemas.microsoft.com/office/drawing/2016/5/12/chartex" xmlns:cx7="http://schemas.microsoft.com/office/drawing/2016/5/13/chartex" xmlns:cx8="http://schemas.microsoft.com/office/drawing/2016/5/14/chartex" xmlns:mc="http://schemas.openxmlformats.org/markup-compatibility/2006" xmlns:aink="http://schemas.microsoft.com/office/drawing/2016/ink" xmlns:am3d="http://schemas.microsoft.com/office/drawing/2017/model3d" xmlns:o="urn:schemas-microsoft-com:office:office" xmlns:oel="http://schemas.microsoft.com/office/2019/extlst" xmlns:r="http://schemas.openxmlformats.org/officeDocument/2006/relationships" xmlns:m="http://schemas.openxmlformats.org/officeDocument/2006/math" xmlns:v="urn:schemas-microsoft-com:vml" xmlns:wp14="http://schemas.microsoft.com/office/word/2010/wordprocessingDrawing" xmlns:wp="http://schemas.openxmlformats.org/drawingml/2006/wordprocessingDrawing" xmlns:w10="urn:schemas-microsoft-com:office:word" xmlns:w="http://schemas.openxmlformats.org/wordprocessingml/2006/main" xmlns:w14="http://schemas.microsoft.com/office/word/2010/wordml" xmlns:w15="http://schemas.microsoft.com/office/word/2012/wordml" xmlns:w16cex="http://schemas.microsoft.com/office/word/2018/wordml/cex" xmlns:w16cid="http://schemas.microsoft.com/office/word/2016/wordml/cid" xmlns:w16="http://schemas.microsoft.com/office/word/2018/wordml" xmlns:w16du="http://schemas.microsoft.com/office/word/2023/wordml/word16du" xmlns:w16sdtdh="http://schemas.microsoft.com/office/word/2020/wordml/sdtdatahash" xmlns:w16sdtfl="http://schemas.microsoft.com/office/word/2024/wordml/sdtformatlock" xmlns:w16se="http://schemas.microsoft.com/office/word/2015/wordml/symex" xmlns:wpg="http://schemas.microsoft.com/office/word/2010/wordprocessingGroup" xmlns:wpi="http://schemas.microsoft.com/office/word/2010/wordprocessingInk" xmlns:wne="http://schemas.microsoft.com/office/word/2006/wordml" xmlns:wps="http://schemas.microsoft.com/office/word/2010/wordprocessingShape" mc:Ignorable="w14 w15 w16se w16cid w16 w16cex w16sdtdh w16sdtfl w16du wp14">
   <w:endnote w:type="separator" w:id="-1">
     <w:p>
       <w:pPr>
@@ -7705,7 +7699,7 @@
 </file>
 
 <file path=word/footer1.xml><?xml version="1.0" encoding="utf-8"?>
-<w:ftr xmlns:wpc="http://schemas.microsoft.com/office/word/2010/wordprocessingCanvas" xmlns:mc="http://schemas.openxmlformats.org/markup-compatibility/2006" xmlns:o="urn:schemas-microsoft-com:office:office" xmlns:r="http://schemas.openxmlformats.org/officeDocument/2006/relationships" xmlns:m="http://schemas.openxmlformats.org/officeDocument/2006/math" xmlns:v="urn:schemas-microsoft-com:vml" xmlns:wp14="http://schemas.microsoft.com/office/word/2010/wordprocessingDrawing" xmlns:wp="http://schemas.openxmlformats.org/drawingml/2006/wordprocessingDrawing" xmlns:w10="urn:schemas-microsoft-com:office:word" xmlns:w="http://schemas.openxmlformats.org/wordprocessingml/2006/main" xmlns:w14="http://schemas.microsoft.com/office/word/2010/wordml" xmlns:w15="http://schemas.microsoft.com/office/word/2012/wordml" xmlns:wpg="http://schemas.microsoft.com/office/word/2010/wordprocessingGroup" xmlns:wpi="http://schemas.microsoft.com/office/word/2010/wordprocessingInk" xmlns:wne="http://schemas.microsoft.com/office/word/2006/wordml" xmlns:wps="http://schemas.microsoft.com/office/word/2010/wordprocessingShape" mc:Ignorable="w14 w15 wp14">
+<w:ftr xmlns:wpc="http://schemas.microsoft.com/office/word/2010/wordprocessingCanvas" xmlns:cx="http://schemas.microsoft.com/office/drawing/2014/chartex" xmlns:cx1="http://schemas.microsoft.com/office/drawing/2015/9/8/chartex" xmlns:cx2="http://schemas.microsoft.com/office/drawing/2015/10/21/chartex" xmlns:cx3="http://schemas.microsoft.com/office/drawing/2016/5/9/chartex" xmlns:cx4="http://schemas.microsoft.com/office/drawing/2016/5/10/chartex" xmlns:cx5="http://schemas.microsoft.com/office/drawing/2016/5/11/chartex" xmlns:cx6="http://schemas.microsoft.com/office/drawing/2016/5/12/chartex" xmlns:cx7="http://schemas.microsoft.com/office/drawing/2016/5/13/chartex" xmlns:cx8="http://schemas.microsoft.com/office/drawing/2016/5/14/chartex" xmlns:mc="http://schemas.openxmlformats.org/markup-compatibility/2006" xmlns:aink="http://schemas.microsoft.com/office/drawing/2016/ink" xmlns:am3d="http://schemas.microsoft.com/office/drawing/2017/model3d" xmlns:o="urn:schemas-microsoft-com:office:office" xmlns:oel="http://schemas.microsoft.com/office/2019/extlst" xmlns:r="http://schemas.openxmlformats.org/officeDocument/2006/relationships" xmlns:m="http://schemas.openxmlformats.org/officeDocument/2006/math" xmlns:v="urn:schemas-microsoft-com:vml" xmlns:wp14="http://schemas.microsoft.com/office/word/2010/wordprocessingDrawing" xmlns:wp="http://schemas.openxmlformats.org/drawingml/2006/wordprocessingDrawing" xmlns:w10="urn:schemas-microsoft-com:office:word" xmlns:w="http://schemas.openxmlformats.org/wordprocessingml/2006/main" xmlns:w14="http://schemas.microsoft.com/office/word/2010/wordml" xmlns:w15="http://schemas.microsoft.com/office/word/2012/wordml" xmlns:w16cex="http://schemas.microsoft.com/office/word/2018/wordml/cex" xmlns:w16cid="http://schemas.microsoft.com/office/word/2016/wordml/cid" xmlns:w16="http://schemas.microsoft.com/office/word/2018/wordml" xmlns:w16du="http://schemas.microsoft.com/office/word/2023/wordml/word16du" xmlns:w16sdtdh="http://schemas.microsoft.com/office/word/2020/wordml/sdtdatahash" xmlns:w16sdtfl="http://schemas.microsoft.com/office/word/2024/wordml/sdtformatlock" xmlns:w16se="http://schemas.microsoft.com/office/word/2015/wordml/symex" xmlns:wpg="http://schemas.microsoft.com/office/word/2010/wordprocessingGroup" xmlns:wpi="http://schemas.microsoft.com/office/word/2010/wordprocessingInk" xmlns:wne="http://schemas.microsoft.com/office/word/2006/wordml" xmlns:wps="http://schemas.microsoft.com/office/word/2010/wordprocessingShape" mc:Ignorable="w14 w15 w16se w16cid w16 w16cex w16sdtdh w16sdtfl w16du wp14">
   <w:sdt>
     <w:sdtPr>
       <w:rPr>
@@ -7803,7 +7797,7 @@
 </file>
 
 <file path=word/footer2.xml><?xml version="1.0" encoding="utf-8"?>
-<w:ftr xmlns:wpc="http://schemas.microsoft.com/office/word/2010/wordprocessingCanvas" xmlns:mc="http://schemas.openxmlformats.org/markup-compatibility/2006" xmlns:o="urn:schemas-microsoft-com:office:office" xmlns:r="http://schemas.openxmlformats.org/officeDocument/2006/relationships" xmlns:m="http://schemas.openxmlformats.org/officeDocument/2006/math" xmlns:v="urn:schemas-microsoft-com:vml" xmlns:wp14="http://schemas.microsoft.com/office/word/2010/wordprocessingDrawing" xmlns:wp="http://schemas.openxmlformats.org/drawingml/2006/wordprocessingDrawing" xmlns:w10="urn:schemas-microsoft-com:office:word" xmlns:w="http://schemas.openxmlformats.org/wordprocessingml/2006/main" xmlns:w14="http://schemas.microsoft.com/office/word/2010/wordml" xmlns:w15="http://schemas.microsoft.com/office/word/2012/wordml" xmlns:wpg="http://schemas.microsoft.com/office/word/2010/wordprocessingGroup" xmlns:wpi="http://schemas.microsoft.com/office/word/2010/wordprocessingInk" xmlns:wne="http://schemas.microsoft.com/office/word/2006/wordml" xmlns:wps="http://schemas.microsoft.com/office/word/2010/wordprocessingShape" mc:Ignorable="w14 w15 wp14">
+<w:ftr xmlns:wpc="http://schemas.microsoft.com/office/word/2010/wordprocessingCanvas" xmlns:cx="http://schemas.microsoft.com/office/drawing/2014/chartex" xmlns:cx1="http://schemas.microsoft.com/office/drawing/2015/9/8/chartex" xmlns:cx2="http://schemas.microsoft.com/office/drawing/2015/10/21/chartex" xmlns:cx3="http://schemas.microsoft.com/office/drawing/2016/5/9/chartex" xmlns:cx4="http://schemas.microsoft.com/office/drawing/2016/5/10/chartex" xmlns:cx5="http://schemas.microsoft.com/office/drawing/2016/5/11/chartex" xmlns:cx6="http://schemas.microsoft.com/office/drawing/2016/5/12/chartex" xmlns:cx7="http://schemas.microsoft.com/office/drawing/2016/5/13/chartex" xmlns:cx8="http://schemas.microsoft.com/office/drawing/2016/5/14/chartex" xmlns:mc="http://schemas.openxmlformats.org/markup-compatibility/2006" xmlns:aink="http://schemas.microsoft.com/office/drawing/2016/ink" xmlns:am3d="http://schemas.microsoft.com/office/drawing/2017/model3d" xmlns:o="urn:schemas-microsoft-com:office:office" xmlns:oel="http://schemas.microsoft.com/office/2019/extlst" xmlns:r="http://schemas.openxmlformats.org/officeDocument/2006/relationships" xmlns:m="http://schemas.openxmlformats.org/officeDocument/2006/math" xmlns:v="urn:schemas-microsoft-com:vml" xmlns:wp14="http://schemas.microsoft.com/office/word/2010/wordprocessingDrawing" xmlns:wp="http://schemas.openxmlformats.org/drawingml/2006/wordprocessingDrawing" xmlns:w10="urn:schemas-microsoft-com:office:word" xmlns:w="http://schemas.openxmlformats.org/wordprocessingml/2006/main" xmlns:w14="http://schemas.microsoft.com/office/word/2010/wordml" xmlns:w15="http://schemas.microsoft.com/office/word/2012/wordml" xmlns:w16cex="http://schemas.microsoft.com/office/word/2018/wordml/cex" xmlns:w16cid="http://schemas.microsoft.com/office/word/2016/wordml/cid" xmlns:w16="http://schemas.microsoft.com/office/word/2018/wordml" xmlns:w16du="http://schemas.microsoft.com/office/word/2023/wordml/word16du" xmlns:w16sdtdh="http://schemas.microsoft.com/office/word/2020/wordml/sdtdatahash" xmlns:w16sdtfl="http://schemas.microsoft.com/office/word/2024/wordml/sdtformatlock" xmlns:w16se="http://schemas.microsoft.com/office/word/2015/wordml/symex" xmlns:wpg="http://schemas.microsoft.com/office/word/2010/wordprocessingGroup" xmlns:wpi="http://schemas.microsoft.com/office/word/2010/wordprocessingInk" xmlns:wne="http://schemas.microsoft.com/office/word/2006/wordml" xmlns:wps="http://schemas.microsoft.com/office/word/2010/wordprocessingShape" mc:Ignorable="w14 w15 w16se w16cid w16 w16cex w16sdtdh w16sdtfl w16du wp14">
   <w:p>
     <w:pPr>
       <w:pBdr>
@@ -7878,7 +7872,7 @@
 </file>
 
 <file path=word/footnotes.xml><?xml version="1.0" encoding="utf-8"?>
-<w:footnotes xmlns:wpc="http://schemas.microsoft.com/office/word/2010/wordprocessingCanvas" xmlns:mc="http://schemas.openxmlformats.org/markup-compatibility/2006" xmlns:o="urn:schemas-microsoft-com:office:office" xmlns:r="http://schemas.openxmlformats.org/officeDocument/2006/relationships" xmlns:m="http://schemas.openxmlformats.org/officeDocument/2006/math" xmlns:v="urn:schemas-microsoft-com:vml" xmlns:wp14="http://schemas.microsoft.com/office/word/2010/wordprocessingDrawing" xmlns:wp="http://schemas.openxmlformats.org/drawingml/2006/wordprocessingDrawing" xmlns:w10="urn:schemas-microsoft-com:office:word" xmlns:w="http://schemas.openxmlformats.org/wordprocessingml/2006/main" xmlns:w14="http://schemas.microsoft.com/office/word/2010/wordml" xmlns:w15="http://schemas.microsoft.com/office/word/2012/wordml" xmlns:wpg="http://schemas.microsoft.com/office/word/2010/wordprocessingGroup" xmlns:wpi="http://schemas.microsoft.com/office/word/2010/wordprocessingInk" xmlns:wne="http://schemas.microsoft.com/office/word/2006/wordml" xmlns:wps="http://schemas.microsoft.com/office/word/2010/wordprocessingShape" mc:Ignorable="w14 w15 wp14">
+<w:footnotes xmlns:wpc="http://schemas.microsoft.com/office/word/2010/wordprocessingCanvas" xmlns:cx="http://schemas.microsoft.com/office/drawing/2014/chartex" xmlns:cx1="http://schemas.microsoft.com/office/drawing/2015/9/8/chartex" xmlns:cx2="http://schemas.microsoft.com/office/drawing/2015/10/21/chartex" xmlns:cx3="http://schemas.microsoft.com/office/drawing/2016/5/9/chartex" xmlns:cx4="http://schemas.microsoft.com/office/drawing/2016/5/10/chartex" xmlns:cx5="http://schemas.microsoft.com/office/drawing/2016/5/11/chartex" xmlns:cx6="http://schemas.microsoft.com/office/drawing/2016/5/12/chartex" xmlns:cx7="http://schemas.microsoft.com/office/drawing/2016/5/13/chartex" xmlns:cx8="http://schemas.microsoft.com/office/drawing/2016/5/14/chartex" xmlns:mc="http://schemas.openxmlformats.org/markup-compatibility/2006" xmlns:aink="http://schemas.microsoft.com/office/drawing/2016/ink" xmlns:am3d="http://schemas.microsoft.com/office/drawing/2017/model3d" xmlns:o="urn:schemas-microsoft-com:office:office" xmlns:oel="http://schemas.microsoft.com/office/2019/extlst" xmlns:r="http://schemas.openxmlformats.org/officeDocument/2006/relationships" xmlns:m="http://schemas.openxmlformats.org/officeDocument/2006/math" xmlns:v="urn:schemas-microsoft-com:vml" xmlns:wp14="http://schemas.microsoft.com/office/word/2010/wordprocessingDrawing" xmlns:wp="http://schemas.openxmlformats.org/drawingml/2006/wordprocessingDrawing" xmlns:w10="urn:schemas-microsoft-com:office:word" xmlns:w="http://schemas.openxmlformats.org/wordprocessingml/2006/main" xmlns:w14="http://schemas.microsoft.com/office/word/2010/wordml" xmlns:w15="http://schemas.microsoft.com/office/word/2012/wordml" xmlns:w16cex="http://schemas.microsoft.com/office/word/2018/wordml/cex" xmlns:w16cid="http://schemas.microsoft.com/office/word/2016/wordml/cid" xmlns:w16="http://schemas.microsoft.com/office/word/2018/wordml" xmlns:w16du="http://schemas.microsoft.com/office/word/2023/wordml/word16du" xmlns:w16sdtdh="http://schemas.microsoft.com/office/word/2020/wordml/sdtdatahash" xmlns:w16sdtfl="http://schemas.microsoft.com/office/word/2024/wordml/sdtformatlock" xmlns:w16se="http://schemas.microsoft.com/office/word/2015/wordml/symex" xmlns:wpg="http://schemas.microsoft.com/office/word/2010/wordprocessingGroup" xmlns:wpi="http://schemas.microsoft.com/office/word/2010/wordprocessingInk" xmlns:wne="http://schemas.microsoft.com/office/word/2006/wordml" xmlns:wps="http://schemas.microsoft.com/office/word/2010/wordprocessingShape" mc:Ignorable="w14 w15 w16se w16cid w16 w16cex w16sdtdh w16sdtfl w16du wp14">
   <w:footnote w:type="separator" w:id="-1">
     <w:p>
       <w:pPr>
@@ -7903,7 +7897,7 @@
 </file>
 
 <file path=word/header1.xml><?xml version="1.0" encoding="utf-8"?>
-<w:hdr xmlns:wpc="http://schemas.microsoft.com/office/word/2010/wordprocessingCanvas" xmlns:mc="http://schemas.openxmlformats.org/markup-compatibility/2006" xmlns:o="urn:schemas-microsoft-com:office:office" xmlns:r="http://schemas.openxmlformats.org/officeDocument/2006/relationships" xmlns:m="http://schemas.openxmlformats.org/officeDocument/2006/math" xmlns:v="urn:schemas-microsoft-com:vml" xmlns:wp14="http://schemas.microsoft.com/office/word/2010/wordprocessingDrawing" xmlns:wp="http://schemas.openxmlformats.org/drawingml/2006/wordprocessingDrawing" xmlns:w10="urn:schemas-microsoft-com:office:word" xmlns:w="http://schemas.openxmlformats.org/wordprocessingml/2006/main" xmlns:w14="http://schemas.microsoft.com/office/word/2010/wordml" xmlns:w15="http://schemas.microsoft.com/office/word/2012/wordml" xmlns:wpg="http://schemas.microsoft.com/office/word/2010/wordprocessingGroup" xmlns:wpi="http://schemas.microsoft.com/office/word/2010/wordprocessingInk" xmlns:wne="http://schemas.microsoft.com/office/word/2006/wordml" xmlns:wps="http://schemas.microsoft.com/office/word/2010/wordprocessingShape" mc:Ignorable="w14 w15 wp14">
+<w:hdr xmlns:wpc="http://schemas.microsoft.com/office/word/2010/wordprocessingCanvas" xmlns:cx="http://schemas.microsoft.com/office/drawing/2014/chartex" xmlns:cx1="http://schemas.microsoft.com/office/drawing/2015/9/8/chartex" xmlns:cx2="http://schemas.microsoft.com/office/drawing/2015/10/21/chartex" xmlns:cx3="http://schemas.microsoft.com/office/drawing/2016/5/9/chartex" xmlns:cx4="http://schemas.microsoft.com/office/drawing/2016/5/10/chartex" xmlns:cx5="http://schemas.microsoft.com/office/drawing/2016/5/11/chartex" xmlns:cx6="http://schemas.microsoft.com/office/drawing/2016/5/12/chartex" xmlns:cx7="http://schemas.microsoft.com/office/drawing/2016/5/13/chartex" xmlns:cx8="http://schemas.microsoft.com/office/drawing/2016/5/14/chartex" xmlns:mc="http://schemas.openxmlformats.org/markup-compatibility/2006" xmlns:aink="http://schemas.microsoft.com/office/drawing/2016/ink" xmlns:am3d="http://schemas.microsoft.com/office/drawing/2017/model3d" xmlns:o="urn:schemas-microsoft-com:office:office" xmlns:oel="http://schemas.microsoft.com/office/2019/extlst" xmlns:r="http://schemas.openxmlformats.org/officeDocument/2006/relationships" xmlns:m="http://schemas.openxmlformats.org/officeDocument/2006/math" xmlns:v="urn:schemas-microsoft-com:vml" xmlns:wp14="http://schemas.microsoft.com/office/word/2010/wordprocessingDrawing" xmlns:wp="http://schemas.openxmlformats.org/drawingml/2006/wordprocessingDrawing" xmlns:w10="urn:schemas-microsoft-com:office:word" xmlns:w="http://schemas.openxmlformats.org/wordprocessingml/2006/main" xmlns:w14="http://schemas.microsoft.com/office/word/2010/wordml" xmlns:w15="http://schemas.microsoft.com/office/word/2012/wordml" xmlns:w16cex="http://schemas.microsoft.com/office/word/2018/wordml/cex" xmlns:w16cid="http://schemas.microsoft.com/office/word/2016/wordml/cid" xmlns:w16="http://schemas.microsoft.com/office/word/2018/wordml" xmlns:w16du="http://schemas.microsoft.com/office/word/2023/wordml/word16du" xmlns:w16sdtdh="http://schemas.microsoft.com/office/word/2020/wordml/sdtdatahash" xmlns:w16sdtfl="http://schemas.microsoft.com/office/word/2024/wordml/sdtformatlock" xmlns:w16se="http://schemas.microsoft.com/office/word/2015/wordml/symex" xmlns:wpg="http://schemas.microsoft.com/office/word/2010/wordprocessingGroup" xmlns:wpi="http://schemas.microsoft.com/office/word/2010/wordprocessingInk" xmlns:wne="http://schemas.microsoft.com/office/word/2006/wordml" xmlns:wps="http://schemas.microsoft.com/office/word/2010/wordprocessingShape" mc:Ignorable="w14 w15 w16se w16cid w16 w16cex w16sdtdh w16sdtfl w16du wp14">
   <w:p>
     <w:pPr>
       <w:pBdr>
@@ -7927,7 +7921,7 @@
 </file>
 
 <file path=word/header2.xml><?xml version="1.0" encoding="utf-8"?>
-<w:hdr xmlns:wpc="http://schemas.microsoft.com/office/word/2010/wordprocessingCanvas" xmlns:mc="http://schemas.openxmlformats.org/markup-compatibility/2006" xmlns:o="urn:schemas-microsoft-com:office:office" xmlns:r="http://schemas.openxmlformats.org/officeDocument/2006/relationships" xmlns:m="http://schemas.openxmlformats.org/officeDocument/2006/math" xmlns:v="urn:schemas-microsoft-com:vml" xmlns:wp14="http://schemas.microsoft.com/office/word/2010/wordprocessingDrawing" xmlns:wp="http://schemas.openxmlformats.org/drawingml/2006/wordprocessingDrawing" xmlns:w10="urn:schemas-microsoft-com:office:word" xmlns:w="http://schemas.openxmlformats.org/wordprocessingml/2006/main" xmlns:w14="http://schemas.microsoft.com/office/word/2010/wordml" xmlns:w15="http://schemas.microsoft.com/office/word/2012/wordml" xmlns:wpg="http://schemas.microsoft.com/office/word/2010/wordprocessingGroup" xmlns:wpi="http://schemas.microsoft.com/office/word/2010/wordprocessingInk" xmlns:wne="http://schemas.microsoft.com/office/word/2006/wordml" xmlns:wps="http://schemas.microsoft.com/office/word/2010/wordprocessingShape" mc:Ignorable="w14 w15 wp14">
+<w:hdr xmlns:wpc="http://schemas.microsoft.com/office/word/2010/wordprocessingCanvas" xmlns:cx="http://schemas.microsoft.com/office/drawing/2014/chartex" xmlns:cx1="http://schemas.microsoft.com/office/drawing/2015/9/8/chartex" xmlns:cx2="http://schemas.microsoft.com/office/drawing/2015/10/21/chartex" xmlns:cx3="http://schemas.microsoft.com/office/drawing/2016/5/9/chartex" xmlns:cx4="http://schemas.microsoft.com/office/drawing/2016/5/10/chartex" xmlns:cx5="http://schemas.microsoft.com/office/drawing/2016/5/11/chartex" xmlns:cx6="http://schemas.microsoft.com/office/drawing/2016/5/12/chartex" xmlns:cx7="http://schemas.microsoft.com/office/drawing/2016/5/13/chartex" xmlns:cx8="http://schemas.microsoft.com/office/drawing/2016/5/14/chartex" xmlns:mc="http://schemas.openxmlformats.org/markup-compatibility/2006" xmlns:aink="http://schemas.microsoft.com/office/drawing/2016/ink" xmlns:am3d="http://schemas.microsoft.com/office/drawing/2017/model3d" xmlns:o="urn:schemas-microsoft-com:office:office" xmlns:oel="http://schemas.microsoft.com/office/2019/extlst" xmlns:r="http://schemas.openxmlformats.org/officeDocument/2006/relationships" xmlns:m="http://schemas.openxmlformats.org/officeDocument/2006/math" xmlns:v="urn:schemas-microsoft-com:vml" xmlns:wp14="http://schemas.microsoft.com/office/word/2010/wordprocessingDrawing" xmlns:wp="http://schemas.openxmlformats.org/drawingml/2006/wordprocessingDrawing" xmlns:w10="urn:schemas-microsoft-com:office:word" xmlns:w="http://schemas.openxmlformats.org/wordprocessingml/2006/main" xmlns:w14="http://schemas.microsoft.com/office/word/2010/wordml" xmlns:w15="http://schemas.microsoft.com/office/word/2012/wordml" xmlns:w16cex="http://schemas.microsoft.com/office/word/2018/wordml/cex" xmlns:w16cid="http://schemas.microsoft.com/office/word/2016/wordml/cid" xmlns:w16="http://schemas.microsoft.com/office/word/2018/wordml" xmlns:w16du="http://schemas.microsoft.com/office/word/2023/wordml/word16du" xmlns:w16sdtdh="http://schemas.microsoft.com/office/word/2020/wordml/sdtdatahash" xmlns:w16sdtfl="http://schemas.microsoft.com/office/word/2024/wordml/sdtformatlock" xmlns:w16se="http://schemas.microsoft.com/office/word/2015/wordml/symex" xmlns:wpg="http://schemas.microsoft.com/office/word/2010/wordprocessingGroup" xmlns:wpi="http://schemas.microsoft.com/office/word/2010/wordprocessingInk" xmlns:wne="http://schemas.microsoft.com/office/word/2006/wordml" xmlns:wps="http://schemas.microsoft.com/office/word/2010/wordprocessingShape" mc:Ignorable="w14 w15 w16se w16cid w16 w16cex w16sdtdh w16sdtfl w16du wp14">
   <w:p>
     <w:pPr>
       <w:pBdr>
@@ -7951,7 +7945,7 @@
 </file>
 
 <file path=word/numbering.xml><?xml version="1.0" encoding="utf-8"?>
-<w:numbering xmlns:wpc="http://schemas.microsoft.com/office/word/2010/wordprocessingCanvas" xmlns:mc="http://schemas.openxmlformats.org/markup-compatibility/2006" xmlns:o="urn:schemas-microsoft-com:office:office" xmlns:r="http://schemas.openxmlformats.org/officeDocument/2006/relationships" xmlns:m="http://schemas.openxmlformats.org/officeDocument/2006/math" xmlns:v="urn:schemas-microsoft-com:vml" xmlns:wp14="http://schemas.microsoft.com/office/word/2010/wordprocessingDrawing" xmlns:wp="http://schemas.openxmlformats.org/drawingml/2006/wordprocessingDrawing" xmlns:w10="urn:schemas-microsoft-com:office:word" xmlns:w="http://schemas.openxmlformats.org/wordprocessingml/2006/main" xmlns:w14="http://schemas.microsoft.com/office/word/2010/wordml" xmlns:w15="http://schemas.microsoft.com/office/word/2012/wordml" xmlns:wpg="http://schemas.microsoft.com/office/word/2010/wordprocessingGroup" xmlns:wpi="http://schemas.microsoft.com/office/word/2010/wordprocessingInk" xmlns:wne="http://schemas.microsoft.com/office/word/2006/wordml" xmlns:wps="http://schemas.microsoft.com/office/word/2010/wordprocessingShape" mc:Ignorable="w14 w15 wp14">
+<w:numbering xmlns:wpc="http://schemas.microsoft.com/office/word/2010/wordprocessingCanvas" xmlns:cx="http://schemas.microsoft.com/office/drawing/2014/chartex" xmlns:cx1="http://schemas.microsoft.com/office/drawing/2015/9/8/chartex" xmlns:cx2="http://schemas.microsoft.com/office/drawing/2015/10/21/chartex" xmlns:cx3="http://schemas.microsoft.com/office/drawing/2016/5/9/chartex" xmlns:cx4="http://schemas.microsoft.com/office/drawing/2016/5/10/chartex" xmlns:cx5="http://schemas.microsoft.com/office/drawing/2016/5/11/chartex" xmlns:cx6="http://schemas.microsoft.com/office/drawing/2016/5/12/chartex" xmlns:cx7="http://schemas.microsoft.com/office/drawing/2016/5/13/chartex" xmlns:cx8="http://schemas.microsoft.com/office/drawing/2016/5/14/chartex" xmlns:mc="http://schemas.openxmlformats.org/markup-compatibility/2006" xmlns:aink="http://schemas.microsoft.com/office/drawing/2016/ink" xmlns:am3d="http://schemas.microsoft.com/office/drawing/2017/model3d" xmlns:o="urn:schemas-microsoft-com:office:office" xmlns:oel="http://schemas.microsoft.com/office/2019/extlst" xmlns:r="http://schemas.openxmlformats.org/officeDocument/2006/relationships" xmlns:m="http://schemas.openxmlformats.org/officeDocument/2006/math" xmlns:v="urn:schemas-microsoft-com:vml" xmlns:wp14="http://schemas.microsoft.com/office/word/2010/wordprocessingDrawing" xmlns:wp="http://schemas.openxmlformats.org/drawingml/2006/wordprocessingDrawing" xmlns:w10="urn:schemas-microsoft-com:office:word" xmlns:w="http://schemas.openxmlformats.org/wordprocessingml/2006/main" xmlns:w14="http://schemas.microsoft.com/office/word/2010/wordml" xmlns:w15="http://schemas.microsoft.com/office/word/2012/wordml" xmlns:w16cex="http://schemas.microsoft.com/office/word/2018/wordml/cex" xmlns:w16cid="http://schemas.microsoft.com/office/word/2016/wordml/cid" xmlns:w16="http://schemas.microsoft.com/office/word/2018/wordml" xmlns:w16du="http://schemas.microsoft.com/office/word/2023/wordml/word16du" xmlns:w16sdtdh="http://schemas.microsoft.com/office/word/2020/wordml/sdtdatahash" xmlns:w16sdtfl="http://schemas.microsoft.com/office/word/2024/wordml/sdtformatlock" xmlns:w16se="http://schemas.microsoft.com/office/word/2015/wordml/symex" xmlns:wpg="http://schemas.microsoft.com/office/word/2010/wordprocessingGroup" xmlns:wpi="http://schemas.microsoft.com/office/word/2010/wordprocessingInk" xmlns:wne="http://schemas.microsoft.com/office/word/2006/wordml" xmlns:wps="http://schemas.microsoft.com/office/word/2010/wordprocessingShape" mc:Ignorable="w14 w15 w16se w16cid w16 w16cex w16sdtdh w16sdtfl w16du wp14">
   <w:abstractNum w:abstractNumId="0" w15:restartNumberingAfterBreak="0">
     <w:nsid w:val="054C545D"/>
     <w:multiLevelType w:val="multilevel"/>
@@ -12915,134 +12909,134 @@
       </w:rPr>
     </w:lvl>
   </w:abstractNum>
-  <w:num w:numId="1">
+  <w:num w:numId="1" w16cid:durableId="327443719">
     <w:abstractNumId w:val="39"/>
   </w:num>
-  <w:num w:numId="2">
+  <w:num w:numId="2" w16cid:durableId="690716422">
     <w:abstractNumId w:val="24"/>
   </w:num>
-  <w:num w:numId="3">
+  <w:num w:numId="3" w16cid:durableId="622613014">
     <w:abstractNumId w:val="11"/>
   </w:num>
-  <w:num w:numId="4">
+  <w:num w:numId="4" w16cid:durableId="2080472067">
     <w:abstractNumId w:val="2"/>
   </w:num>
-  <w:num w:numId="5">
+  <w:num w:numId="5" w16cid:durableId="194539850">
     <w:abstractNumId w:val="36"/>
   </w:num>
-  <w:num w:numId="6">
+  <w:num w:numId="6" w16cid:durableId="978267658">
     <w:abstractNumId w:val="22"/>
   </w:num>
-  <w:num w:numId="7">
+  <w:num w:numId="7" w16cid:durableId="370689118">
     <w:abstractNumId w:val="6"/>
   </w:num>
-  <w:num w:numId="8">
+  <w:num w:numId="8" w16cid:durableId="1610119727">
     <w:abstractNumId w:val="23"/>
   </w:num>
-  <w:num w:numId="9">
+  <w:num w:numId="9" w16cid:durableId="1611425126">
     <w:abstractNumId w:val="38"/>
   </w:num>
-  <w:num w:numId="10">
+  <w:num w:numId="10" w16cid:durableId="1688096943">
     <w:abstractNumId w:val="0"/>
   </w:num>
-  <w:num w:numId="11">
+  <w:num w:numId="11" w16cid:durableId="1069497403">
     <w:abstractNumId w:val="3"/>
   </w:num>
-  <w:num w:numId="12">
+  <w:num w:numId="12" w16cid:durableId="128403771">
     <w:abstractNumId w:val="31"/>
   </w:num>
-  <w:num w:numId="13">
+  <w:num w:numId="13" w16cid:durableId="1543207700">
     <w:abstractNumId w:val="13"/>
   </w:num>
-  <w:num w:numId="14">
+  <w:num w:numId="14" w16cid:durableId="370375231">
     <w:abstractNumId w:val="33"/>
   </w:num>
-  <w:num w:numId="15">
+  <w:num w:numId="15" w16cid:durableId="1212427079">
     <w:abstractNumId w:val="19"/>
   </w:num>
-  <w:num w:numId="16">
+  <w:num w:numId="16" w16cid:durableId="1314140844">
     <w:abstractNumId w:val="9"/>
   </w:num>
-  <w:num w:numId="17">
+  <w:num w:numId="17" w16cid:durableId="150946642">
     <w:abstractNumId w:val="27"/>
   </w:num>
-  <w:num w:numId="18">
+  <w:num w:numId="18" w16cid:durableId="1111392131">
     <w:abstractNumId w:val="26"/>
   </w:num>
-  <w:num w:numId="19">
+  <w:num w:numId="19" w16cid:durableId="2089500842">
     <w:abstractNumId w:val="16"/>
   </w:num>
-  <w:num w:numId="20">
+  <w:num w:numId="20" w16cid:durableId="1379746230">
     <w:abstractNumId w:val="35"/>
   </w:num>
-  <w:num w:numId="21">
+  <w:num w:numId="21" w16cid:durableId="670522248">
     <w:abstractNumId w:val="15"/>
   </w:num>
-  <w:num w:numId="22">
+  <w:num w:numId="22" w16cid:durableId="2085373014">
     <w:abstractNumId w:val="20"/>
   </w:num>
-  <w:num w:numId="23">
+  <w:num w:numId="23" w16cid:durableId="1088767144">
     <w:abstractNumId w:val="18"/>
   </w:num>
-  <w:num w:numId="24">
+  <w:num w:numId="24" w16cid:durableId="1019892887">
     <w:abstractNumId w:val="37"/>
   </w:num>
-  <w:num w:numId="25">
+  <w:num w:numId="25" w16cid:durableId="1887836067">
     <w:abstractNumId w:val="8"/>
   </w:num>
-  <w:num w:numId="26">
+  <w:num w:numId="26" w16cid:durableId="1362903024">
     <w:abstractNumId w:val="34"/>
   </w:num>
-  <w:num w:numId="27">
+  <w:num w:numId="27" w16cid:durableId="617026970">
     <w:abstractNumId w:val="10"/>
   </w:num>
-  <w:num w:numId="28">
+  <w:num w:numId="28" w16cid:durableId="119805298">
     <w:abstractNumId w:val="29"/>
   </w:num>
-  <w:num w:numId="29">
+  <w:num w:numId="29" w16cid:durableId="698356728">
     <w:abstractNumId w:val="28"/>
   </w:num>
-  <w:num w:numId="30">
+  <w:num w:numId="30" w16cid:durableId="1722552094">
     <w:abstractNumId w:val="4"/>
   </w:num>
-  <w:num w:numId="31">
+  <w:num w:numId="31" w16cid:durableId="650212378">
     <w:abstractNumId w:val="32"/>
   </w:num>
-  <w:num w:numId="32">
+  <w:num w:numId="32" w16cid:durableId="2059431578">
     <w:abstractNumId w:val="21"/>
   </w:num>
-  <w:num w:numId="33">
+  <w:num w:numId="33" w16cid:durableId="18237872">
     <w:abstractNumId w:val="12"/>
   </w:num>
-  <w:num w:numId="34">
+  <w:num w:numId="34" w16cid:durableId="785925776">
     <w:abstractNumId w:val="1"/>
   </w:num>
-  <w:num w:numId="35">
+  <w:num w:numId="35" w16cid:durableId="581258859">
     <w:abstractNumId w:val="17"/>
   </w:num>
-  <w:num w:numId="36">
+  <w:num w:numId="36" w16cid:durableId="1087192378">
     <w:abstractNumId w:val="7"/>
   </w:num>
-  <w:num w:numId="37">
+  <w:num w:numId="37" w16cid:durableId="706177972">
     <w:abstractNumId w:val="40"/>
   </w:num>
-  <w:num w:numId="38">
+  <w:num w:numId="38" w16cid:durableId="721488044">
     <w:abstractNumId w:val="14"/>
   </w:num>
-  <w:num w:numId="39">
+  <w:num w:numId="39" w16cid:durableId="492184457">
     <w:abstractNumId w:val="25"/>
   </w:num>
-  <w:num w:numId="40">
+  <w:num w:numId="40" w16cid:durableId="656346699">
     <w:abstractNumId w:val="30"/>
   </w:num>
-  <w:num w:numId="41">
+  <w:num w:numId="41" w16cid:durableId="1549493453">
     <w:abstractNumId w:val="5"/>
   </w:num>
 </w:numbering>
 </file>
 
 <file path=word/styles.xml><?xml version="1.0" encoding="utf-8"?>
-<w:styles xmlns:mc="http://schemas.openxmlformats.org/markup-compatibility/2006" xmlns:r="http://schemas.openxmlformats.org/officeDocument/2006/relationships" xmlns:w="http://schemas.openxmlformats.org/wordprocessingml/2006/main" xmlns:w14="http://schemas.microsoft.com/office/word/2010/wordml" xmlns:w15="http://schemas.microsoft.com/office/word/2012/wordml" mc:Ignorable="w14 w15">
+<w:styles xmlns:mc="http://schemas.openxmlformats.org/markup-compatibility/2006" xmlns:r="http://schemas.openxmlformats.org/officeDocument/2006/relationships" xmlns:w="http://schemas.openxmlformats.org/wordprocessingml/2006/main" xmlns:w14="http://schemas.microsoft.com/office/word/2010/wordml" xmlns:w15="http://schemas.microsoft.com/office/word/2012/wordml" xmlns:w16cex="http://schemas.microsoft.com/office/word/2018/wordml/cex" xmlns:w16cid="http://schemas.microsoft.com/office/word/2016/wordml/cid" xmlns:w16="http://schemas.microsoft.com/office/word/2018/wordml" xmlns:w16du="http://schemas.microsoft.com/office/word/2023/wordml/word16du" xmlns:w16sdtdh="http://schemas.microsoft.com/office/word/2020/wordml/sdtdatahash" xmlns:w16sdtfl="http://schemas.microsoft.com/office/word/2024/wordml/sdtformatlock" xmlns:w16se="http://schemas.microsoft.com/office/word/2015/wordml/symex" mc:Ignorable="w14 w15 w16se w16cid w16 w16cex w16sdtdh w16sdtfl w16du">
   <w:docDefaults>
     <w:rPrDefault>
       <w:rPr>
@@ -13059,7 +13053,7 @@
       </w:pPr>
     </w:pPrDefault>
   </w:docDefaults>
-  <w:latentStyles w:defLockedState="0" w:defUIPriority="99" w:defSemiHidden="0" w:defUnhideWhenUsed="0" w:defQFormat="0" w:count="371">
+  <w:latentStyles w:defLockedState="0" w:defUIPriority="99" w:defSemiHidden="0" w:defUnhideWhenUsed="0" w:defQFormat="0" w:count="376">
     <w:lsdException w:name="Normal" w:uiPriority="0" w:qFormat="1"/>
     <w:lsdException w:name="heading 1" w:uiPriority="9" w:qFormat="1"/>
     <w:lsdException w:name="heading 2" w:semiHidden="1" w:uiPriority="9" w:unhideWhenUsed="1" w:qFormat="1"/>
@@ -13431,6 +13425,11 @@
     <w:lsdException w:name="List Table 5 Dark Accent 6" w:uiPriority="50"/>
     <w:lsdException w:name="List Table 6 Colorful Accent 6" w:uiPriority="51"/>
     <w:lsdException w:name="List Table 7 Colorful Accent 6" w:uiPriority="52"/>
+    <w:lsdException w:name="Mention" w:semiHidden="1" w:unhideWhenUsed="1"/>
+    <w:lsdException w:name="Smart Hyperlink" w:semiHidden="1" w:unhideWhenUsed="1"/>
+    <w:lsdException w:name="Hashtag" w:semiHidden="1" w:unhideWhenUsed="1"/>
+    <w:lsdException w:name="Unresolved Mention" w:semiHidden="1" w:unhideWhenUsed="1"/>
+    <w:lsdException w:name="Smart Link" w:semiHidden="1" w:unhideWhenUsed="1"/>
   </w:latentStyles>
   <w:style w:type="paragraph" w:default="1" w:styleId="Normal">
     <w:name w:val="Normal"/>
@@ -13566,7 +13565,6 @@
   <w:style w:type="character" w:default="1" w:styleId="DefaultParagraphFont">
     <w:name w:val="Default Paragraph Font"/>
     <w:uiPriority w:val="1"/>
-    <w:semiHidden/>
     <w:unhideWhenUsed/>
   </w:style>
   <w:style w:type="table" w:default="1" w:styleId="TableNormal">
@@ -13783,8 +13781,8 @@
       <w:u w:val="single"/>
     </w:rPr>
   </w:style>
-  <w:style w:type="character" w:customStyle="1" w:styleId="UnresolvedMention">
-    <w:name w:val="Unresolved Mention"/>
+  <w:style w:type="character" w:customStyle="1" w:styleId="UnresolvedMention1">
+    <w:name w:val="Unresolved Mention1"/>
     <w:basedOn w:val="DefaultParagraphFont"/>
     <w:uiPriority w:val="99"/>
     <w:semiHidden/>
@@ -14405,28 +14403,28 @@
 </file>
 
 <file path=customXml/item1.xml><?xml version="1.0" encoding="utf-8"?>
+<b:Sources xmlns:b="http://schemas.openxmlformats.org/officeDocument/2006/bibliography" xmlns="http://schemas.openxmlformats.org/officeDocument/2006/bibliography" SelectedStyle="\IEEE2006OfficeOnline.xsl" StyleName="IEEE" Version="2006"/>
+</file>
+
+<file path=customXml/item2.xml><?xml version="1.0" encoding="utf-8"?>
 <go:gDocsCustomXmlDataStorage xmlns:go="http://customooxmlschemas.google.com/" xmlns:r="http://schemas.openxmlformats.org/officeDocument/2006/relationships" uri="GoogleDocsCustomDataVersion2">
   <go:docsCustomData xmlns:go="http://customooxmlschemas.google.com/" roundtripDataSignature="AMtx7mim8rBhNDFl4Wh4PromgB8UVNjyuw==">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</go:docsCustomData>
 </go:gDocsCustomXmlDataStorage>
 </file>
 
-<file path=customXml/item2.xml><?xml version="1.0" encoding="utf-8"?>
-<b:Sources xmlns:b="http://schemas.openxmlformats.org/officeDocument/2006/bibliography" xmlns="http://schemas.openxmlformats.org/officeDocument/2006/bibliography" SelectedStyle="\IEEE2006OfficeOnline.xsl" StyleName="IEEE" Version="2006"/>
+<file path=customXml/itemProps1.xml><?xml version="1.0" encoding="utf-8"?>
+<ds:datastoreItem xmlns:ds="http://schemas.openxmlformats.org/officeDocument/2006/customXml" ds:itemID="{F45D6693-1D45-4D55-BF74-69E575BA83E1}">
+  <ds:schemaRefs>
+    <ds:schemaRef ds:uri="http://schemas.openxmlformats.org/officeDocument/2006/bibliography"/>
+  </ds:schemaRefs>
+</ds:datastoreItem>
 </file>
 
-<file path=customXml/itemProps1.xml><?xml version="1.0" encoding="utf-8"?>
+<file path=customXml/itemProps2.xml><?xml version="1.0" encoding="utf-8"?>
 <ds:datastoreItem xmlns:ds="http://schemas.openxmlformats.org/officeDocument/2006/customXml" ds:itemID="{11111111-1234-1234-1234-123412341234}">
   <ds:schemaRefs>
     <ds:schemaRef ds:uri="http://customooxmlschemas.google.com/"/>
     <ds:schemaRef ds:uri="http://schemas.openxmlformats.org/officeDocument/2006/relationships"/>
   </ds:schemaRefs>
 </ds:datastoreItem>
-</file>
-
-<file path=customXml/itemProps2.xml><?xml version="1.0" encoding="utf-8"?>
-<ds:datastoreItem xmlns:ds="http://schemas.openxmlformats.org/officeDocument/2006/customXml" ds:itemID="{F45D6693-1D45-4D55-BF74-69E575BA83E1}">
-  <ds:schemaRefs>
-    <ds:schemaRef ds:uri="http://schemas.openxmlformats.org/officeDocument/2006/bibliography"/>
-  </ds:schemaRefs>
-</ds:datastoreItem>
 </file>
</xml_diff>

<commit_message>
Added dashboard icons plus modified documentationi
</commit_message>
<xml_diff>
--- a/Slides/Proposal Documentation.docx
+++ b/Slides/Proposal Documentation.docx
@@ -518,12 +518,38 @@
           <w:color w:val="000000"/>
         </w:rPr>
       </w:pPr>
+      <w:proofErr w:type="spellStart"/>
       <w:r>
         <w:rPr>
           <w:color w:val="000000"/>
         </w:rPr>
-        <w:t>Saistha Pradhan</w:t>
-      </w:r>
+        <w:t>Saistha</w:t>
+      </w:r>
+      <w:proofErr w:type="spellEnd"/>
+      <w:r>
+        <w:rPr>
+          <w:color w:val="000000"/>
+        </w:rPr>
+        <w:t xml:space="preserve"> Pradhan</w:t>
+      </w:r>
+    </w:p>
+    <w:p>
+      <w:pPr>
+        <w:spacing w:before="0" w:after="0"/>
+        <w:jc w:val="center"/>
+        <w:rPr>
+          <w:color w:val="000000"/>
+        </w:rPr>
+      </w:pPr>
+    </w:p>
+    <w:p>
+      <w:pPr>
+        <w:spacing w:before="0" w:after="0"/>
+        <w:jc w:val="center"/>
+        <w:rPr>
+          <w:color w:val="000000"/>
+        </w:rPr>
+      </w:pPr>
     </w:p>
     <w:p>
       <w:pPr>
@@ -543,6 +569,7 @@
           <w:sz w:val="32"/>
           <w:szCs w:val="32"/>
         </w:rPr>
+        <w:lastRenderedPageBreak/>
         <w:t>“</w:t>
       </w:r>
       <w:r>
@@ -593,7 +620,6 @@
           <w:sz w:val="32"/>
           <w:szCs w:val="32"/>
         </w:rPr>
-        <w:lastRenderedPageBreak/>
         <w:t>(</w:t>
       </w:r>
       <w:r>
@@ -943,7 +969,7 @@
         <w:pStyle w:val="Heading2"/>
         <w:jc w:val="center"/>
       </w:pPr>
-      <w:bookmarkStart w:id="0" w:name="_Toc231489951"/>
+      <w:bookmarkStart w:id="0" w:name="_Toc234343947"/>
       <w:r>
         <w:lastRenderedPageBreak/>
         <w:t>Abstract</w:t>
@@ -1006,7 +1032,7 @@
       </w:pPr>
       <w:bookmarkStart w:id="1" w:name="_Toc222586726"/>
       <w:bookmarkStart w:id="2" w:name="_Toc222587363"/>
-      <w:bookmarkStart w:id="3" w:name="_Toc231489952"/>
+      <w:bookmarkStart w:id="3" w:name="_Toc234343948"/>
       <w:r>
         <w:t>TABLE OF CONTENTS</w:t>
       </w:r>
@@ -1066,7 +1092,7 @@
           <w:r>
             <w:fldChar w:fldCharType="separate"/>
           </w:r>
-          <w:hyperlink w:anchor="_Toc231489951" w:history="1">
+          <w:hyperlink w:anchor="_Toc234343947" w:history="1">
             <w:r>
               <w:rPr>
                 <w:rStyle w:val="Hyperlink"/>
@@ -1093,7 +1119,7 @@
                 <w:noProof/>
                 <w:webHidden/>
               </w:rPr>
-              <w:instrText xml:space="preserve"> PAGEREF _Toc231489951 \h </w:instrText>
+              <w:instrText xml:space="preserve"> PAGEREF _Toc234343947 \h </w:instrText>
             </w:r>
             <w:r>
               <w:rPr>
@@ -1113,7 +1139,7 @@
                 <w:noProof/>
                 <w:webHidden/>
               </w:rPr>
-              <w:t>3</w:t>
+              <w:t>iii</w:t>
             </w:r>
             <w:r>
               <w:rPr>
@@ -1136,7 +1162,7 @@
               <w14:ligatures w14:val="standardContextual"/>
             </w:rPr>
           </w:pPr>
-          <w:hyperlink w:anchor="_Toc231489952" w:history="1">
+          <w:hyperlink w:anchor="_Toc234343948" w:history="1">
             <w:r>
               <w:rPr>
                 <w:rStyle w:val="Hyperlink"/>
@@ -1159,7 +1185,7 @@
               <w:rPr>
                 <w:webHidden/>
               </w:rPr>
-              <w:instrText xml:space="preserve"> PAGEREF _Toc231489952 \h </w:instrText>
+              <w:instrText xml:space="preserve"> PAGEREF _Toc234343948 \h </w:instrText>
             </w:r>
             <w:r>
               <w:rPr>
@@ -1176,7 +1202,7 @@
               <w:rPr>
                 <w:webHidden/>
               </w:rPr>
-              <w:t>1</w:t>
+              <w:t>iv</w:t>
             </w:r>
             <w:r>
               <w:rPr>
@@ -1198,7 +1224,7 @@
               <w14:ligatures w14:val="standardContextual"/>
             </w:rPr>
           </w:pPr>
-          <w:hyperlink w:anchor="_Toc231489953" w:history="1">
+          <w:hyperlink w:anchor="_Toc234343949" w:history="1">
             <w:r>
               <w:rPr>
                 <w:rStyle w:val="Hyperlink"/>
@@ -1221,7 +1247,7 @@
               <w:rPr>
                 <w:webHidden/>
               </w:rPr>
-              <w:instrText xml:space="preserve"> PAGEREF _Toc231489953 \h </w:instrText>
+              <w:instrText xml:space="preserve"> PAGEREF _Toc234343949 \h </w:instrText>
             </w:r>
             <w:r>
               <w:rPr>
@@ -1238,7 +1264,7 @@
               <w:rPr>
                 <w:webHidden/>
               </w:rPr>
-              <w:t>3</w:t>
+              <w:t>vi</w:t>
             </w:r>
             <w:r>
               <w:rPr>
@@ -1260,7 +1286,7 @@
               <w14:ligatures w14:val="standardContextual"/>
             </w:rPr>
           </w:pPr>
-          <w:hyperlink w:anchor="_Toc231489954" w:history="1">
+          <w:hyperlink w:anchor="_Toc234343950" w:history="1">
             <w:r>
               <w:rPr>
                 <w:rStyle w:val="Hyperlink"/>
@@ -1283,7 +1309,7 @@
               <w:rPr>
                 <w:webHidden/>
               </w:rPr>
-              <w:instrText xml:space="preserve"> PAGEREF _Toc231489954 \h </w:instrText>
+              <w:instrText xml:space="preserve"> PAGEREF _Toc234343950 \h </w:instrText>
             </w:r>
             <w:r>
               <w:rPr>
@@ -1300,7 +1326,7 @@
               <w:rPr>
                 <w:webHidden/>
               </w:rPr>
-              <w:t>4</w:t>
+              <w:t>vii</w:t>
             </w:r>
             <w:r>
               <w:rPr>
@@ -1322,7 +1348,7 @@
               <w14:ligatures w14:val="standardContextual"/>
             </w:rPr>
           </w:pPr>
-          <w:hyperlink w:anchor="_Toc231489955" w:history="1">
+          <w:hyperlink w:anchor="_Toc234343951" w:history="1">
             <w:r>
               <w:rPr>
                 <w:rStyle w:val="Hyperlink"/>
@@ -1345,7 +1371,7 @@
               <w:rPr>
                 <w:webHidden/>
               </w:rPr>
-              <w:instrText xml:space="preserve"> PAGEREF _Toc231489955 \h </w:instrText>
+              <w:instrText xml:space="preserve"> PAGEREF _Toc234343951 \h </w:instrText>
             </w:r>
             <w:r>
               <w:rPr>
@@ -1387,7 +1413,7 @@
               <w14:ligatures w14:val="standardContextual"/>
             </w:rPr>
           </w:pPr>
-          <w:hyperlink w:anchor="_Toc231489956" w:history="1">
+          <w:hyperlink w:anchor="_Toc234343952" w:history="1">
             <w:r>
               <w:rPr>
                 <w:rStyle w:val="Hyperlink"/>
@@ -1431,7 +1457,7 @@
                 <w:noProof/>
                 <w:webHidden/>
               </w:rPr>
-              <w:instrText xml:space="preserve"> PAGEREF _Toc231489956 \h </w:instrText>
+              <w:instrText xml:space="preserve"> PAGEREF _Toc234343952 \h </w:instrText>
             </w:r>
             <w:r>
               <w:rPr>
@@ -1477,7 +1503,7 @@
               <w14:ligatures w14:val="standardContextual"/>
             </w:rPr>
           </w:pPr>
-          <w:hyperlink w:anchor="_Toc231489957" w:history="1">
+          <w:hyperlink w:anchor="_Toc234343953" w:history="1">
             <w:r>
               <w:rPr>
                 <w:rStyle w:val="Hyperlink"/>
@@ -1521,7 +1547,7 @@
                 <w:noProof/>
                 <w:webHidden/>
               </w:rPr>
-              <w:instrText xml:space="preserve"> PAGEREF _Toc231489957 \h </w:instrText>
+              <w:instrText xml:space="preserve"> PAGEREF _Toc234343953 \h </w:instrText>
             </w:r>
             <w:r>
               <w:rPr>
@@ -1566,7 +1592,7 @@
               <w14:ligatures w14:val="standardContextual"/>
             </w:rPr>
           </w:pPr>
-          <w:hyperlink w:anchor="_Toc231489958" w:history="1">
+          <w:hyperlink w:anchor="_Toc234343954" w:history="1">
             <w:r>
               <w:rPr>
                 <w:rStyle w:val="Hyperlink"/>
@@ -1593,7 +1619,7 @@
                 <w:noProof/>
                 <w:webHidden/>
               </w:rPr>
-              <w:instrText xml:space="preserve"> PAGEREF _Toc231489958 \h </w:instrText>
+              <w:instrText xml:space="preserve"> PAGEREF _Toc234343954 \h </w:instrText>
             </w:r>
             <w:r>
               <w:rPr>
@@ -1638,7 +1664,7 @@
               <w14:ligatures w14:val="standardContextual"/>
             </w:rPr>
           </w:pPr>
-          <w:hyperlink w:anchor="_Toc231489959" w:history="1">
+          <w:hyperlink w:anchor="_Toc234343955" w:history="1">
             <w:r>
               <w:rPr>
                 <w:rStyle w:val="Hyperlink"/>
@@ -1665,7 +1691,7 @@
                 <w:noProof/>
                 <w:webHidden/>
               </w:rPr>
-              <w:instrText xml:space="preserve"> PAGEREF _Toc231489959 \h </w:instrText>
+              <w:instrText xml:space="preserve"> PAGEREF _Toc234343955 \h </w:instrText>
             </w:r>
             <w:r>
               <w:rPr>
@@ -1710,7 +1736,7 @@
               <w14:ligatures w14:val="standardContextual"/>
             </w:rPr>
           </w:pPr>
-          <w:hyperlink w:anchor="_Toc231489960" w:history="1">
+          <w:hyperlink w:anchor="_Toc234343956" w:history="1">
             <w:r>
               <w:rPr>
                 <w:rStyle w:val="Hyperlink"/>
@@ -1737,7 +1763,7 @@
                 <w:noProof/>
                 <w:webHidden/>
               </w:rPr>
-              <w:instrText xml:space="preserve"> PAGEREF _Toc231489960 \h </w:instrText>
+              <w:instrText xml:space="preserve"> PAGEREF _Toc234343956 \h </w:instrText>
             </w:r>
             <w:r>
               <w:rPr>
@@ -1782,7 +1808,7 @@
               <w14:ligatures w14:val="standardContextual"/>
             </w:rPr>
           </w:pPr>
-          <w:hyperlink w:anchor="_Toc231489961" w:history="1">
+          <w:hyperlink w:anchor="_Toc234343957" w:history="1">
             <w:r>
               <w:rPr>
                 <w:rStyle w:val="Hyperlink"/>
@@ -1809,7 +1835,7 @@
                 <w:noProof/>
                 <w:webHidden/>
               </w:rPr>
-              <w:instrText xml:space="preserve"> PAGEREF _Toc231489961 \h </w:instrText>
+              <w:instrText xml:space="preserve"> PAGEREF _Toc234343957 \h </w:instrText>
             </w:r>
             <w:r>
               <w:rPr>
@@ -1852,7 +1878,7 @@
               <w14:ligatures w14:val="standardContextual"/>
             </w:rPr>
           </w:pPr>
-          <w:hyperlink w:anchor="_Toc231489962" w:history="1">
+          <w:hyperlink w:anchor="_Toc234343958" w:history="1">
             <w:r>
               <w:rPr>
                 <w:rStyle w:val="Hyperlink"/>
@@ -1875,7 +1901,7 @@
               <w:rPr>
                 <w:webHidden/>
               </w:rPr>
-              <w:instrText xml:space="preserve"> PAGEREF _Toc231489962 \h </w:instrText>
+              <w:instrText xml:space="preserve"> PAGEREF _Toc234343958 \h </w:instrText>
             </w:r>
             <w:r>
               <w:rPr>
@@ -1916,7 +1942,7 @@
               <w14:ligatures w14:val="standardContextual"/>
             </w:rPr>
           </w:pPr>
-          <w:hyperlink w:anchor="_Toc231489963" w:history="1">
+          <w:hyperlink w:anchor="_Toc234343959" w:history="1">
             <w:r>
               <w:rPr>
                 <w:rStyle w:val="Hyperlink"/>
@@ -1943,7 +1969,7 @@
                 <w:noProof/>
                 <w:webHidden/>
               </w:rPr>
-              <w:instrText xml:space="preserve"> PAGEREF _Toc231489963 \h </w:instrText>
+              <w:instrText xml:space="preserve"> PAGEREF _Toc234343959 \h </w:instrText>
             </w:r>
             <w:r>
               <w:rPr>
@@ -1988,7 +2014,7 @@
               <w14:ligatures w14:val="standardContextual"/>
             </w:rPr>
           </w:pPr>
-          <w:hyperlink w:anchor="_Toc231489964" w:history="1">
+          <w:hyperlink w:anchor="_Toc234343960" w:history="1">
             <w:r>
               <w:rPr>
                 <w:rStyle w:val="Hyperlink"/>
@@ -2015,7 +2041,7 @@
                 <w:noProof/>
                 <w:webHidden/>
               </w:rPr>
-              <w:instrText xml:space="preserve"> PAGEREF _Toc231489964 \h </w:instrText>
+              <w:instrText xml:space="preserve"> PAGEREF _Toc234343960 \h </w:instrText>
             </w:r>
             <w:r>
               <w:rPr>
@@ -2060,7 +2086,7 @@
               <w14:ligatures w14:val="standardContextual"/>
             </w:rPr>
           </w:pPr>
-          <w:hyperlink w:anchor="_Toc231489965" w:history="1">
+          <w:hyperlink w:anchor="_Toc234343961" w:history="1">
             <w:r>
               <w:rPr>
                 <w:rStyle w:val="Hyperlink"/>
@@ -2087,7 +2113,7 @@
                 <w:noProof/>
                 <w:webHidden/>
               </w:rPr>
-              <w:instrText xml:space="preserve"> PAGEREF _Toc231489965 \h </w:instrText>
+              <w:instrText xml:space="preserve"> PAGEREF _Toc234343961 \h </w:instrText>
             </w:r>
             <w:r>
               <w:rPr>
@@ -2132,7 +2158,7 @@
               <w14:ligatures w14:val="standardContextual"/>
             </w:rPr>
           </w:pPr>
-          <w:hyperlink w:anchor="_Toc231489966" w:history="1">
+          <w:hyperlink w:anchor="_Toc234343962" w:history="1">
             <w:r>
               <w:rPr>
                 <w:rStyle w:val="Hyperlink"/>
@@ -2159,7 +2185,7 @@
                 <w:noProof/>
                 <w:webHidden/>
               </w:rPr>
-              <w:instrText xml:space="preserve"> PAGEREF _Toc231489966 \h </w:instrText>
+              <w:instrText xml:space="preserve"> PAGEREF _Toc234343962 \h </w:instrText>
             </w:r>
             <w:r>
               <w:rPr>
@@ -2204,7 +2230,7 @@
               <w14:ligatures w14:val="standardContextual"/>
             </w:rPr>
           </w:pPr>
-          <w:hyperlink w:anchor="_Toc231489967" w:history="1">
+          <w:hyperlink w:anchor="_Toc234343963" w:history="1">
             <w:r>
               <w:rPr>
                 <w:rStyle w:val="Hyperlink"/>
@@ -2231,7 +2257,7 @@
                 <w:noProof/>
                 <w:webHidden/>
               </w:rPr>
-              <w:instrText xml:space="preserve"> PAGEREF _Toc231489967 \h </w:instrText>
+              <w:instrText xml:space="preserve"> PAGEREF _Toc234343963 \h </w:instrText>
             </w:r>
             <w:r>
               <w:rPr>
@@ -2276,7 +2302,7 @@
               <w14:ligatures w14:val="standardContextual"/>
             </w:rPr>
           </w:pPr>
-          <w:hyperlink w:anchor="_Toc231489968" w:history="1">
+          <w:hyperlink w:anchor="_Toc234343964" w:history="1">
             <w:r>
               <w:rPr>
                 <w:rStyle w:val="Hyperlink"/>
@@ -2303,7 +2329,7 @@
                 <w:noProof/>
                 <w:webHidden/>
               </w:rPr>
-              <w:instrText xml:space="preserve"> PAGEREF _Toc231489968 \h </w:instrText>
+              <w:instrText xml:space="preserve"> PAGEREF _Toc234343964 \h </w:instrText>
             </w:r>
             <w:r>
               <w:rPr>
@@ -2346,7 +2372,7 @@
               <w14:ligatures w14:val="standardContextual"/>
             </w:rPr>
           </w:pPr>
-          <w:hyperlink w:anchor="_Toc231489969" w:history="1">
+          <w:hyperlink w:anchor="_Toc234343965" w:history="1">
             <w:r>
               <w:rPr>
                 <w:rStyle w:val="Hyperlink"/>
@@ -2369,7 +2395,7 @@
               <w:rPr>
                 <w:webHidden/>
               </w:rPr>
-              <w:instrText xml:space="preserve"> PAGEREF _Toc231489969 \h </w:instrText>
+              <w:instrText xml:space="preserve"> PAGEREF _Toc234343965 \h </w:instrText>
             </w:r>
             <w:r>
               <w:rPr>
@@ -2386,7 +2412,7 @@
               <w:rPr>
                 <w:webHidden/>
               </w:rPr>
-              <w:t>6</w:t>
+              <w:t>7</w:t>
             </w:r>
             <w:r>
               <w:rPr>
@@ -2410,7 +2436,7 @@
               <w14:ligatures w14:val="standardContextual"/>
             </w:rPr>
           </w:pPr>
-          <w:hyperlink w:anchor="_Toc231489970" w:history="1">
+          <w:hyperlink w:anchor="_Toc234343966" w:history="1">
             <w:r>
               <w:rPr>
                 <w:rStyle w:val="Hyperlink"/>
@@ -2437,7 +2463,7 @@
                 <w:noProof/>
                 <w:webHidden/>
               </w:rPr>
-              <w:instrText xml:space="preserve"> PAGEREF _Toc231489970 \h </w:instrText>
+              <w:instrText xml:space="preserve"> PAGEREF _Toc234343966 \h </w:instrText>
             </w:r>
             <w:r>
               <w:rPr>
@@ -2457,7 +2483,7 @@
                 <w:noProof/>
                 <w:webHidden/>
               </w:rPr>
-              <w:t>6</w:t>
+              <w:t>7</w:t>
             </w:r>
             <w:r>
               <w:rPr>
@@ -2482,7 +2508,7 @@
               <w14:ligatures w14:val="standardContextual"/>
             </w:rPr>
           </w:pPr>
-          <w:hyperlink w:anchor="_Toc231489971" w:history="1">
+          <w:hyperlink w:anchor="_Toc234343967" w:history="1">
             <w:r>
               <w:rPr>
                 <w:rStyle w:val="Hyperlink"/>
@@ -2509,7 +2535,7 @@
                 <w:noProof/>
                 <w:webHidden/>
               </w:rPr>
-              <w:instrText xml:space="preserve"> PAGEREF _Toc231489971 \h </w:instrText>
+              <w:instrText xml:space="preserve"> PAGEREF _Toc234343967 \h </w:instrText>
             </w:r>
             <w:r>
               <w:rPr>
@@ -2529,7 +2555,7 @@
                 <w:noProof/>
                 <w:webHidden/>
               </w:rPr>
-              <w:t>6</w:t>
+              <w:t>7</w:t>
             </w:r>
             <w:r>
               <w:rPr>
@@ -2554,7 +2580,7 @@
               <w14:ligatures w14:val="standardContextual"/>
             </w:rPr>
           </w:pPr>
-          <w:hyperlink w:anchor="_Toc231489972" w:history="1">
+          <w:hyperlink w:anchor="_Toc234343968" w:history="1">
             <w:r>
               <w:rPr>
                 <w:rStyle w:val="Hyperlink"/>
@@ -2581,7 +2607,7 @@
                 <w:noProof/>
                 <w:webHidden/>
               </w:rPr>
-              <w:instrText xml:space="preserve"> PAGEREF _Toc231489972 \h </w:instrText>
+              <w:instrText xml:space="preserve"> PAGEREF _Toc234343968 \h </w:instrText>
             </w:r>
             <w:r>
               <w:rPr>
@@ -2601,7 +2627,7 @@
                 <w:noProof/>
                 <w:webHidden/>
               </w:rPr>
-              <w:t>6</w:t>
+              <w:t>7</w:t>
             </w:r>
             <w:r>
               <w:rPr>
@@ -2626,7 +2652,7 @@
               <w14:ligatures w14:val="standardContextual"/>
             </w:rPr>
           </w:pPr>
-          <w:hyperlink w:anchor="_Toc231489973" w:history="1">
+          <w:hyperlink w:anchor="_Toc234343969" w:history="1">
             <w:r>
               <w:rPr>
                 <w:rStyle w:val="Hyperlink"/>
@@ -2653,7 +2679,7 @@
                 <w:noProof/>
                 <w:webHidden/>
               </w:rPr>
-              <w:instrText xml:space="preserve"> PAGEREF _Toc231489973 \h </w:instrText>
+              <w:instrText xml:space="preserve"> PAGEREF _Toc234343969 \h </w:instrText>
             </w:r>
             <w:r>
               <w:rPr>
@@ -2698,7 +2724,7 @@
               <w14:ligatures w14:val="standardContextual"/>
             </w:rPr>
           </w:pPr>
-          <w:hyperlink w:anchor="_Toc231489974" w:history="1">
+          <w:hyperlink w:anchor="_Toc234343970" w:history="1">
             <w:r>
               <w:rPr>
                 <w:rStyle w:val="Hyperlink"/>
@@ -2725,7 +2751,7 @@
                 <w:noProof/>
                 <w:webHidden/>
               </w:rPr>
-              <w:instrText xml:space="preserve"> PAGEREF _Toc231489974 \h </w:instrText>
+              <w:instrText xml:space="preserve"> PAGEREF _Toc234343970 \h </w:instrText>
             </w:r>
             <w:r>
               <w:rPr>
@@ -2745,7 +2771,7 @@
                 <w:noProof/>
                 <w:webHidden/>
               </w:rPr>
-              <w:t>7</w:t>
+              <w:t>8</w:t>
             </w:r>
             <w:r>
               <w:rPr>
@@ -2771,7 +2797,7 @@
               <w14:ligatures w14:val="standardContextual"/>
             </w:rPr>
           </w:pPr>
-          <w:hyperlink w:anchor="_Toc231489975" w:history="1">
+          <w:hyperlink w:anchor="_Toc234343971" w:history="1">
             <w:r>
               <w:rPr>
                 <w:rStyle w:val="Hyperlink"/>
@@ -2815,7 +2841,7 @@
                 <w:noProof/>
                 <w:webHidden/>
               </w:rPr>
-              <w:instrText xml:space="preserve"> PAGEREF _Toc231489975 \h </w:instrText>
+              <w:instrText xml:space="preserve"> PAGEREF _Toc234343971 \h </w:instrText>
             </w:r>
             <w:r>
               <w:rPr>
@@ -2835,7 +2861,7 @@
                 <w:noProof/>
                 <w:webHidden/>
               </w:rPr>
-              <w:t>8</w:t>
+              <w:t>9</w:t>
             </w:r>
             <w:r>
               <w:rPr>
@@ -2860,7 +2886,7 @@
               <w14:ligatures w14:val="standardContextual"/>
             </w:rPr>
           </w:pPr>
-          <w:hyperlink w:anchor="_Toc231489976" w:history="1">
+          <w:hyperlink w:anchor="_Toc234343972" w:history="1">
             <w:r>
               <w:rPr>
                 <w:rStyle w:val="Hyperlink"/>
@@ -2887,7 +2913,7 @@
                 <w:noProof/>
                 <w:webHidden/>
               </w:rPr>
-              <w:instrText xml:space="preserve"> PAGEREF _Toc231489976 \h </w:instrText>
+              <w:instrText xml:space="preserve"> PAGEREF _Toc234343972 \h </w:instrText>
             </w:r>
             <w:r>
               <w:rPr>
@@ -2907,7 +2933,7 @@
                 <w:noProof/>
                 <w:webHidden/>
               </w:rPr>
-              <w:t>8</w:t>
+              <w:t>9</w:t>
             </w:r>
             <w:r>
               <w:rPr>
@@ -2932,7 +2958,7 @@
               <w14:ligatures w14:val="standardContextual"/>
             </w:rPr>
           </w:pPr>
-          <w:hyperlink w:anchor="_Toc231489977" w:history="1">
+          <w:hyperlink w:anchor="_Toc234343973" w:history="1">
             <w:r>
               <w:rPr>
                 <w:rStyle w:val="Hyperlink"/>
@@ -2959,7 +2985,7 @@
                 <w:noProof/>
                 <w:webHidden/>
               </w:rPr>
-              <w:instrText xml:space="preserve"> PAGEREF _Toc231489977 \h </w:instrText>
+              <w:instrText xml:space="preserve"> PAGEREF _Toc234343973 \h </w:instrText>
             </w:r>
             <w:r>
               <w:rPr>
@@ -3004,7 +3030,7 @@
               <w14:ligatures w14:val="standardContextual"/>
             </w:rPr>
           </w:pPr>
-          <w:hyperlink w:anchor="_Toc231489978" w:history="1">
+          <w:hyperlink w:anchor="_Toc234343974" w:history="1">
             <w:r>
               <w:rPr>
                 <w:rStyle w:val="Hyperlink"/>
@@ -3031,7 +3057,7 @@
                 <w:noProof/>
                 <w:webHidden/>
               </w:rPr>
-              <w:instrText xml:space="preserve"> PAGEREF _Toc231489978 \h </w:instrText>
+              <w:instrText xml:space="preserve"> PAGEREF _Toc234343974 \h </w:instrText>
             </w:r>
             <w:r>
               <w:rPr>
@@ -3076,7 +3102,7 @@
               <w14:ligatures w14:val="standardContextual"/>
             </w:rPr>
           </w:pPr>
-          <w:hyperlink w:anchor="_Toc231489979" w:history="1">
+          <w:hyperlink w:anchor="_Toc234343975" w:history="1">
             <w:r>
               <w:rPr>
                 <w:rStyle w:val="Hyperlink"/>
@@ -3103,7 +3129,7 @@
                 <w:noProof/>
                 <w:webHidden/>
               </w:rPr>
-              <w:instrText xml:space="preserve"> PAGEREF _Toc231489979 \h </w:instrText>
+              <w:instrText xml:space="preserve"> PAGEREF _Toc234343975 \h </w:instrText>
             </w:r>
             <w:r>
               <w:rPr>
@@ -3148,7 +3174,7 @@
               <w14:ligatures w14:val="standardContextual"/>
             </w:rPr>
           </w:pPr>
-          <w:hyperlink w:anchor="_Toc231489980" w:history="1">
+          <w:hyperlink w:anchor="_Toc234343976" w:history="1">
             <w:r>
               <w:rPr>
                 <w:rStyle w:val="Hyperlink"/>
@@ -3175,7 +3201,7 @@
                 <w:noProof/>
                 <w:webHidden/>
               </w:rPr>
-              <w:instrText xml:space="preserve"> PAGEREF _Toc231489980 \h </w:instrText>
+              <w:instrText xml:space="preserve"> PAGEREF _Toc234343976 \h </w:instrText>
             </w:r>
             <w:r>
               <w:rPr>
@@ -3220,7 +3246,7 @@
               <w14:ligatures w14:val="standardContextual"/>
             </w:rPr>
           </w:pPr>
-          <w:hyperlink w:anchor="_Toc231489981" w:history="1">
+          <w:hyperlink w:anchor="_Toc234343977" w:history="1">
             <w:r>
               <w:rPr>
                 <w:rStyle w:val="Hyperlink"/>
@@ -3247,7 +3273,7 @@
                 <w:noProof/>
                 <w:webHidden/>
               </w:rPr>
-              <w:instrText xml:space="preserve"> PAGEREF _Toc231489981 \h </w:instrText>
+              <w:instrText xml:space="preserve"> PAGEREF _Toc234343977 \h </w:instrText>
             </w:r>
             <w:r>
               <w:rPr>
@@ -3292,7 +3318,7 @@
               <w14:ligatures w14:val="standardContextual"/>
             </w:rPr>
           </w:pPr>
-          <w:hyperlink w:anchor="_Toc231489982" w:history="1">
+          <w:hyperlink w:anchor="_Toc234343978" w:history="1">
             <w:r>
               <w:rPr>
                 <w:rStyle w:val="Hyperlink"/>
@@ -3319,7 +3345,7 @@
                 <w:noProof/>
                 <w:webHidden/>
               </w:rPr>
-              <w:instrText xml:space="preserve"> PAGEREF _Toc231489982 \h </w:instrText>
+              <w:instrText xml:space="preserve"> PAGEREF _Toc234343978 \h </w:instrText>
             </w:r>
             <w:r>
               <w:rPr>
@@ -3364,7 +3390,7 @@
               <w14:ligatures w14:val="standardContextual"/>
             </w:rPr>
           </w:pPr>
-          <w:hyperlink w:anchor="_Toc231489983" w:history="1">
+          <w:hyperlink w:anchor="_Toc234343979" w:history="1">
             <w:r>
               <w:rPr>
                 <w:rStyle w:val="Hyperlink"/>
@@ -3392,7 +3418,7 @@
                 <w:noProof/>
                 <w:webHidden/>
               </w:rPr>
-              <w:instrText xml:space="preserve"> PAGEREF _Toc231489983 \h </w:instrText>
+              <w:instrText xml:space="preserve"> PAGEREF _Toc234343979 \h </w:instrText>
             </w:r>
             <w:r>
               <w:rPr>
@@ -3413,6 +3439,78 @@
                 <w:webHidden/>
               </w:rPr>
               <w:t>15</w:t>
+            </w:r>
+            <w:r>
+              <w:rPr>
+                <w:noProof/>
+                <w:webHidden/>
+              </w:rPr>
+              <w:fldChar w:fldCharType="end"/>
+            </w:r>
+          </w:hyperlink>
+        </w:p>
+        <w:p>
+          <w:pPr>
+            <w:pStyle w:val="TOC3"/>
+            <w:tabs>
+              <w:tab w:val="right" w:leader="dot" w:pos="8659"/>
+            </w:tabs>
+            <w:rPr>
+              <w:rFonts w:asciiTheme="minorHAnsi" w:hAnsiTheme="minorHAnsi" w:cstheme="minorBidi"/>
+              <w:noProof/>
+              <w:kern w:val="2"/>
+              <w:lang w:val="en-US"/>
+              <w14:ligatures w14:val="standardContextual"/>
+            </w:rPr>
+          </w:pPr>
+          <w:hyperlink w:anchor="_Toc234343980" w:history="1">
+            <w:r>
+              <w:rPr>
+                <w:rStyle w:val="Hyperlink"/>
+                <w:noProof/>
+              </w:rPr>
+              <w:t>3.3.8 Schema Diagram</w:t>
+            </w:r>
+            <w:r>
+              <w:rPr>
+                <w:noProof/>
+                <w:webHidden/>
+              </w:rPr>
+              <w:tab/>
+            </w:r>
+            <w:r>
+              <w:rPr>
+                <w:noProof/>
+                <w:webHidden/>
+              </w:rPr>
+              <w:fldChar w:fldCharType="begin"/>
+            </w:r>
+            <w:r>
+              <w:rPr>
+                <w:noProof/>
+                <w:webHidden/>
+              </w:rPr>
+              <w:instrText xml:space="preserve"> PAGEREF _Toc234343980 \h </w:instrText>
+            </w:r>
+            <w:r>
+              <w:rPr>
+                <w:noProof/>
+                <w:webHidden/>
+              </w:rPr>
+            </w:r>
+            <w:r>
+              <w:rPr>
+                <w:noProof/>
+                <w:webHidden/>
+              </w:rPr>
+              <w:fldChar w:fldCharType="separate"/>
+            </w:r>
+            <w:r>
+              <w:rPr>
+                <w:noProof/>
+                <w:webHidden/>
+              </w:rPr>
+              <w:t>16</w:t>
             </w:r>
             <w:r>
               <w:rPr>
@@ -3435,11 +3533,865 @@
               <w14:ligatures w14:val="standardContextual"/>
             </w:rPr>
           </w:pPr>
-          <w:hyperlink w:anchor="_Toc231489984" w:history="1">
+          <w:hyperlink w:anchor="_Toc234343981" w:history="1">
             <w:r>
               <w:rPr>
                 <w:rStyle w:val="Hyperlink"/>
               </w:rPr>
+              <w:t>CHAPTER 4: System Implementation</w:t>
+            </w:r>
+            <w:r>
+              <w:rPr>
+                <w:webHidden/>
+              </w:rPr>
+              <w:tab/>
+            </w:r>
+            <w:r>
+              <w:rPr>
+                <w:webHidden/>
+              </w:rPr>
+              <w:fldChar w:fldCharType="begin"/>
+            </w:r>
+            <w:r>
+              <w:rPr>
+                <w:webHidden/>
+              </w:rPr>
+              <w:instrText xml:space="preserve"> PAGEREF _Toc234343981 \h </w:instrText>
+            </w:r>
+            <w:r>
+              <w:rPr>
+                <w:webHidden/>
+              </w:rPr>
+            </w:r>
+            <w:r>
+              <w:rPr>
+                <w:webHidden/>
+              </w:rPr>
+              <w:fldChar w:fldCharType="separate"/>
+            </w:r>
+            <w:r>
+              <w:rPr>
+                <w:webHidden/>
+              </w:rPr>
+              <w:t>17</w:t>
+            </w:r>
+            <w:r>
+              <w:rPr>
+                <w:webHidden/>
+              </w:rPr>
+              <w:fldChar w:fldCharType="end"/>
+            </w:r>
+          </w:hyperlink>
+        </w:p>
+        <w:p>
+          <w:pPr>
+            <w:pStyle w:val="TOC2"/>
+            <w:tabs>
+              <w:tab w:val="right" w:leader="dot" w:pos="8659"/>
+            </w:tabs>
+            <w:rPr>
+              <w:rFonts w:asciiTheme="minorHAnsi" w:hAnsiTheme="minorHAnsi" w:cstheme="minorBidi"/>
+              <w:noProof/>
+              <w:kern w:val="2"/>
+              <w:lang w:val="en-US"/>
+              <w14:ligatures w14:val="standardContextual"/>
+            </w:rPr>
+          </w:pPr>
+          <w:hyperlink w:anchor="_Toc234343982" w:history="1">
+            <w:r>
+              <w:rPr>
+                <w:rStyle w:val="Hyperlink"/>
+                <w:noProof/>
+              </w:rPr>
+              <w:t>4.1 Detailed Project Schedule</w:t>
+            </w:r>
+            <w:r>
+              <w:rPr>
+                <w:noProof/>
+                <w:webHidden/>
+              </w:rPr>
+              <w:tab/>
+            </w:r>
+            <w:r>
+              <w:rPr>
+                <w:noProof/>
+                <w:webHidden/>
+              </w:rPr>
+              <w:fldChar w:fldCharType="begin"/>
+            </w:r>
+            <w:r>
+              <w:rPr>
+                <w:noProof/>
+                <w:webHidden/>
+              </w:rPr>
+              <w:instrText xml:space="preserve"> PAGEREF _Toc234343982 \h </w:instrText>
+            </w:r>
+            <w:r>
+              <w:rPr>
+                <w:noProof/>
+                <w:webHidden/>
+              </w:rPr>
+            </w:r>
+            <w:r>
+              <w:rPr>
+                <w:noProof/>
+                <w:webHidden/>
+              </w:rPr>
+              <w:fldChar w:fldCharType="separate"/>
+            </w:r>
+            <w:r>
+              <w:rPr>
+                <w:noProof/>
+                <w:webHidden/>
+              </w:rPr>
+              <w:t>17</w:t>
+            </w:r>
+            <w:r>
+              <w:rPr>
+                <w:noProof/>
+                <w:webHidden/>
+              </w:rPr>
+              <w:fldChar w:fldCharType="end"/>
+            </w:r>
+          </w:hyperlink>
+        </w:p>
+        <w:p>
+          <w:pPr>
+            <w:pStyle w:val="TOC2"/>
+            <w:tabs>
+              <w:tab w:val="right" w:leader="dot" w:pos="8659"/>
+            </w:tabs>
+            <w:rPr>
+              <w:rFonts w:asciiTheme="minorHAnsi" w:hAnsiTheme="minorHAnsi" w:cstheme="minorBidi"/>
+              <w:noProof/>
+              <w:kern w:val="2"/>
+              <w:lang w:val="en-US"/>
+              <w14:ligatures w14:val="standardContextual"/>
+            </w:rPr>
+          </w:pPr>
+          <w:hyperlink w:anchor="_Toc234343983" w:history="1">
+            <w:r>
+              <w:rPr>
+                <w:rStyle w:val="Hyperlink"/>
+                <w:noProof/>
+              </w:rPr>
+              <w:t>4.2 Gantt Chart</w:t>
+            </w:r>
+            <w:r>
+              <w:rPr>
+                <w:noProof/>
+                <w:webHidden/>
+              </w:rPr>
+              <w:tab/>
+            </w:r>
+            <w:r>
+              <w:rPr>
+                <w:noProof/>
+                <w:webHidden/>
+              </w:rPr>
+              <w:fldChar w:fldCharType="begin"/>
+            </w:r>
+            <w:r>
+              <w:rPr>
+                <w:noProof/>
+                <w:webHidden/>
+              </w:rPr>
+              <w:instrText xml:space="preserve"> PAGEREF _Toc234343983 \h </w:instrText>
+            </w:r>
+            <w:r>
+              <w:rPr>
+                <w:noProof/>
+                <w:webHidden/>
+              </w:rPr>
+            </w:r>
+            <w:r>
+              <w:rPr>
+                <w:noProof/>
+                <w:webHidden/>
+              </w:rPr>
+              <w:fldChar w:fldCharType="separate"/>
+            </w:r>
+            <w:r>
+              <w:rPr>
+                <w:noProof/>
+                <w:webHidden/>
+              </w:rPr>
+              <w:t>18</w:t>
+            </w:r>
+            <w:r>
+              <w:rPr>
+                <w:noProof/>
+                <w:webHidden/>
+              </w:rPr>
+              <w:fldChar w:fldCharType="end"/>
+            </w:r>
+          </w:hyperlink>
+        </w:p>
+        <w:p>
+          <w:pPr>
+            <w:pStyle w:val="TOC2"/>
+            <w:tabs>
+              <w:tab w:val="right" w:leader="dot" w:pos="8659"/>
+            </w:tabs>
+            <w:rPr>
+              <w:rFonts w:asciiTheme="minorHAnsi" w:hAnsiTheme="minorHAnsi" w:cstheme="minorBidi"/>
+              <w:noProof/>
+              <w:kern w:val="2"/>
+              <w:lang w:val="en-US"/>
+              <w14:ligatures w14:val="standardContextual"/>
+            </w:rPr>
+          </w:pPr>
+          <w:hyperlink w:anchor="_Toc234343984" w:history="1">
+            <w:r>
+              <w:rPr>
+                <w:rStyle w:val="Hyperlink"/>
+                <w:noProof/>
+              </w:rPr>
+              <w:t>4.2 Implementation</w:t>
+            </w:r>
+            <w:r>
+              <w:rPr>
+                <w:noProof/>
+                <w:webHidden/>
+              </w:rPr>
+              <w:tab/>
+            </w:r>
+            <w:r>
+              <w:rPr>
+                <w:noProof/>
+                <w:webHidden/>
+              </w:rPr>
+              <w:fldChar w:fldCharType="begin"/>
+            </w:r>
+            <w:r>
+              <w:rPr>
+                <w:noProof/>
+                <w:webHidden/>
+              </w:rPr>
+              <w:instrText xml:space="preserve"> PAGEREF _Toc234343984 \h </w:instrText>
+            </w:r>
+            <w:r>
+              <w:rPr>
+                <w:noProof/>
+                <w:webHidden/>
+              </w:rPr>
+            </w:r>
+            <w:r>
+              <w:rPr>
+                <w:noProof/>
+                <w:webHidden/>
+              </w:rPr>
+              <w:fldChar w:fldCharType="separate"/>
+            </w:r>
+            <w:r>
+              <w:rPr>
+                <w:noProof/>
+                <w:webHidden/>
+              </w:rPr>
+              <w:t>18</w:t>
+            </w:r>
+            <w:r>
+              <w:rPr>
+                <w:noProof/>
+                <w:webHidden/>
+              </w:rPr>
+              <w:fldChar w:fldCharType="end"/>
+            </w:r>
+          </w:hyperlink>
+        </w:p>
+        <w:p>
+          <w:pPr>
+            <w:pStyle w:val="TOC3"/>
+            <w:tabs>
+              <w:tab w:val="right" w:leader="dot" w:pos="8659"/>
+            </w:tabs>
+            <w:rPr>
+              <w:rFonts w:asciiTheme="minorHAnsi" w:hAnsiTheme="minorHAnsi" w:cstheme="minorBidi"/>
+              <w:noProof/>
+              <w:kern w:val="2"/>
+              <w:lang w:val="en-US"/>
+              <w14:ligatures w14:val="standardContextual"/>
+            </w:rPr>
+          </w:pPr>
+          <w:hyperlink w:anchor="_Toc234343985" w:history="1">
+            <w:r>
+              <w:rPr>
+                <w:rStyle w:val="Hyperlink"/>
+                <w:noProof/>
+              </w:rPr>
+              <w:t>4.2.1 Log in Module</w:t>
+            </w:r>
+            <w:r>
+              <w:rPr>
+                <w:noProof/>
+                <w:webHidden/>
+              </w:rPr>
+              <w:tab/>
+            </w:r>
+            <w:r>
+              <w:rPr>
+                <w:noProof/>
+                <w:webHidden/>
+              </w:rPr>
+              <w:fldChar w:fldCharType="begin"/>
+            </w:r>
+            <w:r>
+              <w:rPr>
+                <w:noProof/>
+                <w:webHidden/>
+              </w:rPr>
+              <w:instrText xml:space="preserve"> PAGEREF _Toc234343985 \h </w:instrText>
+            </w:r>
+            <w:r>
+              <w:rPr>
+                <w:noProof/>
+                <w:webHidden/>
+              </w:rPr>
+            </w:r>
+            <w:r>
+              <w:rPr>
+                <w:noProof/>
+                <w:webHidden/>
+              </w:rPr>
+              <w:fldChar w:fldCharType="separate"/>
+            </w:r>
+            <w:r>
+              <w:rPr>
+                <w:noProof/>
+                <w:webHidden/>
+              </w:rPr>
+              <w:t>18</w:t>
+            </w:r>
+            <w:r>
+              <w:rPr>
+                <w:noProof/>
+                <w:webHidden/>
+              </w:rPr>
+              <w:fldChar w:fldCharType="end"/>
+            </w:r>
+          </w:hyperlink>
+        </w:p>
+        <w:p>
+          <w:pPr>
+            <w:pStyle w:val="TOC3"/>
+            <w:tabs>
+              <w:tab w:val="right" w:leader="dot" w:pos="8659"/>
+            </w:tabs>
+            <w:rPr>
+              <w:rFonts w:asciiTheme="minorHAnsi" w:hAnsiTheme="minorHAnsi" w:cstheme="minorBidi"/>
+              <w:noProof/>
+              <w:kern w:val="2"/>
+              <w:lang w:val="en-US"/>
+              <w14:ligatures w14:val="standardContextual"/>
+            </w:rPr>
+          </w:pPr>
+          <w:hyperlink w:anchor="_Toc234343986" w:history="1">
+            <w:r>
+              <w:rPr>
+                <w:rStyle w:val="Hyperlink"/>
+                <w:noProof/>
+              </w:rPr>
+              <w:t>4.2.2 Student/Faculty Dashboard Module</w:t>
+            </w:r>
+            <w:r>
+              <w:rPr>
+                <w:noProof/>
+                <w:webHidden/>
+              </w:rPr>
+              <w:tab/>
+            </w:r>
+            <w:r>
+              <w:rPr>
+                <w:noProof/>
+                <w:webHidden/>
+              </w:rPr>
+              <w:fldChar w:fldCharType="begin"/>
+            </w:r>
+            <w:r>
+              <w:rPr>
+                <w:noProof/>
+                <w:webHidden/>
+              </w:rPr>
+              <w:instrText xml:space="preserve"> PAGEREF _Toc234343986 \h </w:instrText>
+            </w:r>
+            <w:r>
+              <w:rPr>
+                <w:noProof/>
+                <w:webHidden/>
+              </w:rPr>
+            </w:r>
+            <w:r>
+              <w:rPr>
+                <w:noProof/>
+                <w:webHidden/>
+              </w:rPr>
+              <w:fldChar w:fldCharType="separate"/>
+            </w:r>
+            <w:r>
+              <w:rPr>
+                <w:noProof/>
+                <w:webHidden/>
+              </w:rPr>
+              <w:t>19</w:t>
+            </w:r>
+            <w:r>
+              <w:rPr>
+                <w:noProof/>
+                <w:webHidden/>
+              </w:rPr>
+              <w:fldChar w:fldCharType="end"/>
+            </w:r>
+          </w:hyperlink>
+        </w:p>
+        <w:p>
+          <w:pPr>
+            <w:pStyle w:val="TOC3"/>
+            <w:tabs>
+              <w:tab w:val="right" w:leader="dot" w:pos="8659"/>
+            </w:tabs>
+            <w:rPr>
+              <w:rFonts w:asciiTheme="minorHAnsi" w:hAnsiTheme="minorHAnsi" w:cstheme="minorBidi"/>
+              <w:noProof/>
+              <w:kern w:val="2"/>
+              <w:lang w:val="en-US"/>
+              <w14:ligatures w14:val="standardContextual"/>
+            </w:rPr>
+          </w:pPr>
+          <w:hyperlink w:anchor="_Toc234343987" w:history="1">
+            <w:r>
+              <w:rPr>
+                <w:rStyle w:val="Hyperlink"/>
+                <w:noProof/>
+              </w:rPr>
+              <w:t>4.2.3 Menu Page Module</w:t>
+            </w:r>
+            <w:r>
+              <w:rPr>
+                <w:noProof/>
+                <w:webHidden/>
+              </w:rPr>
+              <w:tab/>
+            </w:r>
+            <w:r>
+              <w:rPr>
+                <w:noProof/>
+                <w:webHidden/>
+              </w:rPr>
+              <w:fldChar w:fldCharType="begin"/>
+            </w:r>
+            <w:r>
+              <w:rPr>
+                <w:noProof/>
+                <w:webHidden/>
+              </w:rPr>
+              <w:instrText xml:space="preserve"> PAGEREF _Toc234343987 \h </w:instrText>
+            </w:r>
+            <w:r>
+              <w:rPr>
+                <w:noProof/>
+                <w:webHidden/>
+              </w:rPr>
+            </w:r>
+            <w:r>
+              <w:rPr>
+                <w:noProof/>
+                <w:webHidden/>
+              </w:rPr>
+              <w:fldChar w:fldCharType="separate"/>
+            </w:r>
+            <w:r>
+              <w:rPr>
+                <w:noProof/>
+                <w:webHidden/>
+              </w:rPr>
+              <w:t>19</w:t>
+            </w:r>
+            <w:r>
+              <w:rPr>
+                <w:noProof/>
+                <w:webHidden/>
+              </w:rPr>
+              <w:fldChar w:fldCharType="end"/>
+            </w:r>
+          </w:hyperlink>
+        </w:p>
+        <w:p>
+          <w:pPr>
+            <w:pStyle w:val="TOC3"/>
+            <w:tabs>
+              <w:tab w:val="right" w:leader="dot" w:pos="8659"/>
+            </w:tabs>
+            <w:rPr>
+              <w:rFonts w:asciiTheme="minorHAnsi" w:hAnsiTheme="minorHAnsi" w:cstheme="minorBidi"/>
+              <w:noProof/>
+              <w:kern w:val="2"/>
+              <w:lang w:val="en-US"/>
+              <w14:ligatures w14:val="standardContextual"/>
+            </w:rPr>
+          </w:pPr>
+          <w:hyperlink w:anchor="_Toc234343988" w:history="1">
+            <w:r>
+              <w:rPr>
+                <w:rStyle w:val="Hyperlink"/>
+                <w:noProof/>
+              </w:rPr>
+              <w:t>4.2.4 Admin Dashboard Module</w:t>
+            </w:r>
+            <w:r>
+              <w:rPr>
+                <w:noProof/>
+                <w:webHidden/>
+              </w:rPr>
+              <w:tab/>
+            </w:r>
+            <w:r>
+              <w:rPr>
+                <w:noProof/>
+                <w:webHidden/>
+              </w:rPr>
+              <w:fldChar w:fldCharType="begin"/>
+            </w:r>
+            <w:r>
+              <w:rPr>
+                <w:noProof/>
+                <w:webHidden/>
+              </w:rPr>
+              <w:instrText xml:space="preserve"> PAGEREF _Toc234343988 \h </w:instrText>
+            </w:r>
+            <w:r>
+              <w:rPr>
+                <w:noProof/>
+                <w:webHidden/>
+              </w:rPr>
+            </w:r>
+            <w:r>
+              <w:rPr>
+                <w:noProof/>
+                <w:webHidden/>
+              </w:rPr>
+              <w:fldChar w:fldCharType="separate"/>
+            </w:r>
+            <w:r>
+              <w:rPr>
+                <w:noProof/>
+                <w:webHidden/>
+              </w:rPr>
+              <w:t>20</w:t>
+            </w:r>
+            <w:r>
+              <w:rPr>
+                <w:noProof/>
+                <w:webHidden/>
+              </w:rPr>
+              <w:fldChar w:fldCharType="end"/>
+            </w:r>
+          </w:hyperlink>
+        </w:p>
+        <w:p>
+          <w:pPr>
+            <w:pStyle w:val="TOC3"/>
+            <w:tabs>
+              <w:tab w:val="right" w:leader="dot" w:pos="8659"/>
+            </w:tabs>
+            <w:rPr>
+              <w:rFonts w:asciiTheme="minorHAnsi" w:hAnsiTheme="minorHAnsi" w:cstheme="minorBidi"/>
+              <w:noProof/>
+              <w:kern w:val="2"/>
+              <w:lang w:val="en-US"/>
+              <w14:ligatures w14:val="standardContextual"/>
+            </w:rPr>
+          </w:pPr>
+          <w:hyperlink w:anchor="_Toc234343989" w:history="1">
+            <w:r>
+              <w:rPr>
+                <w:rStyle w:val="Hyperlink"/>
+                <w:noProof/>
+              </w:rPr>
+              <w:t>4.2.5 User Management Module</w:t>
+            </w:r>
+            <w:r>
+              <w:rPr>
+                <w:noProof/>
+                <w:webHidden/>
+              </w:rPr>
+              <w:tab/>
+            </w:r>
+            <w:r>
+              <w:rPr>
+                <w:noProof/>
+                <w:webHidden/>
+              </w:rPr>
+              <w:fldChar w:fldCharType="begin"/>
+            </w:r>
+            <w:r>
+              <w:rPr>
+                <w:noProof/>
+                <w:webHidden/>
+              </w:rPr>
+              <w:instrText xml:space="preserve"> PAGEREF _Toc234343989 \h </w:instrText>
+            </w:r>
+            <w:r>
+              <w:rPr>
+                <w:noProof/>
+                <w:webHidden/>
+              </w:rPr>
+            </w:r>
+            <w:r>
+              <w:rPr>
+                <w:noProof/>
+                <w:webHidden/>
+              </w:rPr>
+              <w:fldChar w:fldCharType="separate"/>
+            </w:r>
+            <w:r>
+              <w:rPr>
+                <w:noProof/>
+                <w:webHidden/>
+              </w:rPr>
+              <w:t>20</w:t>
+            </w:r>
+            <w:r>
+              <w:rPr>
+                <w:noProof/>
+                <w:webHidden/>
+              </w:rPr>
+              <w:fldChar w:fldCharType="end"/>
+            </w:r>
+          </w:hyperlink>
+        </w:p>
+        <w:p>
+          <w:pPr>
+            <w:pStyle w:val="TOC3"/>
+            <w:tabs>
+              <w:tab w:val="right" w:leader="dot" w:pos="8659"/>
+            </w:tabs>
+            <w:rPr>
+              <w:rFonts w:asciiTheme="minorHAnsi" w:hAnsiTheme="minorHAnsi" w:cstheme="minorBidi"/>
+              <w:noProof/>
+              <w:kern w:val="2"/>
+              <w:lang w:val="en-US"/>
+              <w14:ligatures w14:val="standardContextual"/>
+            </w:rPr>
+          </w:pPr>
+          <w:hyperlink w:anchor="_Toc234343990" w:history="1">
+            <w:r>
+              <w:rPr>
+                <w:rStyle w:val="Hyperlink"/>
+                <w:noProof/>
+              </w:rPr>
+              <w:t>4.2.6 Menu Management Modules</w:t>
+            </w:r>
+            <w:r>
+              <w:rPr>
+                <w:noProof/>
+                <w:webHidden/>
+              </w:rPr>
+              <w:tab/>
+            </w:r>
+            <w:r>
+              <w:rPr>
+                <w:noProof/>
+                <w:webHidden/>
+              </w:rPr>
+              <w:fldChar w:fldCharType="begin"/>
+            </w:r>
+            <w:r>
+              <w:rPr>
+                <w:noProof/>
+                <w:webHidden/>
+              </w:rPr>
+              <w:instrText xml:space="preserve"> PAGEREF _Toc234343990 \h </w:instrText>
+            </w:r>
+            <w:r>
+              <w:rPr>
+                <w:noProof/>
+                <w:webHidden/>
+              </w:rPr>
+            </w:r>
+            <w:r>
+              <w:rPr>
+                <w:noProof/>
+                <w:webHidden/>
+              </w:rPr>
+              <w:fldChar w:fldCharType="separate"/>
+            </w:r>
+            <w:r>
+              <w:rPr>
+                <w:noProof/>
+                <w:webHidden/>
+              </w:rPr>
+              <w:t>21</w:t>
+            </w:r>
+            <w:r>
+              <w:rPr>
+                <w:noProof/>
+                <w:webHidden/>
+              </w:rPr>
+              <w:fldChar w:fldCharType="end"/>
+            </w:r>
+          </w:hyperlink>
+        </w:p>
+        <w:p>
+          <w:pPr>
+            <w:pStyle w:val="TOC3"/>
+            <w:tabs>
+              <w:tab w:val="right" w:leader="dot" w:pos="8659"/>
+            </w:tabs>
+            <w:rPr>
+              <w:rFonts w:asciiTheme="minorHAnsi" w:hAnsiTheme="minorHAnsi" w:cstheme="minorBidi"/>
+              <w:noProof/>
+              <w:kern w:val="2"/>
+              <w:lang w:val="en-US"/>
+              <w14:ligatures w14:val="standardContextual"/>
+            </w:rPr>
+          </w:pPr>
+          <w:hyperlink w:anchor="_Toc234343991" w:history="1">
+            <w:r>
+              <w:rPr>
+                <w:rStyle w:val="Hyperlink"/>
+                <w:noProof/>
+              </w:rPr>
+              <w:t>4.2.7 Timing Schedule Module</w:t>
+            </w:r>
+            <w:r>
+              <w:rPr>
+                <w:noProof/>
+                <w:webHidden/>
+              </w:rPr>
+              <w:tab/>
+            </w:r>
+            <w:r>
+              <w:rPr>
+                <w:noProof/>
+                <w:webHidden/>
+              </w:rPr>
+              <w:fldChar w:fldCharType="begin"/>
+            </w:r>
+            <w:r>
+              <w:rPr>
+                <w:noProof/>
+                <w:webHidden/>
+              </w:rPr>
+              <w:instrText xml:space="preserve"> PAGEREF _Toc234343991 \h </w:instrText>
+            </w:r>
+            <w:r>
+              <w:rPr>
+                <w:noProof/>
+                <w:webHidden/>
+              </w:rPr>
+            </w:r>
+            <w:r>
+              <w:rPr>
+                <w:noProof/>
+                <w:webHidden/>
+              </w:rPr>
+              <w:fldChar w:fldCharType="separate"/>
+            </w:r>
+            <w:r>
+              <w:rPr>
+                <w:noProof/>
+                <w:webHidden/>
+              </w:rPr>
+              <w:t>22</w:t>
+            </w:r>
+            <w:r>
+              <w:rPr>
+                <w:noProof/>
+                <w:webHidden/>
+              </w:rPr>
+              <w:fldChar w:fldCharType="end"/>
+            </w:r>
+          </w:hyperlink>
+        </w:p>
+        <w:p>
+          <w:pPr>
+            <w:pStyle w:val="TOC3"/>
+            <w:tabs>
+              <w:tab w:val="right" w:leader="dot" w:pos="8659"/>
+            </w:tabs>
+            <w:rPr>
+              <w:rFonts w:asciiTheme="minorHAnsi" w:hAnsiTheme="minorHAnsi" w:cstheme="minorBidi"/>
+              <w:noProof/>
+              <w:kern w:val="2"/>
+              <w:lang w:val="en-US"/>
+              <w14:ligatures w14:val="standardContextual"/>
+            </w:rPr>
+          </w:pPr>
+          <w:hyperlink w:anchor="_Toc234343992" w:history="1">
+            <w:r>
+              <w:rPr>
+                <w:rStyle w:val="Hyperlink"/>
+                <w:noProof/>
+              </w:rPr>
+              <w:t>4.2.8 Landing Page Module</w:t>
+            </w:r>
+            <w:r>
+              <w:rPr>
+                <w:noProof/>
+                <w:webHidden/>
+              </w:rPr>
+              <w:tab/>
+            </w:r>
+            <w:r>
+              <w:rPr>
+                <w:noProof/>
+                <w:webHidden/>
+              </w:rPr>
+              <w:fldChar w:fldCharType="begin"/>
+            </w:r>
+            <w:r>
+              <w:rPr>
+                <w:noProof/>
+                <w:webHidden/>
+              </w:rPr>
+              <w:instrText xml:space="preserve"> PAGEREF _Toc234343992 \h </w:instrText>
+            </w:r>
+            <w:r>
+              <w:rPr>
+                <w:noProof/>
+                <w:webHidden/>
+              </w:rPr>
+            </w:r>
+            <w:r>
+              <w:rPr>
+                <w:noProof/>
+                <w:webHidden/>
+              </w:rPr>
+              <w:fldChar w:fldCharType="separate"/>
+            </w:r>
+            <w:r>
+              <w:rPr>
+                <w:noProof/>
+                <w:webHidden/>
+              </w:rPr>
+              <w:t>22</w:t>
+            </w:r>
+            <w:r>
+              <w:rPr>
+                <w:noProof/>
+                <w:webHidden/>
+              </w:rPr>
+              <w:fldChar w:fldCharType="end"/>
+            </w:r>
+          </w:hyperlink>
+        </w:p>
+        <w:p>
+          <w:pPr>
+            <w:pStyle w:val="TOC1"/>
+            <w:rPr>
+              <w:rFonts w:asciiTheme="minorHAnsi" w:hAnsiTheme="minorHAnsi" w:cstheme="minorBidi"/>
+              <w:b w:val="0"/>
+              <w:bCs w:val="0"/>
+              <w:kern w:val="2"/>
+              <w:lang w:val="en-US"/>
+              <w14:ligatures w14:val="standardContextual"/>
+            </w:rPr>
+          </w:pPr>
+          <w:hyperlink w:anchor="_Toc234343993" w:history="1">
+            <w:r>
+              <w:rPr>
+                <w:rStyle w:val="Hyperlink"/>
+              </w:rPr>
               <w:t>References</w:t>
             </w:r>
             <w:r>
@@ -3458,7 +4410,7 @@
               <w:rPr>
                 <w:webHidden/>
               </w:rPr>
-              <w:instrText xml:space="preserve"> PAGEREF _Toc231489984 \h </w:instrText>
+              <w:instrText xml:space="preserve"> PAGEREF _Toc234343993 \h </w:instrText>
             </w:r>
             <w:r>
               <w:rPr>
@@ -3475,7 +4427,7 @@
               <w:rPr>
                 <w:webHidden/>
               </w:rPr>
-              <w:t>17</w:t>
+              <w:t>23</w:t>
             </w:r>
             <w:r>
               <w:rPr>
@@ -3506,7 +4458,7 @@
       </w:r>
       <w:bookmarkStart w:id="4" w:name="_heading=h.w2k2kbtzw255" w:colFirst="0" w:colLast="0"/>
       <w:bookmarkStart w:id="5" w:name="_heading=h.a8zjsq6shil0" w:colFirst="0" w:colLast="0"/>
-      <w:bookmarkStart w:id="6" w:name="_Toc231489953"/>
+      <w:bookmarkStart w:id="6" w:name="_Toc234343949"/>
       <w:bookmarkEnd w:id="4"/>
       <w:bookmarkEnd w:id="5"/>
       <w:r>
@@ -3897,7 +4849,7 @@
         <w:pStyle w:val="Heading1"/>
       </w:pPr>
       <w:bookmarkStart w:id="7" w:name="_heading=h.d5espw5mq4vf" w:colFirst="0" w:colLast="0"/>
-      <w:bookmarkStart w:id="8" w:name="_Toc231489954"/>
+      <w:bookmarkStart w:id="8" w:name="_Toc234343950"/>
       <w:bookmarkEnd w:id="7"/>
       <w:r>
         <w:lastRenderedPageBreak/>
@@ -4106,7 +5058,7 @@
       <w:pPr>
         <w:pStyle w:val="Heading1"/>
       </w:pPr>
-      <w:bookmarkStart w:id="9" w:name="_Toc231489955"/>
+      <w:bookmarkStart w:id="9" w:name="_Toc234343951"/>
       <w:r>
         <w:lastRenderedPageBreak/>
         <w:t>CHAPTER 1: INTRODUCTION</w:t>
@@ -4122,7 +5074,7 @@
         </w:numPr>
       </w:pPr>
       <w:bookmarkStart w:id="10" w:name="_heading=h.i1l49pjyck36" w:colFirst="0" w:colLast="0"/>
-      <w:bookmarkStart w:id="11" w:name="_Toc231489956"/>
+      <w:bookmarkStart w:id="11" w:name="_Toc234343952"/>
       <w:bookmarkEnd w:id="10"/>
       <w:r>
         <w:t>Background</w:t>
@@ -4217,7 +5169,7 @@
           <w:numId w:val="31"/>
         </w:numPr>
       </w:pPr>
-      <w:bookmarkStart w:id="15" w:name="_Toc231489957"/>
+      <w:bookmarkStart w:id="15" w:name="_Toc234343953"/>
       <w:bookmarkEnd w:id="13"/>
       <w:bookmarkEnd w:id="14"/>
       <w:r>
@@ -4235,7 +5187,7 @@
         <w:pStyle w:val="Heading2"/>
       </w:pPr>
       <w:bookmarkStart w:id="16" w:name="_heading=h.5uepuvxxim53" w:colFirst="0" w:colLast="0"/>
-      <w:bookmarkStart w:id="17" w:name="_Toc231489958"/>
+      <w:bookmarkStart w:id="17" w:name="_Toc234343954"/>
       <w:bookmarkEnd w:id="16"/>
       <w:r>
         <w:t>1.3 Objectives of the Project</w:t>
@@ -4314,7 +5266,7 @@
       <w:pPr>
         <w:pStyle w:val="Heading2"/>
       </w:pPr>
-      <w:bookmarkStart w:id="19" w:name="_Toc231489959"/>
+      <w:bookmarkStart w:id="19" w:name="_Toc234343955"/>
       <w:r>
         <w:lastRenderedPageBreak/>
         <w:t>1.4 Scope of the Project</w:t>
@@ -4367,7 +5319,7 @@
         <w:pStyle w:val="Heading2"/>
       </w:pPr>
       <w:bookmarkStart w:id="20" w:name="_heading=h.j8j6xudgt4a5" w:colFirst="0" w:colLast="0"/>
-      <w:bookmarkStart w:id="21" w:name="_Toc231489960"/>
+      <w:bookmarkStart w:id="21" w:name="_Toc234343956"/>
       <w:bookmarkEnd w:id="20"/>
       <w:r>
         <w:t>1.5 Limitations of the Project</w:t>
@@ -4423,7 +5375,7 @@
         <w:pStyle w:val="Heading2"/>
       </w:pPr>
       <w:bookmarkStart w:id="22" w:name="_heading=h.n1bc1coijutl" w:colFirst="0" w:colLast="0"/>
-      <w:bookmarkStart w:id="23" w:name="_Toc231489961"/>
+      <w:bookmarkStart w:id="23" w:name="_Toc234343957"/>
       <w:bookmarkEnd w:id="22"/>
       <w:r>
         <w:t>1.6 Significance of the Study</w:t>
@@ -4455,7 +5407,7 @@
         <w:pStyle w:val="Heading1"/>
       </w:pPr>
       <w:bookmarkStart w:id="24" w:name="_heading=h.f4prjalpaczi" w:colFirst="0" w:colLast="0"/>
-      <w:bookmarkStart w:id="25" w:name="_Toc231489962"/>
+      <w:bookmarkStart w:id="25" w:name="_Toc234343958"/>
       <w:bookmarkEnd w:id="24"/>
       <w:r>
         <w:lastRenderedPageBreak/>
@@ -4467,7 +5419,7 @@
       <w:pPr>
         <w:pStyle w:val="Heading2"/>
       </w:pPr>
-      <w:bookmarkStart w:id="26" w:name="_Toc231489963"/>
+      <w:bookmarkStart w:id="26" w:name="_Toc234343959"/>
       <w:r>
         <w:t>2.1 Overview</w:t>
       </w:r>
@@ -4482,7 +5434,7 @@
       <w:pPr>
         <w:pStyle w:val="Heading2"/>
       </w:pPr>
-      <w:bookmarkStart w:id="27" w:name="_Toc231489964"/>
+      <w:bookmarkStart w:id="27" w:name="_Toc234343960"/>
       <w:r>
         <w:t>2.2 Review of Existing Systems</w:t>
       </w:r>
@@ -4492,7 +5444,7 @@
       <w:pPr>
         <w:pStyle w:val="Heading3"/>
       </w:pPr>
-      <w:bookmarkStart w:id="28" w:name="_Toc231489965"/>
+      <w:bookmarkStart w:id="28" w:name="_Toc234343961"/>
       <w:r>
         <w:t>2.2.1 QR-Based Canteen System</w:t>
       </w:r>
@@ -4521,7 +5473,7 @@
       <w:pPr>
         <w:pStyle w:val="Heading3"/>
       </w:pPr>
-      <w:bookmarkStart w:id="29" w:name="_Toc231489966"/>
+      <w:bookmarkStart w:id="29" w:name="_Toc234343962"/>
       <w:r>
         <w:t>2.2.2 Android-Based Canteen Ordering System</w:t>
       </w:r>
@@ -4565,7 +5517,7 @@
       <w:pPr>
         <w:pStyle w:val="Heading3"/>
       </w:pPr>
-      <w:bookmarkStart w:id="30" w:name="_Toc231489967"/>
+      <w:bookmarkStart w:id="30" w:name="_Toc234343963"/>
       <w:r>
         <w:t>2.2.3 Smart Canteen Management System</w:t>
       </w:r>
@@ -4605,7 +5557,7 @@
       <w:pPr>
         <w:pStyle w:val="Heading2"/>
       </w:pPr>
-      <w:bookmarkStart w:id="31" w:name="_Toc231489968"/>
+      <w:bookmarkStart w:id="31" w:name="_Toc234343964"/>
       <w:r>
         <w:lastRenderedPageBreak/>
         <w:t>2.3 Research Gap</w:t>
@@ -4705,7 +5657,6 @@
           <w:szCs w:val="32"/>
         </w:rPr>
       </w:pPr>
-      <w:bookmarkStart w:id="32" w:name="_Toc231489969"/>
       <w:r>
         <w:br w:type="page"/>
       </w:r>
@@ -4714,6 +5665,7 @@
       <w:pPr>
         <w:pStyle w:val="Heading1"/>
       </w:pPr>
+      <w:bookmarkStart w:id="32" w:name="_Toc234343965"/>
       <w:r>
         <w:lastRenderedPageBreak/>
         <w:t>CHAPTER 3: SYSTEM ANALYSIS AND DESIGN</w:t>
@@ -4725,7 +5677,7 @@
         <w:pStyle w:val="Heading2"/>
       </w:pPr>
       <w:bookmarkStart w:id="33" w:name="_heading=h.u1vy5u9sb9xg" w:colFirst="0" w:colLast="0"/>
-      <w:bookmarkStart w:id="34" w:name="_Toc231489970"/>
+      <w:bookmarkStart w:id="34" w:name="_Toc234343966"/>
       <w:bookmarkEnd w:id="33"/>
       <w:r>
         <w:t>3.1 Project Management Strategy and Development Tools</w:t>
@@ -4742,7 +5694,7 @@
         <w:pStyle w:val="Heading3"/>
       </w:pPr>
       <w:bookmarkStart w:id="35" w:name="_heading=h.7zuyyf93m0tj" w:colFirst="0" w:colLast="0"/>
-      <w:bookmarkStart w:id="36" w:name="_Toc231489971"/>
+      <w:bookmarkStart w:id="36" w:name="_Toc234343967"/>
       <w:bookmarkEnd w:id="35"/>
       <w:r>
         <w:t>3.1.1 Project Team</w:t>
@@ -5106,7 +6058,7 @@
         <w:pStyle w:val="Heading3"/>
       </w:pPr>
       <w:bookmarkStart w:id="37" w:name="_heading=h.ron2k72j96vm" w:colFirst="0" w:colLast="0"/>
-      <w:bookmarkStart w:id="38" w:name="_Toc231489972"/>
+      <w:bookmarkStart w:id="38" w:name="_Toc234343968"/>
       <w:bookmarkEnd w:id="37"/>
       <w:r>
         <w:t>3.1.2 Project Flow and Schedule</w:t>
@@ -5173,7 +6125,7 @@
       <w:pPr>
         <w:pStyle w:val="Heading3"/>
       </w:pPr>
-      <w:bookmarkStart w:id="40" w:name="_Toc231489973"/>
+      <w:bookmarkStart w:id="40" w:name="_Toc234343969"/>
       <w:r>
         <w:t>3.1.3 Responsibilities</w:t>
       </w:r>
@@ -5308,7 +6260,7 @@
       <w:pPr>
         <w:pStyle w:val="Heading3"/>
       </w:pPr>
-      <w:bookmarkStart w:id="41" w:name="_Toc231489974"/>
+      <w:bookmarkStart w:id="41" w:name="_Toc234343970"/>
       <w:r>
         <w:t>3.1.4 Development Tools</w:t>
       </w:r>
@@ -5636,7 +6588,7 @@
         </w:numPr>
       </w:pPr>
       <w:bookmarkStart w:id="44" w:name="_heading=h.8zmd9tgdmdqp" w:colFirst="0" w:colLast="0"/>
-      <w:bookmarkStart w:id="45" w:name="_Toc231489975"/>
+      <w:bookmarkStart w:id="45" w:name="_Toc234343971"/>
       <w:bookmarkEnd w:id="44"/>
       <w:r>
         <w:t>System Analysis</w:t>
@@ -5659,7 +6611,7 @@
         <w:pStyle w:val="Heading3"/>
       </w:pPr>
       <w:bookmarkStart w:id="46" w:name="_heading=h.4j04lyz3b7oc" w:colFirst="0" w:colLast="0"/>
-      <w:bookmarkStart w:id="47" w:name="_Toc231489976"/>
+      <w:bookmarkStart w:id="47" w:name="_Toc234343972"/>
       <w:bookmarkEnd w:id="46"/>
       <w:r>
         <w:t>3.2.1 Requirement Analysis</w:t>
@@ -6347,7 +7299,7 @@
         <w:pStyle w:val="Heading3"/>
       </w:pPr>
       <w:bookmarkStart w:id="48" w:name="_heading=h.mgp18nndx2i9" w:colFirst="0" w:colLast="0"/>
-      <w:bookmarkStart w:id="49" w:name="_Toc231489977"/>
+      <w:bookmarkStart w:id="49" w:name="_Toc234343973"/>
       <w:bookmarkEnd w:id="48"/>
       <w:r>
         <w:t>3.2.2 Feasibility Analysis</w:t>
@@ -6469,7 +7421,7 @@
         <w:pStyle w:val="Heading2"/>
       </w:pPr>
       <w:bookmarkStart w:id="50" w:name="_heading=h.d6cp72a9hhu2" w:colFirst="0" w:colLast="0"/>
-      <w:bookmarkStart w:id="51" w:name="_Toc231489978"/>
+      <w:bookmarkStart w:id="51" w:name="_Toc234343974"/>
       <w:bookmarkEnd w:id="50"/>
       <w:r>
         <w:lastRenderedPageBreak/>
@@ -6482,7 +7434,7 @@
         <w:pStyle w:val="Heading3"/>
       </w:pPr>
       <w:bookmarkStart w:id="52" w:name="_heading=h.k67w28n36xvg" w:colFirst="0" w:colLast="0"/>
-      <w:bookmarkStart w:id="53" w:name="_Toc231489979"/>
+      <w:bookmarkStart w:id="53" w:name="_Toc234343975"/>
       <w:bookmarkEnd w:id="52"/>
       <w:r>
         <w:t xml:space="preserve">3.3.1. </w:t>
@@ -6646,7 +7598,7 @@
       </w:pPr>
       <w:bookmarkStart w:id="57" w:name="_heading=h.vmwmntx85w3w" w:colFirst="0" w:colLast="0"/>
       <w:bookmarkStart w:id="58" w:name="_heading=h.7lcjph8hb9cx" w:colFirst="0" w:colLast="0"/>
-      <w:bookmarkStart w:id="59" w:name="_Toc231489980"/>
+      <w:bookmarkStart w:id="59" w:name="_Toc234343976"/>
       <w:bookmarkEnd w:id="57"/>
       <w:bookmarkEnd w:id="58"/>
       <w:r>
@@ -6779,7 +7731,7 @@
         <w:pStyle w:val="Heading3"/>
       </w:pPr>
       <w:bookmarkStart w:id="62" w:name="_heading=h.48eqp0mcihuv" w:colFirst="0" w:colLast="0"/>
-      <w:bookmarkStart w:id="63" w:name="_Toc231489981"/>
+      <w:bookmarkStart w:id="63" w:name="_Toc234343977"/>
       <w:bookmarkEnd w:id="62"/>
       <w:r>
         <w:lastRenderedPageBreak/>
@@ -6944,7 +7896,7 @@
       </w:pPr>
       <w:bookmarkStart w:id="66" w:name="_heading=h.1w3nix1yeett" w:colFirst="0" w:colLast="0"/>
       <w:bookmarkStart w:id="67" w:name="_heading=h.pkgmwy1kfuz6" w:colFirst="0" w:colLast="0"/>
-      <w:bookmarkStart w:id="68" w:name="_Toc231489982"/>
+      <w:bookmarkStart w:id="68" w:name="_Toc234343978"/>
       <w:bookmarkEnd w:id="66"/>
       <w:bookmarkEnd w:id="67"/>
       <w:r>
@@ -7131,7 +8083,7 @@
         </w:rPr>
       </w:pPr>
       <w:bookmarkStart w:id="75" w:name="_Toc218671490"/>
-      <w:bookmarkStart w:id="76" w:name="_Toc231489983"/>
+      <w:bookmarkStart w:id="76" w:name="_Toc234343979"/>
       <w:bookmarkEnd w:id="72"/>
       <w:r>
         <w:rPr>
@@ -7326,21 +8278,23 @@
     <w:p>
       <w:pPr>
         <w:pStyle w:val="Heading3"/>
-      </w:pPr>
+        <w:rPr>
+          <w:noProof/>
+        </w:rPr>
+      </w:pPr>
+      <w:bookmarkStart w:id="79" w:name="_Toc234343980"/>
       <w:r>
         <w:t>3.3.8 Schema Diagram</w:t>
       </w:r>
-    </w:p>
-    <w:p>
-      <w:pPr>
-        <w:pStyle w:val="Heading3"/>
-      </w:pPr>
+      <w:bookmarkEnd w:id="79"/>
+    </w:p>
+    <w:p>
       <w:r>
         <w:rPr>
           <w:noProof/>
         </w:rPr>
         <w:drawing>
-          <wp:inline distT="0" distB="0" distL="0" distR="0" wp14:anchorId="001E73E7" wp14:editId="02C6D912">
+          <wp:inline distT="0" distB="0" distL="0" distR="0" wp14:anchorId="768A1B32" wp14:editId="2128A599">
             <wp:extent cx="5504815" cy="3595370"/>
             <wp:effectExtent l="0" t="0" r="635" b="5080"/>
             <wp:docPr id="1066954679" name="Picture 1"/>
@@ -7438,18 +8392,22 @@
       <w:r>
         <w:br w:type="page"/>
       </w:r>
+      <w:bookmarkStart w:id="80" w:name="_Toc234343981"/>
       <w:r>
         <w:lastRenderedPageBreak/>
         <w:t>CHAPTER 4: System Implementation</w:t>
       </w:r>
+      <w:bookmarkEnd w:id="80"/>
     </w:p>
     <w:p>
       <w:pPr>
         <w:pStyle w:val="Heading2"/>
       </w:pPr>
+      <w:bookmarkStart w:id="81" w:name="_Toc234343982"/>
       <w:r>
         <w:t>4.1 Detailed Project Schedule</w:t>
       </w:r>
+      <w:bookmarkEnd w:id="81"/>
     </w:p>
     <w:tbl>
       <w:tblPr>
@@ -12529,14 +13487,18 @@
       <w:pPr>
         <w:pStyle w:val="Heading2"/>
       </w:pPr>
-      <w:bookmarkStart w:id="79" w:name="_Toc231489984"/>
+      <w:bookmarkStart w:id="82" w:name="_Toc234343983"/>
       <w:r>
         <w:lastRenderedPageBreak/>
         <w:t>4.2 Gantt Chart</w:t>
       </w:r>
-    </w:p>
-    <w:p>
-      <w:r>
+      <w:bookmarkEnd w:id="82"/>
+    </w:p>
+    <w:p>
+      <w:r>
+        <w:rPr>
+          <w:noProof/>
+        </w:rPr>
         <w:drawing>
           <wp:inline distT="0" distB="0" distL="0" distR="0" wp14:anchorId="0A3D7F63" wp14:editId="4CDD472D">
             <wp:extent cx="5471160" cy="3337651"/>
@@ -12578,17 +13540,21 @@
       <w:pPr>
         <w:pStyle w:val="Heading2"/>
       </w:pPr>
+      <w:bookmarkStart w:id="83" w:name="_Toc234343984"/>
       <w:r>
         <w:t>4.2 Implementation</w:t>
       </w:r>
+      <w:bookmarkEnd w:id="83"/>
     </w:p>
     <w:p>
       <w:pPr>
         <w:pStyle w:val="Heading3"/>
       </w:pPr>
+      <w:bookmarkStart w:id="84" w:name="_Toc234343985"/>
       <w:r>
         <w:t>4.2.1 Log in Module</w:t>
       </w:r>
+      <w:bookmarkEnd w:id="84"/>
     </w:p>
     <w:p>
       <w:pPr>
@@ -12596,10 +13562,10 @@
       </w:pPr>
       <w:r>
         <w:drawing>
-          <wp:inline distT="0" distB="0" distL="0" distR="0" wp14:anchorId="2B611767" wp14:editId="4FD34987">
-            <wp:extent cx="4678680" cy="2487757"/>
-            <wp:effectExtent l="0" t="0" r="7620" b="8255"/>
-            <wp:docPr id="436598231" name="Picture 1"/>
+          <wp:inline distT="0" distB="0" distL="0" distR="0" wp14:anchorId="0B880227" wp14:editId="39FFDB5F">
+            <wp:extent cx="5504815" cy="2561590"/>
+            <wp:effectExtent l="0" t="0" r="635" b="0"/>
+            <wp:docPr id="272678270" name="Picture 1"/>
             <wp:cNvGraphicFramePr>
               <a:graphicFrameLocks xmlns:a="http://schemas.openxmlformats.org/drawingml/2006/main" noChangeAspect="1"/>
             </wp:cNvGraphicFramePr>
@@ -12607,7 +13573,7 @@
               <a:graphicData uri="http://schemas.openxmlformats.org/drawingml/2006/picture">
                 <pic:pic xmlns:pic="http://schemas.openxmlformats.org/drawingml/2006/picture">
                   <pic:nvPicPr>
-                    <pic:cNvPr id="436598231" name=""/>
+                    <pic:cNvPr id="272678270" name=""/>
                     <pic:cNvPicPr/>
                   </pic:nvPicPr>
                   <pic:blipFill>
@@ -12619,7 +13585,7 @@
                   <pic:spPr>
                     <a:xfrm>
                       <a:off x="0" y="0"/>
-                      <a:ext cx="4682559" cy="2489819"/>
+                      <a:ext cx="5504815" cy="2561590"/>
                     </a:xfrm>
                     <a:prstGeom prst="rect">
                       <a:avLst/>
@@ -12639,24 +13605,14 @@
       <w:r>
         <w:t xml:space="preserve">Figure </w:t>
       </w:r>
-      <w:r>
-        <w:fldChar w:fldCharType="begin"/>
-      </w:r>
-      <w:r>
-        <w:instrText xml:space="preserve"> SEQ Figure \* ARABIC </w:instrText>
-      </w:r>
-      <w:r>
-        <w:fldChar w:fldCharType="separate"/>
-      </w:r>
-      <w:r>
-        <w:rPr>
-          <w:noProof/>
-        </w:rPr>
-        <w:t>6</w:t>
-      </w:r>
-      <w:r>
-        <w:fldChar w:fldCharType="end"/>
-      </w:r>
+      <w:fldSimple w:instr=" SEQ Figure \* ARABIC ">
+        <w:r>
+          <w:rPr>
+            <w:noProof/>
+          </w:rPr>
+          <w:t>6</w:t>
+        </w:r>
+      </w:fldSimple>
       <w:r>
         <w:t>: Log in Page</w:t>
       </w:r>
@@ -12670,16 +13626,720 @@
       <w:pPr>
         <w:pStyle w:val="Heading3"/>
       </w:pPr>
-      <w:r>
+      <w:bookmarkStart w:id="85" w:name="_Toc234343986"/>
+      <w:r>
+        <w:lastRenderedPageBreak/>
         <w:t xml:space="preserve">4.2.2 </w:t>
       </w:r>
-    </w:p>
-    <w:p>
-      <w:pPr>
-        <w:spacing w:before="360" w:after="360"/>
-        <w:rPr>
-          <w:b/>
-          <w:bCs/>
+      <w:r>
+        <w:t>Student/Faculty Dashboard Module</w:t>
+      </w:r>
+      <w:bookmarkEnd w:id="85"/>
+    </w:p>
+    <w:p>
+      <w:pPr>
+        <w:keepNext/>
+      </w:pPr>
+      <w:r>
+        <w:drawing>
+          <wp:inline distT="0" distB="0" distL="0" distR="0" wp14:anchorId="280F30F0" wp14:editId="3A2931AF">
+            <wp:extent cx="5504815" cy="2608580"/>
+            <wp:effectExtent l="0" t="0" r="635" b="1270"/>
+            <wp:docPr id="1207060124" name="Picture 1"/>
+            <wp:cNvGraphicFramePr>
+              <a:graphicFrameLocks xmlns:a="http://schemas.openxmlformats.org/drawingml/2006/main" noChangeAspect="1"/>
+            </wp:cNvGraphicFramePr>
+            <a:graphic xmlns:a="http://schemas.openxmlformats.org/drawingml/2006/main">
+              <a:graphicData uri="http://schemas.openxmlformats.org/drawingml/2006/picture">
+                <pic:pic xmlns:pic="http://schemas.openxmlformats.org/drawingml/2006/picture">
+                  <pic:nvPicPr>
+                    <pic:cNvPr id="1207060124" name=""/>
+                    <pic:cNvPicPr/>
+                  </pic:nvPicPr>
+                  <pic:blipFill>
+                    <a:blip r:embed="rId20"/>
+                    <a:stretch>
+                      <a:fillRect/>
+                    </a:stretch>
+                  </pic:blipFill>
+                  <pic:spPr>
+                    <a:xfrm>
+                      <a:off x="0" y="0"/>
+                      <a:ext cx="5504815" cy="2608580"/>
+                    </a:xfrm>
+                    <a:prstGeom prst="rect">
+                      <a:avLst/>
+                    </a:prstGeom>
+                  </pic:spPr>
+                </pic:pic>
+              </a:graphicData>
+            </a:graphic>
+          </wp:inline>
+        </w:drawing>
+      </w:r>
+    </w:p>
+    <w:p>
+      <w:pPr>
+        <w:pStyle w:val="Caption"/>
+      </w:pPr>
+      <w:r>
+        <w:t xml:space="preserve">Figure </w:t>
+      </w:r>
+      <w:fldSimple w:instr=" SEQ Figure \* ARABIC ">
+        <w:r>
+          <w:rPr>
+            <w:noProof/>
+          </w:rPr>
+          <w:t>7</w:t>
+        </w:r>
+      </w:fldSimple>
+      <w:r>
+        <w:t>: Student and Faculty Dashboard</w:t>
+      </w:r>
+    </w:p>
+    <w:p>
+      <w:r>
+        <w:t>Shows basic information for the user such as balance, no. of food items today, y our orders and total spent</w:t>
+      </w:r>
+    </w:p>
+    <w:p>
+      <w:pPr>
+        <w:pStyle w:val="Heading3"/>
+      </w:pPr>
+      <w:bookmarkStart w:id="86" w:name="_Toc234343987"/>
+      <w:r>
+        <w:t>4.2.3 Menu Page Module</w:t>
+      </w:r>
+      <w:bookmarkEnd w:id="86"/>
+    </w:p>
+    <w:p>
+      <w:pPr>
+        <w:keepNext/>
+      </w:pPr>
+      <w:r>
+        <w:drawing>
+          <wp:inline distT="0" distB="0" distL="0" distR="0" wp14:anchorId="67AA5E59" wp14:editId="278E343D">
+            <wp:extent cx="5504815" cy="2076450"/>
+            <wp:effectExtent l="0" t="0" r="635" b="0"/>
+            <wp:docPr id="1322244128" name="Picture 1"/>
+            <wp:cNvGraphicFramePr>
+              <a:graphicFrameLocks xmlns:a="http://schemas.openxmlformats.org/drawingml/2006/main" noChangeAspect="1"/>
+            </wp:cNvGraphicFramePr>
+            <a:graphic xmlns:a="http://schemas.openxmlformats.org/drawingml/2006/main">
+              <a:graphicData uri="http://schemas.openxmlformats.org/drawingml/2006/picture">
+                <pic:pic xmlns:pic="http://schemas.openxmlformats.org/drawingml/2006/picture">
+                  <pic:nvPicPr>
+                    <pic:cNvPr id="1322244128" name=""/>
+                    <pic:cNvPicPr/>
+                  </pic:nvPicPr>
+                  <pic:blipFill>
+                    <a:blip r:embed="rId21"/>
+                    <a:stretch>
+                      <a:fillRect/>
+                    </a:stretch>
+                  </pic:blipFill>
+                  <pic:spPr>
+                    <a:xfrm>
+                      <a:off x="0" y="0"/>
+                      <a:ext cx="5504815" cy="2076450"/>
+                    </a:xfrm>
+                    <a:prstGeom prst="rect">
+                      <a:avLst/>
+                    </a:prstGeom>
+                  </pic:spPr>
+                </pic:pic>
+              </a:graphicData>
+            </a:graphic>
+          </wp:inline>
+        </w:drawing>
+      </w:r>
+    </w:p>
+    <w:p>
+      <w:pPr>
+        <w:pStyle w:val="Caption"/>
+      </w:pPr>
+      <w:r>
+        <w:t xml:space="preserve">Figure </w:t>
+      </w:r>
+      <w:fldSimple w:instr=" SEQ Figure \* ARABIC ">
+        <w:r>
+          <w:rPr>
+            <w:noProof/>
+          </w:rPr>
+          <w:t>8</w:t>
+        </w:r>
+      </w:fldSimple>
+      <w:r>
+        <w:t>: Menu page</w:t>
+      </w:r>
+    </w:p>
+    <w:p>
+      <w:r>
+        <w:t xml:space="preserve">Shows menu items with pagination. </w:t>
+      </w:r>
+      <w:proofErr w:type="gramStart"/>
+      <w:r>
+        <w:t>Allows</w:t>
+      </w:r>
+      <w:proofErr w:type="gramEnd"/>
+      <w:r>
+        <w:t xml:space="preserve"> users to </w:t>
+      </w:r>
+      <w:proofErr w:type="gramStart"/>
+      <w:r>
+        <w:t>search</w:t>
+      </w:r>
+      <w:proofErr w:type="gramEnd"/>
+      <w:r>
+        <w:t xml:space="preserve"> menu items </w:t>
+      </w:r>
+      <w:proofErr w:type="gramStart"/>
+      <w:r>
+        <w:t>and also</w:t>
+      </w:r>
+      <w:proofErr w:type="gramEnd"/>
+      <w:r>
+        <w:t xml:space="preserve"> the order closes when reaching closing time and orders are finalized</w:t>
+      </w:r>
+    </w:p>
+    <w:p>
+      <w:pPr>
+        <w:pStyle w:val="Heading3"/>
+      </w:pPr>
+      <w:bookmarkStart w:id="87" w:name="_Toc234343988"/>
+      <w:r>
+        <w:lastRenderedPageBreak/>
+        <w:t>4.2.4 Admin Dashboard Module</w:t>
+      </w:r>
+      <w:bookmarkEnd w:id="87"/>
+    </w:p>
+    <w:p>
+      <w:pPr>
+        <w:keepNext/>
+      </w:pPr>
+      <w:r>
+        <w:drawing>
+          <wp:inline distT="0" distB="0" distL="0" distR="0" wp14:anchorId="226C2B87" wp14:editId="230998D8">
+            <wp:extent cx="5504815" cy="2616200"/>
+            <wp:effectExtent l="0" t="0" r="635" b="0"/>
+            <wp:docPr id="1332430694" name="Picture 1"/>
+            <wp:cNvGraphicFramePr>
+              <a:graphicFrameLocks xmlns:a="http://schemas.openxmlformats.org/drawingml/2006/main" noChangeAspect="1"/>
+            </wp:cNvGraphicFramePr>
+            <a:graphic xmlns:a="http://schemas.openxmlformats.org/drawingml/2006/main">
+              <a:graphicData uri="http://schemas.openxmlformats.org/drawingml/2006/picture">
+                <pic:pic xmlns:pic="http://schemas.openxmlformats.org/drawingml/2006/picture">
+                  <pic:nvPicPr>
+                    <pic:cNvPr id="1332430694" name=""/>
+                    <pic:cNvPicPr/>
+                  </pic:nvPicPr>
+                  <pic:blipFill>
+                    <a:blip r:embed="rId22"/>
+                    <a:stretch>
+                      <a:fillRect/>
+                    </a:stretch>
+                  </pic:blipFill>
+                  <pic:spPr>
+                    <a:xfrm>
+                      <a:off x="0" y="0"/>
+                      <a:ext cx="5504815" cy="2616200"/>
+                    </a:xfrm>
+                    <a:prstGeom prst="rect">
+                      <a:avLst/>
+                    </a:prstGeom>
+                  </pic:spPr>
+                </pic:pic>
+              </a:graphicData>
+            </a:graphic>
+          </wp:inline>
+        </w:drawing>
+      </w:r>
+    </w:p>
+    <w:p>
+      <w:pPr>
+        <w:pStyle w:val="Caption"/>
+      </w:pPr>
+      <w:r>
+        <w:t xml:space="preserve">Figure </w:t>
+      </w:r>
+      <w:fldSimple w:instr=" SEQ Figure \* ARABIC ">
+        <w:r>
+          <w:rPr>
+            <w:noProof/>
+          </w:rPr>
+          <w:t>9</w:t>
+        </w:r>
+      </w:fldSimple>
+      <w:r>
+        <w:t>: Admin Dashboard</w:t>
+      </w:r>
+    </w:p>
+    <w:p>
+      <w:r>
+        <w:t>Admin dashboard that shows information required for the admin such as total users, total menu items, total orders and sales revenue.</w:t>
+      </w:r>
+    </w:p>
+    <w:p>
+      <w:pPr>
+        <w:pStyle w:val="Heading3"/>
+      </w:pPr>
+      <w:bookmarkStart w:id="88" w:name="_Toc234343989"/>
+      <w:r>
+        <w:t>4.2.5 User Management Module</w:t>
+      </w:r>
+      <w:bookmarkEnd w:id="88"/>
+    </w:p>
+    <w:p>
+      <w:pPr>
+        <w:keepNext/>
+      </w:pPr>
+      <w:r>
+        <w:drawing>
+          <wp:inline distT="0" distB="0" distL="0" distR="0" wp14:anchorId="08BB0CFA" wp14:editId="5AE093F2">
+            <wp:extent cx="5504815" cy="1774190"/>
+            <wp:effectExtent l="0" t="0" r="635" b="0"/>
+            <wp:docPr id="1116257379" name="Picture 1"/>
+            <wp:cNvGraphicFramePr>
+              <a:graphicFrameLocks xmlns:a="http://schemas.openxmlformats.org/drawingml/2006/main" noChangeAspect="1"/>
+            </wp:cNvGraphicFramePr>
+            <a:graphic xmlns:a="http://schemas.openxmlformats.org/drawingml/2006/main">
+              <a:graphicData uri="http://schemas.openxmlformats.org/drawingml/2006/picture">
+                <pic:pic xmlns:pic="http://schemas.openxmlformats.org/drawingml/2006/picture">
+                  <pic:nvPicPr>
+                    <pic:cNvPr id="1116257379" name=""/>
+                    <pic:cNvPicPr/>
+                  </pic:nvPicPr>
+                  <pic:blipFill>
+                    <a:blip r:embed="rId23"/>
+                    <a:stretch>
+                      <a:fillRect/>
+                    </a:stretch>
+                  </pic:blipFill>
+                  <pic:spPr>
+                    <a:xfrm>
+                      <a:off x="0" y="0"/>
+                      <a:ext cx="5504815" cy="1774190"/>
+                    </a:xfrm>
+                    <a:prstGeom prst="rect">
+                      <a:avLst/>
+                    </a:prstGeom>
+                  </pic:spPr>
+                </pic:pic>
+              </a:graphicData>
+            </a:graphic>
+          </wp:inline>
+        </w:drawing>
+      </w:r>
+    </w:p>
+    <w:p>
+      <w:pPr>
+        <w:pStyle w:val="Caption"/>
+      </w:pPr>
+      <w:r>
+        <w:t xml:space="preserve">Figure </w:t>
+      </w:r>
+      <w:fldSimple w:instr=" SEQ Figure \* ARABIC ">
+        <w:r>
+          <w:rPr>
+            <w:noProof/>
+          </w:rPr>
+          <w:t>10</w:t>
+        </w:r>
+      </w:fldSimple>
+      <w:r>
+        <w:t>: Add User</w:t>
+      </w:r>
+    </w:p>
+    <w:p>
+      <w:pPr>
+        <w:keepNext/>
+      </w:pPr>
+      <w:r>
+        <w:drawing>
+          <wp:inline distT="0" distB="0" distL="0" distR="0" wp14:anchorId="6E9CF5A3" wp14:editId="1EC27B44">
+            <wp:extent cx="5504815" cy="1546860"/>
+            <wp:effectExtent l="0" t="0" r="635" b="0"/>
+            <wp:docPr id="1139014160" name="Picture 1"/>
+            <wp:cNvGraphicFramePr>
+              <a:graphicFrameLocks xmlns:a="http://schemas.openxmlformats.org/drawingml/2006/main" noChangeAspect="1"/>
+            </wp:cNvGraphicFramePr>
+            <a:graphic xmlns:a="http://schemas.openxmlformats.org/drawingml/2006/main">
+              <a:graphicData uri="http://schemas.openxmlformats.org/drawingml/2006/picture">
+                <pic:pic xmlns:pic="http://schemas.openxmlformats.org/drawingml/2006/picture">
+                  <pic:nvPicPr>
+                    <pic:cNvPr id="1139014160" name=""/>
+                    <pic:cNvPicPr/>
+                  </pic:nvPicPr>
+                  <pic:blipFill>
+                    <a:blip r:embed="rId24"/>
+                    <a:stretch>
+                      <a:fillRect/>
+                    </a:stretch>
+                  </pic:blipFill>
+                  <pic:spPr>
+                    <a:xfrm>
+                      <a:off x="0" y="0"/>
+                      <a:ext cx="5504815" cy="1546860"/>
+                    </a:xfrm>
+                    <a:prstGeom prst="rect">
+                      <a:avLst/>
+                    </a:prstGeom>
+                  </pic:spPr>
+                </pic:pic>
+              </a:graphicData>
+            </a:graphic>
+          </wp:inline>
+        </w:drawing>
+      </w:r>
+    </w:p>
+    <w:p>
+      <w:pPr>
+        <w:pStyle w:val="Caption"/>
+      </w:pPr>
+      <w:r>
+        <w:t xml:space="preserve">Figure </w:t>
+      </w:r>
+      <w:fldSimple w:instr=" SEQ Figure \* ARABIC ">
+        <w:r>
+          <w:rPr>
+            <w:noProof/>
+          </w:rPr>
+          <w:t>11</w:t>
+        </w:r>
+      </w:fldSimple>
+      <w:r>
+        <w:t>: Manage users</w:t>
+      </w:r>
+    </w:p>
+    <w:p>
+      <w:r>
+        <w:t>Allows admin to add, edit and delete users.</w:t>
+      </w:r>
+    </w:p>
+    <w:p>
+      <w:pPr>
+        <w:pStyle w:val="Heading3"/>
+      </w:pPr>
+      <w:bookmarkStart w:id="89" w:name="_Toc234343990"/>
+      <w:r>
+        <w:lastRenderedPageBreak/>
+        <w:t>4.2.6 Menu Management Modules</w:t>
+      </w:r>
+      <w:bookmarkEnd w:id="89"/>
+    </w:p>
+    <w:p>
+      <w:pPr>
+        <w:keepNext/>
+      </w:pPr>
+      <w:r>
+        <w:drawing>
+          <wp:inline distT="0" distB="0" distL="0" distR="0" wp14:anchorId="1BC50CE7" wp14:editId="1D0D818F">
+            <wp:extent cx="5504815" cy="2613025"/>
+            <wp:effectExtent l="0" t="0" r="635" b="0"/>
+            <wp:docPr id="894018414" name="Picture 1"/>
+            <wp:cNvGraphicFramePr>
+              <a:graphicFrameLocks xmlns:a="http://schemas.openxmlformats.org/drawingml/2006/main" noChangeAspect="1"/>
+            </wp:cNvGraphicFramePr>
+            <a:graphic xmlns:a="http://schemas.openxmlformats.org/drawingml/2006/main">
+              <a:graphicData uri="http://schemas.openxmlformats.org/drawingml/2006/picture">
+                <pic:pic xmlns:pic="http://schemas.openxmlformats.org/drawingml/2006/picture">
+                  <pic:nvPicPr>
+                    <pic:cNvPr id="894018414" name=""/>
+                    <pic:cNvPicPr/>
+                  </pic:nvPicPr>
+                  <pic:blipFill>
+                    <a:blip r:embed="rId25"/>
+                    <a:stretch>
+                      <a:fillRect/>
+                    </a:stretch>
+                  </pic:blipFill>
+                  <pic:spPr>
+                    <a:xfrm>
+                      <a:off x="0" y="0"/>
+                      <a:ext cx="5504815" cy="2613025"/>
+                    </a:xfrm>
+                    <a:prstGeom prst="rect">
+                      <a:avLst/>
+                    </a:prstGeom>
+                  </pic:spPr>
+                </pic:pic>
+              </a:graphicData>
+            </a:graphic>
+          </wp:inline>
+        </w:drawing>
+      </w:r>
+    </w:p>
+    <w:p>
+      <w:pPr>
+        <w:pStyle w:val="Caption"/>
+      </w:pPr>
+      <w:r>
+        <w:t xml:space="preserve">Figure </w:t>
+      </w:r>
+      <w:fldSimple w:instr=" SEQ Figure \* ARABIC ">
+        <w:r>
+          <w:rPr>
+            <w:noProof/>
+          </w:rPr>
+          <w:t>12</w:t>
+        </w:r>
+      </w:fldSimple>
+      <w:r>
+        <w:t>: Add new menu Item</w:t>
+      </w:r>
+    </w:p>
+    <w:p>
+      <w:pPr>
+        <w:keepNext/>
+      </w:pPr>
+      <w:r>
+        <w:drawing>
+          <wp:inline distT="0" distB="0" distL="0" distR="0" wp14:anchorId="31BE8EEF" wp14:editId="3988C862">
+            <wp:extent cx="5504815" cy="2326640"/>
+            <wp:effectExtent l="0" t="0" r="635" b="0"/>
+            <wp:docPr id="1892856420" name="Picture 1"/>
+            <wp:cNvGraphicFramePr>
+              <a:graphicFrameLocks xmlns:a="http://schemas.openxmlformats.org/drawingml/2006/main" noChangeAspect="1"/>
+            </wp:cNvGraphicFramePr>
+            <a:graphic xmlns:a="http://schemas.openxmlformats.org/drawingml/2006/main">
+              <a:graphicData uri="http://schemas.openxmlformats.org/drawingml/2006/picture">
+                <pic:pic xmlns:pic="http://schemas.openxmlformats.org/drawingml/2006/picture">
+                  <pic:nvPicPr>
+                    <pic:cNvPr id="1892856420" name=""/>
+                    <pic:cNvPicPr/>
+                  </pic:nvPicPr>
+                  <pic:blipFill>
+                    <a:blip r:embed="rId26"/>
+                    <a:stretch>
+                      <a:fillRect/>
+                    </a:stretch>
+                  </pic:blipFill>
+                  <pic:spPr>
+                    <a:xfrm>
+                      <a:off x="0" y="0"/>
+                      <a:ext cx="5504815" cy="2326640"/>
+                    </a:xfrm>
+                    <a:prstGeom prst="rect">
+                      <a:avLst/>
+                    </a:prstGeom>
+                  </pic:spPr>
+                </pic:pic>
+              </a:graphicData>
+            </a:graphic>
+          </wp:inline>
+        </w:drawing>
+      </w:r>
+    </w:p>
+    <w:p>
+      <w:pPr>
+        <w:pStyle w:val="Caption"/>
+      </w:pPr>
+      <w:r>
+        <w:t xml:space="preserve">Figure </w:t>
+      </w:r>
+      <w:fldSimple w:instr=" SEQ Figure \* ARABIC ">
+        <w:r>
+          <w:rPr>
+            <w:noProof/>
+          </w:rPr>
+          <w:t>13</w:t>
+        </w:r>
+      </w:fldSimple>
+      <w:r>
+        <w:t>: Edit Menu items</w:t>
+      </w:r>
+    </w:p>
+    <w:p>
+      <w:r>
+        <w:t xml:space="preserve">Allows admin to add new menu </w:t>
+      </w:r>
+      <w:proofErr w:type="gramStart"/>
+      <w:r>
+        <w:t>item</w:t>
+      </w:r>
+      <w:proofErr w:type="gramEnd"/>
+      <w:r>
+        <w:t xml:space="preserve"> and edit their stock and </w:t>
+      </w:r>
+      <w:proofErr w:type="gramStart"/>
+      <w:r>
+        <w:t>availability(</w:t>
+      </w:r>
+      <w:proofErr w:type="gramEnd"/>
+      <w:r>
+        <w:t>For today’s special logic) and even delete menu items.</w:t>
+      </w:r>
+    </w:p>
+    <w:p>
+      <w:pPr>
+        <w:pStyle w:val="Heading3"/>
+      </w:pPr>
+      <w:bookmarkStart w:id="90" w:name="_Toc234343991"/>
+      <w:r>
+        <w:lastRenderedPageBreak/>
+        <w:t>4.2.7 Timing Schedule Module</w:t>
+      </w:r>
+      <w:bookmarkEnd w:id="90"/>
+    </w:p>
+    <w:p>
+      <w:pPr>
+        <w:keepNext/>
+      </w:pPr>
+      <w:r>
+        <w:drawing>
+          <wp:inline distT="0" distB="0" distL="0" distR="0" wp14:anchorId="38B285D7" wp14:editId="54557B42">
+            <wp:extent cx="5504815" cy="2521585"/>
+            <wp:effectExtent l="0" t="0" r="635" b="0"/>
+            <wp:docPr id="1548943017" name="Picture 1"/>
+            <wp:cNvGraphicFramePr>
+              <a:graphicFrameLocks xmlns:a="http://schemas.openxmlformats.org/drawingml/2006/main" noChangeAspect="1"/>
+            </wp:cNvGraphicFramePr>
+            <a:graphic xmlns:a="http://schemas.openxmlformats.org/drawingml/2006/main">
+              <a:graphicData uri="http://schemas.openxmlformats.org/drawingml/2006/picture">
+                <pic:pic xmlns:pic="http://schemas.openxmlformats.org/drawingml/2006/picture">
+                  <pic:nvPicPr>
+                    <pic:cNvPr id="1548943017" name=""/>
+                    <pic:cNvPicPr/>
+                  </pic:nvPicPr>
+                  <pic:blipFill>
+                    <a:blip r:embed="rId27"/>
+                    <a:stretch>
+                      <a:fillRect/>
+                    </a:stretch>
+                  </pic:blipFill>
+                  <pic:spPr>
+                    <a:xfrm>
+                      <a:off x="0" y="0"/>
+                      <a:ext cx="5504815" cy="2521585"/>
+                    </a:xfrm>
+                    <a:prstGeom prst="rect">
+                      <a:avLst/>
+                    </a:prstGeom>
+                  </pic:spPr>
+                </pic:pic>
+              </a:graphicData>
+            </a:graphic>
+          </wp:inline>
+        </w:drawing>
+      </w:r>
+    </w:p>
+    <w:p>
+      <w:pPr>
+        <w:pStyle w:val="Caption"/>
+      </w:pPr>
+      <w:r>
+        <w:t xml:space="preserve">Figure </w:t>
+      </w:r>
+      <w:fldSimple w:instr=" SEQ Figure \* ARABIC ">
+        <w:r>
+          <w:rPr>
+            <w:noProof/>
+          </w:rPr>
+          <w:t>14</w:t>
+        </w:r>
+      </w:fldSimple>
+      <w:r>
+        <w:t>: Timing Schedule page</w:t>
+      </w:r>
+    </w:p>
+    <w:p>
+      <w:r>
+        <w:t xml:space="preserve">Admin </w:t>
+      </w:r>
+      <w:proofErr w:type="gramStart"/>
+      <w:r>
+        <w:t>is able to</w:t>
+      </w:r>
+      <w:proofErr w:type="gramEnd"/>
+      <w:r>
+        <w:t xml:space="preserve"> add, edit, activate and deactivate the timing schedules to which the orders are closed and finalized</w:t>
+      </w:r>
+    </w:p>
+    <w:p>
+      <w:pPr>
+        <w:pStyle w:val="Heading3"/>
+      </w:pPr>
+      <w:bookmarkStart w:id="91" w:name="_Toc234343992"/>
+      <w:r>
+        <w:t>4.2.8 Landing Page Module</w:t>
+      </w:r>
+      <w:bookmarkEnd w:id="91"/>
+    </w:p>
+    <w:p>
+      <w:pPr>
+        <w:keepNext/>
+      </w:pPr>
+      <w:r>
+        <w:drawing>
+          <wp:inline distT="0" distB="0" distL="0" distR="0" wp14:anchorId="1719E5EB" wp14:editId="6D98CF44">
+            <wp:extent cx="5504815" cy="2596515"/>
+            <wp:effectExtent l="0" t="0" r="635" b="0"/>
+            <wp:docPr id="593443855" name="Picture 1"/>
+            <wp:cNvGraphicFramePr>
+              <a:graphicFrameLocks xmlns:a="http://schemas.openxmlformats.org/drawingml/2006/main" noChangeAspect="1"/>
+            </wp:cNvGraphicFramePr>
+            <a:graphic xmlns:a="http://schemas.openxmlformats.org/drawingml/2006/main">
+              <a:graphicData uri="http://schemas.openxmlformats.org/drawingml/2006/picture">
+                <pic:pic xmlns:pic="http://schemas.openxmlformats.org/drawingml/2006/picture">
+                  <pic:nvPicPr>
+                    <pic:cNvPr id="593443855" name=""/>
+                    <pic:cNvPicPr/>
+                  </pic:nvPicPr>
+                  <pic:blipFill>
+                    <a:blip r:embed="rId28"/>
+                    <a:stretch>
+                      <a:fillRect/>
+                    </a:stretch>
+                  </pic:blipFill>
+                  <pic:spPr>
+                    <a:xfrm>
+                      <a:off x="0" y="0"/>
+                      <a:ext cx="5504815" cy="2596515"/>
+                    </a:xfrm>
+                    <a:prstGeom prst="rect">
+                      <a:avLst/>
+                    </a:prstGeom>
+                  </pic:spPr>
+                </pic:pic>
+              </a:graphicData>
+            </a:graphic>
+          </wp:inline>
+        </w:drawing>
+      </w:r>
+    </w:p>
+    <w:p>
+      <w:pPr>
+        <w:pStyle w:val="Caption"/>
+      </w:pPr>
+      <w:r>
+        <w:t xml:space="preserve">Figure </w:t>
+      </w:r>
+      <w:fldSimple w:instr=" SEQ Figure \* ARABIC ">
+        <w:r>
+          <w:rPr>
+            <w:noProof/>
+          </w:rPr>
+          <w:t>15</w:t>
+        </w:r>
+      </w:fldSimple>
+      <w:r>
+        <w:t>: Landing Page</w:t>
+      </w:r>
+    </w:p>
+    <w:p>
+      <w:r>
+        <w:t>This is the first page user sees upon entering the web application</w:t>
+      </w:r>
+    </w:p>
+    <w:p>
+      <w:r>
+        <w:br/>
+      </w:r>
+    </w:p>
+    <w:p>
+      <w:pPr>
+        <w:pStyle w:val="Heading1"/>
+        <w:rPr>
           <w:sz w:val="28"/>
           <w:szCs w:val="28"/>
         </w:rPr>
@@ -12687,6 +14347,7 @@
       <w:r>
         <w:br w:type="page"/>
       </w:r>
+      <w:bookmarkStart w:id="92" w:name="_Toc234343993"/>
       <w:r>
         <w:rPr>
           <w:rFonts w:hint="eastAsia"/>
@@ -12694,7 +14355,7 @@
         <w:lastRenderedPageBreak/>
         <w:t>References</w:t>
       </w:r>
-      <w:bookmarkEnd w:id="79"/>
+      <w:bookmarkEnd w:id="92"/>
     </w:p>
     <w:p>
       <w:pPr>
@@ -12731,8 +14392,8 @@
       </w:r>
     </w:p>
     <w:sectPr>
-      <w:headerReference w:type="default" r:id="rId20"/>
-      <w:footerReference w:type="default" r:id="rId21"/>
+      <w:headerReference w:type="default" r:id="rId29"/>
+      <w:footerReference w:type="default" r:id="rId30"/>
       <w:pgSz w:w="11909" w:h="16834" w:code="9"/>
       <w:pgMar w:top="1440" w:right="1440" w:bottom="1440" w:left="1800" w:header="720" w:footer="720" w:gutter="0"/>
       <w:pgNumType w:start="1"/>
@@ -19473,28 +21134,28 @@
 </file>
 
 <file path=customXml/item1.xml><?xml version="1.0" encoding="utf-8"?>
+<b:Sources xmlns:b="http://schemas.openxmlformats.org/officeDocument/2006/bibliography" xmlns="http://schemas.openxmlformats.org/officeDocument/2006/bibliography" SelectedStyle="\IEEE2006OfficeOnline.xsl" StyleName="IEEE" Version="2006"/>
+</file>
+
+<file path=customXml/item2.xml><?xml version="1.0" encoding="utf-8"?>
 <go:gDocsCustomXmlDataStorage xmlns:go="http://customooxmlschemas.google.com/" xmlns:r="http://schemas.openxmlformats.org/officeDocument/2006/relationships" uri="GoogleDocsCustomDataVersion2">
   <go:docsCustomData xmlns:go="http://customooxmlschemas.google.com/" roundtripDataSignature="AMtx7mim8rBhNDFl4Wh4PromgB8UVNjyuw==">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</go:docsCustomData>
 </go:gDocsCustomXmlDataStorage>
 </file>
 
-<file path=customXml/item2.xml><?xml version="1.0" encoding="utf-8"?>
-<b:Sources xmlns:b="http://schemas.openxmlformats.org/officeDocument/2006/bibliography" xmlns="http://schemas.openxmlformats.org/officeDocument/2006/bibliography" SelectedStyle="\IEEE2006OfficeOnline.xsl" StyleName="IEEE" Version="2006"/>
+<file path=customXml/itemProps1.xml><?xml version="1.0" encoding="utf-8"?>
+<ds:datastoreItem xmlns:ds="http://schemas.openxmlformats.org/officeDocument/2006/customXml" ds:itemID="{F45D6693-1D45-4D55-BF74-69E575BA83E1}">
+  <ds:schemaRefs>
+    <ds:schemaRef ds:uri="http://schemas.openxmlformats.org/officeDocument/2006/bibliography"/>
+  </ds:schemaRefs>
+</ds:datastoreItem>
 </file>
 
-<file path=customXml/itemProps1.xml><?xml version="1.0" encoding="utf-8"?>
+<file path=customXml/itemProps2.xml><?xml version="1.0" encoding="utf-8"?>
 <ds:datastoreItem xmlns:ds="http://schemas.openxmlformats.org/officeDocument/2006/customXml" ds:itemID="{11111111-1234-1234-1234-123412341234}">
   <ds:schemaRefs>
     <ds:schemaRef ds:uri="http://customooxmlschemas.google.com/"/>
     <ds:schemaRef ds:uri="http://schemas.openxmlformats.org/officeDocument/2006/relationships"/>
   </ds:schemaRefs>
 </ds:datastoreItem>
-</file>
-
-<file path=customXml/itemProps2.xml><?xml version="1.0" encoding="utf-8"?>
-<ds:datastoreItem xmlns:ds="http://schemas.openxmlformats.org/officeDocument/2006/customXml" ds:itemID="{F45D6693-1D45-4D55-BF74-69E575BA83E1}">
-  <ds:schemaRefs>
-    <ds:schemaRef ds:uri="http://schemas.openxmlformats.org/officeDocument/2006/bibliography"/>
-  </ds:schemaRefs>
-</ds:datastoreItem>
 </file>
</xml_diff>